<commit_message>
slight changes before I add actual methodology, lit review, etc.
</commit_message>
<xml_diff>
--- a/roughDraft_thesisProposal/ramirezXavier_draft_initialReport_ee491.docx
+++ b/roughDraft_thesisProposal/ramirezXavier_draft_initialReport_ee491.docx
@@ -1,469 +1,1064 @@
 
 <file path=word/document.xml><?xml version="1.0" encoding="utf-8"?>
-<w:document xmlns:wpc="http://schemas.microsoft.com/office/word/2010/wordprocessingCanvas" xmlns:cx="http://schemas.microsoft.com/office/drawing/2014/chartex" xmlns:cx1="http://schemas.microsoft.com/office/drawing/2015/9/8/chartex" xmlns:cx2="http://schemas.microsoft.com/office/drawing/2015/10/21/chartex" xmlns:cx3="http://schemas.microsoft.com/office/drawing/2016/5/9/chartex" xmlns:cx4="http://schemas.microsoft.com/office/drawing/2016/5/10/chartex" xmlns:cx5="http://schemas.microsoft.com/office/drawing/2016/5/11/chartex" xmlns:cx6="http://schemas.microsoft.com/office/drawing/2016/5/12/chartex" xmlns:cx7="http://schemas.microsoft.com/office/drawing/2016/5/13/chartex" xmlns:cx8="http://schemas.microsoft.com/office/drawing/2016/5/14/chartex" xmlns:mc="http://schemas.openxmlformats.org/markup-compatibility/2006" xmlns:aink="http://schemas.microsoft.com/office/drawing/2016/ink" xmlns:am3d="http://schemas.microsoft.com/office/drawing/2017/model3d" xmlns:o="urn:schemas-microsoft-com:office:office" xmlns:oel="http://schemas.microsoft.com/office/2019/extlst" xmlns:r="http://schemas.openxmlformats.org/officeDocument/2006/relationships" xmlns:m="http://schemas.openxmlformats.org/officeDocument/2006/math" xmlns:v="urn:schemas-microsoft-com:vml" xmlns:wp14="http://schemas.microsoft.com/office/word/2010/wordprocessingDrawing" xmlns:wp="http://schemas.openxmlformats.org/drawingml/2006/wordprocessingDrawing" xmlns:w10="urn:schemas-microsoft-com:office:word" xmlns:w="http://schemas.openxmlformats.org/wordprocessingml/2006/main" xmlns:w14="http://schemas.microsoft.com/office/word/2010/wordml" xmlns:w15="http://schemas.microsoft.com/office/word/2012/wordml" xmlns:w16cei="http://schemas.microsoft.com/office/word/2026/wordml/cei" xmlns:w16cex="http://schemas.microsoft.com/office/word/2018/wordml/cex" xmlns:w16cid="http://schemas.microsoft.com/office/word/2016/wordml/cid" xmlns:w16="http://schemas.microsoft.com/office/word/2018/wordml" xmlns:w16du="http://schemas.microsoft.com/office/word/2023/wordml/word16du" xmlns:w16sdtdh="http://schemas.microsoft.com/office/word/2020/wordml/sdtdatahash" xmlns:w16sdtfl="http://schemas.microsoft.com/office/word/2024/wordml/sdtformatlock" xmlns:w16se="http://schemas.microsoft.com/office/word/2015/wordml/symex" xmlns:wpg="http://schemas.microsoft.com/office/word/2010/wordprocessingGroup" xmlns:wpi="http://schemas.microsoft.com/office/word/2010/wordprocessingInk" xmlns:wne="http://schemas.microsoft.com/office/word/2006/wordml" xmlns:wps="http://schemas.microsoft.com/office/word/2010/wordprocessingShape" mc:Ignorable="w14 w15 w16se w16cid w16 w16cex w16sdtdh w16sdtfl w16du wp14">
+<w:document xmlns:wpc="http://schemas.microsoft.com/office/word/2010/wordprocessingCanvas" xmlns:cx="http://schemas.microsoft.com/office/drawing/2014/chartex" xmlns:cx1="http://schemas.microsoft.com/office/drawing/2015/9/8/chartex" xmlns:cx2="http://schemas.microsoft.com/office/drawing/2015/10/21/chartex" xmlns:cx3="http://schemas.microsoft.com/office/drawing/2016/5/9/chartex" xmlns:cx4="http://schemas.microsoft.com/office/drawing/2016/5/10/chartex" xmlns:cx5="http://schemas.microsoft.com/office/drawing/2016/5/11/chartex" xmlns:cx6="http://schemas.microsoft.com/office/drawing/2016/5/12/chartex" xmlns:cx7="http://schemas.microsoft.com/office/drawing/2016/5/13/chartex" xmlns:cx8="http://schemas.microsoft.com/office/drawing/2016/5/14/chartex" xmlns:mc="http://schemas.openxmlformats.org/markup-compatibility/2006" xmlns:aink="http://schemas.microsoft.com/office/drawing/2016/ink" xmlns:am3d="http://schemas.microsoft.com/office/drawing/2017/model3d" xmlns:o="urn:schemas-microsoft-com:office:office" xmlns:oel="http://schemas.microsoft.com/office/2019/extlst" xmlns:r="http://schemas.openxmlformats.org/officeDocument/2006/relationships" xmlns:m="http://schemas.openxmlformats.org/officeDocument/2006/math" xmlns:v="urn:schemas-microsoft-com:vml" xmlns:wp14="http://schemas.microsoft.com/office/word/2010/wordprocessingDrawing" xmlns:wp="http://schemas.openxmlformats.org/drawingml/2006/wordprocessingDrawing" xmlns:w10="urn:schemas-microsoft-com:office:word" xmlns:w="http://schemas.openxmlformats.org/wordprocessingml/2006/main" xmlns:w14="http://schemas.microsoft.com/office/word/2010/wordml" xmlns:w15="http://schemas.microsoft.com/office/word/2012/wordml" xmlns:w16cex="http://schemas.microsoft.com/office/word/2018/wordml/cex" xmlns:w16cid="http://schemas.microsoft.com/office/word/2016/wordml/cid" xmlns:w16="http://schemas.microsoft.com/office/word/2018/wordml" xmlns:w16du="http://schemas.microsoft.com/office/word/2023/wordml/word16du" xmlns:w16sdtdh="http://schemas.microsoft.com/office/word/2020/wordml/sdtdatahash" xmlns:w16sdtfl="http://schemas.microsoft.com/office/word/2024/wordml/sdtformatlock" xmlns:w16se="http://schemas.microsoft.com/office/word/2015/wordml/symex" xmlns:wpg="http://schemas.microsoft.com/office/word/2010/wordprocessingGroup" xmlns:wpi="http://schemas.microsoft.com/office/word/2010/wordprocessingInk" xmlns:wne="http://schemas.microsoft.com/office/word/2006/wordml" xmlns:wps="http://schemas.microsoft.com/office/word/2010/wordprocessingShape" mc:Ignorable="w14 w15 w16se w16cid w16 w16cex w16sdtdh w16sdtfl w16du wp14">
   <w:body>
-    <w:p/>
     <w:p>
       <w:pPr>
-        <w:jc w:val="center"/>
+        <w:pStyle w:val="TOC1"/>
+      </w:pPr>
+    </w:p>
+    <w:p>
+      <w:pPr>
+        <w:pStyle w:val="TOC1"/>
+      </w:pPr>
+    </w:p>
+    <w:p>
+      <w:pPr>
+        <w:pStyle w:val="TOC1"/>
       </w:pPr>
       <w:r>
-        <w:rPr>
-          <w:b/>
-          <w:sz w:val="44"/>
-        </w:rPr>
-        <w:t>EE</w:t>
-      </w:r>
-      <w:r>
-        <w:rPr>
-          <w:b/>
-          <w:sz w:val="44"/>
-        </w:rPr>
-        <w:t xml:space="preserve"> </w:t>
-      </w:r>
-      <w:r>
-        <w:rPr>
-          <w:b/>
-          <w:sz w:val="44"/>
-        </w:rPr>
-        <w:t>491</w:t>
-      </w:r>
-      <w:r>
-        <w:rPr>
-          <w:b/>
-          <w:sz w:val="44"/>
-        </w:rPr>
-        <w:t>-</w:t>
-      </w:r>
-      <w:r>
-        <w:rPr>
-          <w:b/>
-          <w:color w:val="000000" w:themeColor="text1"/>
-          <w:sz w:val="44"/>
-        </w:rPr>
-        <w:t>01H</w:t>
-      </w:r>
-      <w:r>
-        <w:rPr>
-          <w:b/>
-          <w:sz w:val="44"/>
-        </w:rPr>
-        <w:t xml:space="preserve"> </w:t>
-      </w:r>
-      <w:r>
-        <w:rPr>
-          <w:b/>
-          <w:sz w:val="44"/>
-        </w:rPr>
-        <w:t xml:space="preserve">Project </w:t>
-      </w:r>
-      <w:r>
-        <w:rPr>
-          <w:b/>
-          <w:sz w:val="44"/>
-        </w:rPr>
-        <w:t>Repor</w:t>
-      </w:r>
-      <w:r>
-        <w:rPr>
-          <w:b/>
-          <w:sz w:val="44"/>
-        </w:rPr>
-        <w:t>t</w:t>
+        <w:drawing>
+          <wp:inline distT="0" distB="0" distL="0" distR="0" wp14:anchorId="479944FA" wp14:editId="6A7B22AD">
+            <wp:extent cx="1624330" cy="309880"/>
+            <wp:effectExtent l="0" t="0" r="0" b="0"/>
+            <wp:docPr id="1625552710" name="Picture 2" descr="East Texas A&amp;M University | College Works"/>
+            <wp:cNvGraphicFramePr>
+              <a:graphicFrameLocks xmlns:a="http://schemas.openxmlformats.org/drawingml/2006/main" noChangeAspect="1"/>
+            </wp:cNvGraphicFramePr>
+            <a:graphic xmlns:a="http://schemas.openxmlformats.org/drawingml/2006/main">
+              <a:graphicData uri="http://schemas.openxmlformats.org/drawingml/2006/picture">
+                <pic:pic xmlns:pic="http://schemas.openxmlformats.org/drawingml/2006/picture">
+                  <pic:nvPicPr>
+                    <pic:cNvPr id="0" name="Picture 1" descr="East Texas A&amp;M University | College Works"/>
+                    <pic:cNvPicPr>
+                      <a:picLocks noChangeAspect="1" noChangeArrowheads="1"/>
+                    </pic:cNvPicPr>
+                  </pic:nvPicPr>
+                  <pic:blipFill>
+                    <a:blip r:embed="rId8" cstate="print">
+                      <a:extLst>
+                        <a:ext uri="{28A0092B-C50C-407E-A947-70E740481C1C}">
+                          <a14:useLocalDpi xmlns:a14="http://schemas.microsoft.com/office/drawing/2010/main" val="0"/>
+                        </a:ext>
+                      </a:extLst>
+                    </a:blip>
+                    <a:srcRect t="65707" r="17017"/>
+                    <a:stretch>
+                      <a:fillRect/>
+                    </a:stretch>
+                  </pic:blipFill>
+                  <pic:spPr bwMode="auto">
+                    <a:xfrm>
+                      <a:off x="0" y="0"/>
+                      <a:ext cx="1624330" cy="309880"/>
+                    </a:xfrm>
+                    <a:prstGeom prst="rect">
+                      <a:avLst/>
+                    </a:prstGeom>
+                    <a:noFill/>
+                    <a:ln>
+                      <a:noFill/>
+                    </a:ln>
+                  </pic:spPr>
+                </pic:pic>
+              </a:graphicData>
+            </a:graphic>
+          </wp:inline>
+        </w:drawing>
       </w:r>
     </w:p>
     <w:p>
       <w:pPr>
-        <w:rPr>
-          <w:sz w:val="28"/>
+        <w:pStyle w:val="TOC1"/>
+        <w:rPr>
+          <w:lang w:bidi="en-US"/>
         </w:rPr>
       </w:pPr>
     </w:p>
     <w:p>
       <w:pPr>
-        <w:rPr>
+        <w:pStyle w:val="Title"/>
+        <w:spacing w:line="276" w:lineRule="auto"/>
+        <w:jc w:val="center"/>
+        <w:rPr>
+          <w:rFonts w:ascii="Times New Roman" w:hAnsi="Times New Roman" w:cs="Times New Roman"/>
+          <w:sz w:val="32"/>
+          <w:szCs w:val="32"/>
+        </w:rPr>
+      </w:pPr>
+      <w:r>
+        <w:rPr>
+          <w:rFonts w:ascii="Times New Roman" w:hAnsi="Times New Roman" w:cs="Times New Roman"/>
+          <w:sz w:val="32"/>
+          <w:szCs w:val="32"/>
+        </w:rPr>
+        <w:t>East Texas A&amp;M University</w:t>
+      </w:r>
+    </w:p>
+    <w:p>
+      <w:pPr>
+        <w:pStyle w:val="Title"/>
+        <w:spacing w:line="276" w:lineRule="auto"/>
+        <w:jc w:val="center"/>
+        <w:rPr>
+          <w:rFonts w:ascii="Times New Roman" w:hAnsi="Times New Roman" w:cs="Times New Roman"/>
           <w:sz w:val="28"/>
-        </w:rPr>
-      </w:pPr>
+          <w:szCs w:val="28"/>
+        </w:rPr>
+      </w:pPr>
+      <w:r>
+        <w:rPr>
+          <w:rFonts w:ascii="Times New Roman" w:hAnsi="Times New Roman" w:cs="Times New Roman"/>
+          <w:sz w:val="28"/>
+          <w:szCs w:val="28"/>
+        </w:rPr>
+        <w:t>Engineering and Technology Department</w:t>
+      </w:r>
     </w:p>
-    <w:tbl>
-      <w:tblPr>
-        <w:tblStyle w:val="TableGrid"/>
-        <w:tblW w:w="10620" w:type="dxa"/>
-        <w:tblInd w:w="-365" w:type="dxa"/>
-        <w:tblLook w:val="04A0" w:firstRow="1" w:lastRow="0" w:firstColumn="1" w:lastColumn="0" w:noHBand="0" w:noVBand="1"/>
-      </w:tblPr>
-      <w:tblGrid>
-        <w:gridCol w:w="2610"/>
-        <w:gridCol w:w="8010"/>
-      </w:tblGrid>
-      <w:tr>
-        <w:tc>
-          <w:tcPr>
-            <w:tcW w:w="2610" w:type="dxa"/>
-          </w:tcPr>
-          <w:p>
-            <w:pPr>
-              <w:jc w:val="left"/>
-              <w:rPr>
-                <w:sz w:val="28"/>
-              </w:rPr>
-            </w:pPr>
+    <w:p>
+      <w:pPr>
+        <w:spacing w:line="276" w:lineRule="auto"/>
+        <w:jc w:val="center"/>
+        <w:rPr>
+          <w:rFonts w:ascii="Times New Roman" w:hAnsi="Times New Roman"/>
+          <w:sz w:val="28"/>
+        </w:rPr>
+      </w:pPr>
+    </w:p>
+    <w:p>
+      <w:pPr>
+        <w:spacing w:line="276" w:lineRule="auto"/>
+        <w:jc w:val="center"/>
+        <w:rPr>
+          <w:rFonts w:ascii="Times New Roman" w:hAnsi="Times New Roman"/>
+          <w:sz w:val="28"/>
+        </w:rPr>
+      </w:pPr>
+    </w:p>
+    <w:p>
+      <w:pPr>
+        <w:spacing w:line="276" w:lineRule="auto"/>
+        <w:jc w:val="center"/>
+        <w:rPr>
+          <w:rFonts w:ascii="Times New Roman" w:hAnsi="Times New Roman"/>
+          <w:sz w:val="28"/>
+        </w:rPr>
+      </w:pPr>
+    </w:p>
+    <w:p>
+      <w:pPr>
+        <w:spacing w:line="276" w:lineRule="auto"/>
+        <w:jc w:val="center"/>
+        <w:rPr>
+          <w:rFonts w:ascii="Times New Roman" w:hAnsi="Times New Roman"/>
+          <w:sz w:val="28"/>
+        </w:rPr>
+      </w:pPr>
+    </w:p>
+    <w:p>
+      <w:pPr>
+        <w:pStyle w:val="Title"/>
+        <w:jc w:val="center"/>
+        <w:rPr>
+          <w:rFonts w:ascii="Times New Roman" w:hAnsi="Times New Roman" w:cs="Times New Roman"/>
+          <w:b/>
+          <w:bCs/>
+        </w:rPr>
+      </w:pPr>
+      <w:r>
+        <w:rPr>
+          <w:rFonts w:ascii="Times New Roman" w:hAnsi="Times New Roman" w:cs="Times New Roman"/>
+          <w:b/>
+          <w:bCs/>
+        </w:rPr>
+        <w:t>A Study on Fish Population and Habitat Data from Northeast Texas and Southeast Oklahoma.</w:t>
+      </w:r>
+    </w:p>
+    <w:p>
+      <w:pPr>
+        <w:spacing w:line="276" w:lineRule="auto"/>
+        <w:jc w:val="center"/>
+        <w:rPr>
+          <w:rFonts w:ascii="Times New Roman" w:hAnsi="Times New Roman"/>
+          <w:sz w:val="28"/>
+        </w:rPr>
+      </w:pPr>
+    </w:p>
+    <w:p>
+      <w:pPr>
+        <w:spacing w:line="276" w:lineRule="auto"/>
+        <w:jc w:val="center"/>
+        <w:rPr>
+          <w:rFonts w:ascii="Times New Roman" w:hAnsi="Times New Roman"/>
+          <w:sz w:val="28"/>
+        </w:rPr>
+      </w:pPr>
+    </w:p>
+    <w:p>
+      <w:pPr>
+        <w:spacing w:line="276" w:lineRule="auto"/>
+        <w:jc w:val="center"/>
+        <w:rPr>
+          <w:rFonts w:ascii="Times New Roman" w:hAnsi="Times New Roman"/>
+          <w:sz w:val="28"/>
+        </w:rPr>
+      </w:pPr>
+    </w:p>
+    <w:p>
+      <w:pPr>
+        <w:spacing w:line="276" w:lineRule="auto"/>
+        <w:jc w:val="center"/>
+        <w:rPr>
+          <w:rFonts w:ascii="Times New Roman" w:hAnsi="Times New Roman"/>
+          <w:sz w:val="28"/>
+        </w:rPr>
+      </w:pPr>
+    </w:p>
+    <w:p>
+      <w:pPr>
+        <w:spacing w:line="276" w:lineRule="auto"/>
+        <w:jc w:val="center"/>
+        <w:rPr>
+          <w:rFonts w:ascii="Times New Roman" w:hAnsi="Times New Roman"/>
+          <w:sz w:val="28"/>
+        </w:rPr>
+      </w:pPr>
+    </w:p>
+    <w:p>
+      <w:pPr>
+        <w:spacing w:line="276" w:lineRule="auto"/>
+        <w:jc w:val="center"/>
+        <w:rPr>
+          <w:rFonts w:ascii="Times New Roman" w:hAnsi="Times New Roman"/>
+          <w:b/>
+          <w:bCs/>
+          <w:sz w:val="36"/>
+          <w:szCs w:val="36"/>
+        </w:rPr>
+      </w:pPr>
+      <w:r>
+        <w:rPr>
+          <w:rFonts w:ascii="Times New Roman" w:hAnsi="Times New Roman"/>
+          <w:b/>
+          <w:bCs/>
+          <w:sz w:val="36"/>
+          <w:szCs w:val="36"/>
+        </w:rPr>
+        <w:t>Honors Thesis Proposal</w:t>
+      </w:r>
+    </w:p>
+    <w:p>
+      <w:pPr>
+        <w:spacing w:line="276" w:lineRule="auto"/>
+        <w:jc w:val="center"/>
+        <w:rPr>
+          <w:rFonts w:ascii="Times New Roman" w:hAnsi="Times New Roman"/>
+          <w:sz w:val="28"/>
+        </w:rPr>
+      </w:pPr>
+    </w:p>
+    <w:p>
+      <w:pPr>
+        <w:spacing w:line="276" w:lineRule="auto"/>
+        <w:jc w:val="center"/>
+        <w:rPr>
+          <w:rFonts w:ascii="Times New Roman" w:hAnsi="Times New Roman"/>
+          <w:sz w:val="28"/>
+        </w:rPr>
+      </w:pPr>
+      <w:proofErr w:type="gramStart"/>
+      <w:r>
+        <w:rPr>
+          <w:rFonts w:ascii="Times New Roman" w:hAnsi="Times New Roman"/>
+          <w:sz w:val="28"/>
+        </w:rPr>
+        <w:t>By</w:t>
+      </w:r>
+      <w:r>
+        <w:rPr>
+          <w:rFonts w:ascii="Times New Roman" w:hAnsi="Times New Roman"/>
+          <w:sz w:val="28"/>
+        </w:rPr>
+        <w:t>:</w:t>
+      </w:r>
+      <w:proofErr w:type="gramEnd"/>
+    </w:p>
+    <w:p>
+      <w:pPr>
+        <w:spacing w:line="276" w:lineRule="auto"/>
+        <w:jc w:val="center"/>
+        <w:rPr>
+          <w:rFonts w:ascii="Times New Roman" w:hAnsi="Times New Roman"/>
+          <w:sz w:val="28"/>
+        </w:rPr>
+      </w:pPr>
+    </w:p>
+    <w:p>
+      <w:pPr>
+        <w:spacing w:line="276" w:lineRule="auto"/>
+        <w:jc w:val="center"/>
+        <w:rPr>
+          <w:rFonts w:ascii="Times New Roman" w:hAnsi="Times New Roman"/>
+          <w:sz w:val="28"/>
+        </w:rPr>
+      </w:pPr>
+      <w:r>
+        <w:rPr>
+          <w:rFonts w:ascii="Times New Roman" w:hAnsi="Times New Roman"/>
+          <w:sz w:val="28"/>
+        </w:rPr>
+        <w:t>Xavier Ramirez</w:t>
+      </w:r>
+    </w:p>
+    <w:p>
+      <w:pPr>
+        <w:spacing w:line="276" w:lineRule="auto"/>
+        <w:jc w:val="center"/>
+        <w:rPr>
+          <w:rFonts w:ascii="Times New Roman" w:hAnsi="Times New Roman"/>
+          <w:sz w:val="28"/>
+        </w:rPr>
+      </w:pPr>
+    </w:p>
+    <w:p>
+      <w:pPr>
+        <w:spacing w:line="276" w:lineRule="auto"/>
+        <w:jc w:val="center"/>
+        <w:rPr>
+          <w:rFonts w:ascii="Times New Roman" w:hAnsi="Times New Roman"/>
+          <w:sz w:val="28"/>
+        </w:rPr>
+      </w:pPr>
+    </w:p>
+    <w:p>
+      <w:pPr>
+        <w:spacing w:line="276" w:lineRule="auto"/>
+        <w:jc w:val="center"/>
+        <w:rPr>
+          <w:rFonts w:ascii="Times New Roman" w:hAnsi="Times New Roman"/>
+          <w:sz w:val="28"/>
+        </w:rPr>
+      </w:pPr>
+      <w:r>
+        <w:rPr>
+          <w:rFonts w:ascii="Times New Roman" w:hAnsi="Times New Roman"/>
+          <w:sz w:val="28"/>
+        </w:rPr>
+        <w:t>Put somewhere worked alongside Korbin Brashears, collaborating with Seth Callahan and Michael Beaty with data, Dr. Gerald Fudge is advisor (figure formatting out later)</w:t>
+      </w:r>
+    </w:p>
+    <w:p>
+      <w:pPr>
+        <w:pStyle w:val="TOC1"/>
+      </w:pPr>
+    </w:p>
+    <w:p>
+      <w:pPr>
+        <w:pStyle w:val="TOC1"/>
+      </w:pPr>
+    </w:p>
+    <w:p>
+      <w:pPr>
+        <w:pStyle w:val="TOC1"/>
+        <w:jc w:val="both"/>
+      </w:pPr>
+      <w:r>
+        <w:br w:type="page"/>
+      </w:r>
+    </w:p>
+    <w:p>
+      <w:pPr>
+        <w:pStyle w:val="TOC1"/>
+        <w:jc w:val="both"/>
+      </w:pPr>
+    </w:p>
+    <w:sdt>
+      <w:sdtPr>
+        <w:rPr>
+          <w:rFonts w:ascii="Calibri" w:eastAsia="Times New Roman" w:hAnsi="Calibri" w:cs="Times New Roman"/>
+          <w:b w:val="0"/>
+          <w:bCs w:val="0"/>
+          <w:color w:val="auto"/>
+          <w:sz w:val="32"/>
+          <w:szCs w:val="32"/>
+        </w:rPr>
+        <w:id w:val="486522159"/>
+        <w:docPartObj>
+          <w:docPartGallery w:val="Table of Contents"/>
+          <w:docPartUnique/>
+        </w:docPartObj>
+      </w:sdtPr>
+      <w:sdtEndPr>
+        <w:rPr>
+          <w:noProof/>
+          <w:sz w:val="22"/>
+          <w:szCs w:val="20"/>
+        </w:rPr>
+      </w:sdtEndPr>
+      <w:sdtContent>
+        <w:p>
+          <w:pPr>
+            <w:pStyle w:val="TOCHeading"/>
+            <w:rPr>
+              <w:rFonts w:ascii="Times New Roman" w:hAnsi="Times New Roman" w:cs="Times New Roman"/>
+              <w:sz w:val="32"/>
+              <w:szCs w:val="32"/>
+            </w:rPr>
+          </w:pPr>
+          <w:r>
+            <w:rPr>
+              <w:rFonts w:ascii="Times New Roman" w:hAnsi="Times New Roman" w:cs="Times New Roman"/>
+              <w:sz w:val="32"/>
+              <w:szCs w:val="32"/>
+            </w:rPr>
+            <w:t>Table of Contents</w:t>
+          </w:r>
+        </w:p>
+        <w:p>
+          <w:pPr>
+            <w:pStyle w:val="TOC1"/>
+            <w:rPr>
+              <w:rFonts w:ascii="Times New Roman" w:hAnsi="Times New Roman"/>
+            </w:rPr>
+          </w:pPr>
+          <w:r>
+            <w:rPr>
+              <w:rFonts w:ascii="Times New Roman" w:hAnsi="Times New Roman"/>
+            </w:rPr>
+            <w:fldChar w:fldCharType="begin"/>
+          </w:r>
+          <w:r>
+            <w:rPr>
+              <w:rFonts w:ascii="Times New Roman" w:hAnsi="Times New Roman"/>
+            </w:rPr>
+            <w:instrText xml:space="preserve"> TOC \o "1-3" \h \z \u </w:instrText>
+          </w:r>
+          <w:r>
+            <w:rPr>
+              <w:rFonts w:ascii="Times New Roman" w:hAnsi="Times New Roman"/>
+            </w:rPr>
+            <w:fldChar w:fldCharType="separate"/>
+          </w:r>
+          <w:hyperlink w:anchor="_Toc239409850" w:history="1">
             <w:r>
               <w:rPr>
-                <w:sz w:val="28"/>
+                <w:rStyle w:val="Hyperlink"/>
+                <w:rFonts w:ascii="Times New Roman" w:hAnsi="Times New Roman"/>
               </w:rPr>
-              <w:t>Name</w:t>
+              <w:t>1.</w:t>
             </w:r>
-          </w:p>
-        </w:tc>
-        <w:tc>
-          <w:tcPr>
-            <w:tcW w:w="8010" w:type="dxa"/>
-          </w:tcPr>
-          <w:p>
-            <w:pPr>
-              <w:jc w:val="left"/>
-              <w:rPr>
-                <w:sz w:val="28"/>
-              </w:rPr>
-            </w:pPr>
             <w:r>
               <w:rPr>
-                <w:sz w:val="28"/>
+                <w:rFonts w:ascii="Times New Roman" w:eastAsiaTheme="minorEastAsia" w:hAnsi="Times New Roman"/>
+                <w:kern w:val="2"/>
+                <w:sz w:val="24"/>
+                <w:szCs w:val="24"/>
+                <w14:ligatures w14:val="standardContextual"/>
               </w:rPr>
-              <w:t>Xavier Ramirez</w:t>
+              <w:tab/>
             </w:r>
-          </w:p>
-        </w:tc>
-      </w:tr>
-      <w:tr>
-        <w:tc>
-          <w:tcPr>
-            <w:tcW w:w="2610" w:type="dxa"/>
-          </w:tcPr>
-          <w:p>
-            <w:pPr>
-              <w:jc w:val="left"/>
-              <w:rPr>
-                <w:sz w:val="28"/>
-              </w:rPr>
-            </w:pPr>
             <w:r>
               <w:rPr>
-                <w:sz w:val="28"/>
+                <w:rStyle w:val="Hyperlink"/>
+                <w:rFonts w:ascii="Times New Roman" w:hAnsi="Times New Roman"/>
               </w:rPr>
-              <w:t>Data</w:t>
+              <w:t>Abstract</w:t>
             </w:r>
-          </w:p>
-        </w:tc>
-        <w:tc>
-          <w:tcPr>
-            <w:tcW w:w="8010" w:type="dxa"/>
-          </w:tcPr>
-          <w:p>
-            <w:pPr>
-              <w:jc w:val="left"/>
-              <w:rPr>
-                <w:sz w:val="28"/>
-              </w:rPr>
-            </w:pPr>
             <w:r>
               <w:rPr>
-                <w:sz w:val="28"/>
+                <w:rFonts w:ascii="Times New Roman" w:hAnsi="Times New Roman"/>
+                <w:webHidden/>
               </w:rPr>
-              <w:t xml:space="preserve">seth_gov_envData10dtsMetrics_genusCount2026.csv, </w:t>
+              <w:tab/>
             </w:r>
-          </w:p>
-        </w:tc>
-      </w:tr>
-      <w:tr>
-        <w:tc>
-          <w:tcPr>
-            <w:tcW w:w="2610" w:type="dxa"/>
-          </w:tcPr>
-          <w:p>
-            <w:pPr>
-              <w:jc w:val="left"/>
-              <w:rPr>
-                <w:sz w:val="28"/>
-              </w:rPr>
-            </w:pPr>
             <w:r>
               <w:rPr>
-                <w:sz w:val="28"/>
+                <w:rFonts w:ascii="Times New Roman" w:hAnsi="Times New Roman"/>
+                <w:webHidden/>
               </w:rPr>
-              <w:t>Algorithm</w:t>
+              <w:fldChar w:fldCharType="begin"/>
             </w:r>
-          </w:p>
-        </w:tc>
-        <w:tc>
-          <w:tcPr>
-            <w:tcW w:w="8010" w:type="dxa"/>
-          </w:tcPr>
-          <w:p>
-            <w:pPr>
-              <w:jc w:val="left"/>
-              <w:rPr>
-                <w:sz w:val="28"/>
-              </w:rPr>
-            </w:pPr>
             <w:r>
               <w:rPr>
-                <w:sz w:val="28"/>
+                <w:rFonts w:ascii="Times New Roman" w:hAnsi="Times New Roman"/>
+                <w:webHidden/>
               </w:rPr>
-              <w:t xml:space="preserve">PCA, NMDS, Seasonal Decomp, </w:t>
+              <w:instrText xml:space="preserve"> PAGEREF _Toc239409850 \h </w:instrText>
             </w:r>
-          </w:p>
-        </w:tc>
-      </w:tr>
-      <w:tr>
-        <w:tc>
-          <w:tcPr>
-            <w:tcW w:w="2610" w:type="dxa"/>
-          </w:tcPr>
-          <w:p>
-            <w:pPr>
-              <w:jc w:val="left"/>
-              <w:rPr>
-                <w:sz w:val="28"/>
-              </w:rPr>
-            </w:pPr>
             <w:r>
               <w:rPr>
-                <w:sz w:val="28"/>
+                <w:rFonts w:ascii="Times New Roman" w:hAnsi="Times New Roman"/>
+                <w:webHidden/>
+              </w:rPr>
+            </w:r>
+            <w:r>
+              <w:rPr>
+                <w:rFonts w:ascii="Times New Roman" w:hAnsi="Times New Roman"/>
+                <w:webHidden/>
+              </w:rPr>
+              <w:fldChar w:fldCharType="separate"/>
+            </w:r>
+            <w:r>
+              <w:rPr>
+                <w:rFonts w:ascii="Times New Roman" w:hAnsi="Times New Roman"/>
+                <w:webHidden/>
+              </w:rPr>
+              <w:t>3</w:t>
+            </w:r>
+            <w:r>
+              <w:rPr>
+                <w:rFonts w:ascii="Times New Roman" w:hAnsi="Times New Roman"/>
+                <w:webHidden/>
+              </w:rPr>
+              <w:fldChar w:fldCharType="end"/>
+            </w:r>
+          </w:hyperlink>
+        </w:p>
+        <w:p>
+          <w:pPr>
+            <w:pStyle w:val="TOC1"/>
+            <w:rPr>
+              <w:rFonts w:ascii="Times New Roman" w:eastAsiaTheme="minorEastAsia" w:hAnsi="Times New Roman"/>
+              <w:kern w:val="2"/>
+              <w:sz w:val="24"/>
+              <w:szCs w:val="24"/>
+              <w14:ligatures w14:val="standardContextual"/>
+            </w:rPr>
+          </w:pPr>
+          <w:hyperlink w:anchor="_Toc239409851" w:history="1">
+            <w:r>
+              <w:rPr>
+                <w:rStyle w:val="Hyperlink"/>
+                <w:rFonts w:ascii="Times New Roman" w:hAnsi="Times New Roman"/>
+              </w:rPr>
+              <w:t>2.</w:t>
+            </w:r>
+            <w:r>
+              <w:rPr>
+                <w:rFonts w:ascii="Times New Roman" w:eastAsiaTheme="minorEastAsia" w:hAnsi="Times New Roman"/>
+                <w:kern w:val="2"/>
+                <w:sz w:val="24"/>
+                <w:szCs w:val="24"/>
+                <w14:ligatures w14:val="standardContextual"/>
+              </w:rPr>
+              <w:tab/>
+            </w:r>
+            <w:r>
+              <w:rPr>
+                <w:rStyle w:val="Hyperlink"/>
+                <w:rFonts w:ascii="Times New Roman" w:hAnsi="Times New Roman"/>
+              </w:rPr>
+              <w:t>Introduction</w:t>
+            </w:r>
+            <w:r>
+              <w:rPr>
+                <w:rFonts w:ascii="Times New Roman" w:hAnsi="Times New Roman"/>
+                <w:webHidden/>
+              </w:rPr>
+              <w:tab/>
+            </w:r>
+            <w:r>
+              <w:rPr>
+                <w:rFonts w:ascii="Times New Roman" w:hAnsi="Times New Roman"/>
+                <w:webHidden/>
+              </w:rPr>
+              <w:fldChar w:fldCharType="begin"/>
+            </w:r>
+            <w:r>
+              <w:rPr>
+                <w:rFonts w:ascii="Times New Roman" w:hAnsi="Times New Roman"/>
+                <w:webHidden/>
+              </w:rPr>
+              <w:instrText xml:space="preserve"> PAGEREF _Toc239409851 \h </w:instrText>
+            </w:r>
+            <w:r>
+              <w:rPr>
+                <w:rFonts w:ascii="Times New Roman" w:hAnsi="Times New Roman"/>
+                <w:webHidden/>
+              </w:rPr>
+            </w:r>
+            <w:r>
+              <w:rPr>
+                <w:rFonts w:ascii="Times New Roman" w:hAnsi="Times New Roman"/>
+                <w:webHidden/>
+              </w:rPr>
+              <w:fldChar w:fldCharType="separate"/>
+            </w:r>
+            <w:r>
+              <w:rPr>
+                <w:rFonts w:ascii="Times New Roman" w:hAnsi="Times New Roman"/>
+                <w:webHidden/>
+              </w:rPr>
+              <w:t>3</w:t>
+            </w:r>
+            <w:r>
+              <w:rPr>
+                <w:rFonts w:ascii="Times New Roman" w:hAnsi="Times New Roman"/>
+                <w:webHidden/>
+              </w:rPr>
+              <w:fldChar w:fldCharType="end"/>
+            </w:r>
+          </w:hyperlink>
+        </w:p>
+        <w:p>
+          <w:pPr>
+            <w:pStyle w:val="TOC1"/>
+            <w:rPr>
+              <w:rFonts w:ascii="Times New Roman" w:eastAsiaTheme="minorEastAsia" w:hAnsi="Times New Roman"/>
+              <w:kern w:val="2"/>
+              <w:sz w:val="24"/>
+              <w:szCs w:val="24"/>
+              <w14:ligatures w14:val="standardContextual"/>
+            </w:rPr>
+          </w:pPr>
+          <w:hyperlink w:anchor="_Toc239409852" w:history="1">
+            <w:r>
+              <w:rPr>
+                <w:rStyle w:val="Hyperlink"/>
+                <w:rFonts w:ascii="Times New Roman" w:hAnsi="Times New Roman"/>
+              </w:rPr>
+              <w:t>3.</w:t>
+            </w:r>
+            <w:r>
+              <w:rPr>
+                <w:rFonts w:ascii="Times New Roman" w:eastAsiaTheme="minorEastAsia" w:hAnsi="Times New Roman"/>
+                <w:kern w:val="2"/>
+                <w:sz w:val="24"/>
+                <w:szCs w:val="24"/>
+                <w14:ligatures w14:val="standardContextual"/>
+              </w:rPr>
+              <w:tab/>
+            </w:r>
+            <w:r>
+              <w:rPr>
+                <w:rStyle w:val="Hyperlink"/>
+                <w:rFonts w:ascii="Times New Roman" w:hAnsi="Times New Roman"/>
+              </w:rPr>
+              <w:t>Background</w:t>
+            </w:r>
+            <w:r>
+              <w:rPr>
+                <w:rFonts w:ascii="Times New Roman" w:hAnsi="Times New Roman"/>
+                <w:webHidden/>
+              </w:rPr>
+              <w:tab/>
+            </w:r>
+            <w:r>
+              <w:rPr>
+                <w:rFonts w:ascii="Times New Roman" w:hAnsi="Times New Roman"/>
+                <w:webHidden/>
+              </w:rPr>
+              <w:fldChar w:fldCharType="begin"/>
+            </w:r>
+            <w:r>
+              <w:rPr>
+                <w:rFonts w:ascii="Times New Roman" w:hAnsi="Times New Roman"/>
+                <w:webHidden/>
+              </w:rPr>
+              <w:instrText xml:space="preserve"> PAGEREF _Toc239409852 \h </w:instrText>
+            </w:r>
+            <w:r>
+              <w:rPr>
+                <w:rFonts w:ascii="Times New Roman" w:hAnsi="Times New Roman"/>
+                <w:webHidden/>
+              </w:rPr>
+            </w:r>
+            <w:r>
+              <w:rPr>
+                <w:rFonts w:ascii="Times New Roman" w:hAnsi="Times New Roman"/>
+                <w:webHidden/>
+              </w:rPr>
+              <w:fldChar w:fldCharType="separate"/>
+            </w:r>
+            <w:r>
+              <w:rPr>
+                <w:rFonts w:ascii="Times New Roman" w:hAnsi="Times New Roman"/>
+                <w:webHidden/>
+              </w:rPr>
+              <w:t>3</w:t>
+            </w:r>
+            <w:r>
+              <w:rPr>
+                <w:rFonts w:ascii="Times New Roman" w:hAnsi="Times New Roman"/>
+                <w:webHidden/>
+              </w:rPr>
+              <w:fldChar w:fldCharType="end"/>
+            </w:r>
+          </w:hyperlink>
+        </w:p>
+        <w:p>
+          <w:pPr>
+            <w:pStyle w:val="TOC1"/>
+            <w:rPr>
+              <w:rFonts w:ascii="Times New Roman" w:eastAsiaTheme="minorEastAsia" w:hAnsi="Times New Roman"/>
+              <w:kern w:val="2"/>
+              <w:sz w:val="24"/>
+              <w:szCs w:val="24"/>
+              <w14:ligatures w14:val="standardContextual"/>
+            </w:rPr>
+          </w:pPr>
+          <w:hyperlink w:anchor="_Toc239409853" w:history="1">
+            <w:r>
+              <w:rPr>
+                <w:rStyle w:val="Hyperlink"/>
+                <w:rFonts w:ascii="Times New Roman" w:hAnsi="Times New Roman"/>
+              </w:rPr>
+              <w:t>4.</w:t>
+            </w:r>
+            <w:r>
+              <w:rPr>
+                <w:rFonts w:ascii="Times New Roman" w:eastAsiaTheme="minorEastAsia" w:hAnsi="Times New Roman"/>
+                <w:kern w:val="2"/>
+                <w:sz w:val="24"/>
+                <w:szCs w:val="24"/>
+                <w14:ligatures w14:val="standardContextual"/>
+              </w:rPr>
+              <w:tab/>
+            </w:r>
+            <w:r>
+              <w:rPr>
+                <w:rStyle w:val="Hyperlink"/>
+                <w:rFonts w:ascii="Times New Roman" w:hAnsi="Times New Roman"/>
+              </w:rPr>
+              <w:t>Methodology</w:t>
+            </w:r>
+            <w:r>
+              <w:rPr>
+                <w:rFonts w:ascii="Times New Roman" w:hAnsi="Times New Roman"/>
+                <w:webHidden/>
+              </w:rPr>
+              <w:tab/>
+            </w:r>
+            <w:r>
+              <w:rPr>
+                <w:rFonts w:ascii="Times New Roman" w:hAnsi="Times New Roman"/>
+                <w:webHidden/>
+              </w:rPr>
+              <w:fldChar w:fldCharType="begin"/>
+            </w:r>
+            <w:r>
+              <w:rPr>
+                <w:rFonts w:ascii="Times New Roman" w:hAnsi="Times New Roman"/>
+                <w:webHidden/>
+              </w:rPr>
+              <w:instrText xml:space="preserve"> PAGEREF _Toc239409853 \h </w:instrText>
+            </w:r>
+            <w:r>
+              <w:rPr>
+                <w:rFonts w:ascii="Times New Roman" w:hAnsi="Times New Roman"/>
+                <w:webHidden/>
+              </w:rPr>
+            </w:r>
+            <w:r>
+              <w:rPr>
+                <w:rFonts w:ascii="Times New Roman" w:hAnsi="Times New Roman"/>
+                <w:webHidden/>
+              </w:rPr>
+              <w:fldChar w:fldCharType="separate"/>
+            </w:r>
+            <w:r>
+              <w:rPr>
+                <w:rFonts w:ascii="Times New Roman" w:hAnsi="Times New Roman"/>
+                <w:webHidden/>
+              </w:rPr>
+              <w:t>3</w:t>
+            </w:r>
+            <w:r>
+              <w:rPr>
+                <w:rFonts w:ascii="Times New Roman" w:hAnsi="Times New Roman"/>
+                <w:webHidden/>
+              </w:rPr>
+              <w:fldChar w:fldCharType="end"/>
+            </w:r>
+          </w:hyperlink>
+        </w:p>
+        <w:p>
+          <w:pPr>
+            <w:pStyle w:val="TOC1"/>
+            <w:rPr>
+              <w:rFonts w:ascii="Times New Roman" w:eastAsiaTheme="minorEastAsia" w:hAnsi="Times New Roman"/>
+              <w:kern w:val="2"/>
+              <w:sz w:val="24"/>
+              <w:szCs w:val="24"/>
+              <w14:ligatures w14:val="standardContextual"/>
+            </w:rPr>
+          </w:pPr>
+          <w:hyperlink w:anchor="_Toc239409854" w:history="1">
+            <w:r>
+              <w:rPr>
+                <w:rStyle w:val="Hyperlink"/>
+                <w:rFonts w:ascii="Times New Roman" w:hAnsi="Times New Roman"/>
+              </w:rPr>
+              <w:t>5.</w:t>
+            </w:r>
+            <w:r>
+              <w:rPr>
+                <w:rFonts w:ascii="Times New Roman" w:eastAsiaTheme="minorEastAsia" w:hAnsi="Times New Roman"/>
+                <w:kern w:val="2"/>
+                <w:sz w:val="24"/>
+                <w:szCs w:val="24"/>
+                <w14:ligatures w14:val="standardContextual"/>
+              </w:rPr>
+              <w:tab/>
+            </w:r>
+            <w:r>
+              <w:rPr>
+                <w:rStyle w:val="Hyperlink"/>
+                <w:rFonts w:ascii="Times New Roman" w:hAnsi="Times New Roman"/>
               </w:rPr>
               <w:t>Results</w:t>
             </w:r>
-          </w:p>
-        </w:tc>
-        <w:tc>
-          <w:tcPr>
-            <w:tcW w:w="8010" w:type="dxa"/>
-          </w:tcPr>
-          <w:p>
-            <w:pPr>
-              <w:jc w:val="left"/>
-              <w:rPr>
-                <w:sz w:val="28"/>
-              </w:rPr>
-            </w:pPr>
             <w:r>
               <w:rPr>
-                <w:sz w:val="28"/>
+                <w:rFonts w:ascii="Times New Roman" w:hAnsi="Times New Roman"/>
+                <w:webHidden/>
               </w:rPr>
-              <w:t>Will put once organized and cleaned past algorithms</w:t>
+              <w:tab/>
             </w:r>
-          </w:p>
-        </w:tc>
-      </w:tr>
-      <w:tr>
-        <w:tc>
-          <w:tcPr>
-            <w:tcW w:w="2610" w:type="dxa"/>
-          </w:tcPr>
-          <w:p>
-            <w:pPr>
-              <w:jc w:val="left"/>
-              <w:rPr>
-                <w:sz w:val="28"/>
-              </w:rPr>
-            </w:pPr>
             <w:r>
               <w:rPr>
-                <w:sz w:val="28"/>
+                <w:rFonts w:ascii="Times New Roman" w:hAnsi="Times New Roman"/>
+                <w:webHidden/>
               </w:rPr>
-              <w:t>Collaborators</w:t>
+              <w:fldChar w:fldCharType="begin"/>
             </w:r>
-          </w:p>
-        </w:tc>
-        <w:tc>
-          <w:tcPr>
-            <w:tcW w:w="8010" w:type="dxa"/>
-          </w:tcPr>
-          <w:p>
-            <w:pPr>
-              <w:jc w:val="left"/>
-              <w:rPr>
-                <w:sz w:val="28"/>
-              </w:rPr>
-            </w:pPr>
             <w:r>
               <w:rPr>
-                <w:sz w:val="28"/>
+                <w:rFonts w:ascii="Times New Roman" w:hAnsi="Times New Roman"/>
+                <w:webHidden/>
               </w:rPr>
-              <w:t>Korbin Brashears</w:t>
+              <w:instrText xml:space="preserve"> PAGEREF _Toc239409854 \h </w:instrText>
             </w:r>
-          </w:p>
-        </w:tc>
-      </w:tr>
-      <w:tr>
-        <w:tc>
-          <w:tcPr>
-            <w:tcW w:w="2610" w:type="dxa"/>
-          </w:tcPr>
-          <w:p>
-            <w:pPr>
-              <w:jc w:val="left"/>
-              <w:rPr>
-                <w:sz w:val="28"/>
-              </w:rPr>
-            </w:pPr>
             <w:r>
               <w:rPr>
-                <w:sz w:val="28"/>
+                <w:rFonts w:ascii="Times New Roman" w:hAnsi="Times New Roman"/>
+                <w:webHidden/>
               </w:rPr>
-              <w:t>AI Tools</w:t>
             </w:r>
-          </w:p>
-        </w:tc>
-        <w:tc>
-          <w:tcPr>
-            <w:tcW w:w="8010" w:type="dxa"/>
-          </w:tcPr>
-          <w:p>
-            <w:pPr>
-              <w:jc w:val="left"/>
-              <w:rPr>
-                <w:sz w:val="28"/>
-              </w:rPr>
-            </w:pPr>
             <w:r>
               <w:rPr>
-                <w:sz w:val="28"/>
+                <w:rFonts w:ascii="Times New Roman" w:hAnsi="Times New Roman"/>
+                <w:webHidden/>
               </w:rPr>
-              <w:t>Copilot</w:t>
+              <w:fldChar w:fldCharType="separate"/>
             </w:r>
-          </w:p>
-        </w:tc>
-      </w:tr>
-      <w:tr>
-        <w:tc>
-          <w:tcPr>
-            <w:tcW w:w="2610" w:type="dxa"/>
-          </w:tcPr>
-          <w:p>
-            <w:pPr>
-              <w:jc w:val="left"/>
-              <w:rPr>
-                <w:sz w:val="28"/>
-              </w:rPr>
-            </w:pPr>
             <w:r>
               <w:rPr>
-                <w:sz w:val="28"/>
+                <w:rFonts w:ascii="Times New Roman" w:hAnsi="Times New Roman"/>
+                <w:webHidden/>
               </w:rPr>
-              <w:t>Date</w:t>
+              <w:t>3</w:t>
             </w:r>
-          </w:p>
-        </w:tc>
-        <w:tc>
-          <w:tcPr>
-            <w:tcW w:w="8010" w:type="dxa"/>
-          </w:tcPr>
-          <w:p>
-            <w:pPr>
-              <w:jc w:val="left"/>
-              <w:rPr>
-                <w:sz w:val="28"/>
-              </w:rPr>
-            </w:pPr>
             <w:r>
               <w:rPr>
-                <w:sz w:val="28"/>
+                <w:rFonts w:ascii="Times New Roman" w:hAnsi="Times New Roman"/>
+                <w:webHidden/>
               </w:rPr>
-              <w:t>04sep2026</w:t>
+              <w:fldChar w:fldCharType="end"/>
             </w:r>
-          </w:p>
-        </w:tc>
-      </w:tr>
-      <w:tr>
-        <w:tc>
-          <w:tcPr>
-            <w:tcW w:w="2610" w:type="dxa"/>
-          </w:tcPr>
-          <w:p>
-            <w:pPr>
-              <w:jc w:val="left"/>
-              <w:rPr>
-                <w:sz w:val="28"/>
-              </w:rPr>
-            </w:pPr>
+          </w:hyperlink>
+        </w:p>
+        <w:p>
+          <w:pPr>
+            <w:pStyle w:val="TOC1"/>
+            <w:rPr>
+              <w:rFonts w:ascii="Times New Roman" w:eastAsiaTheme="minorEastAsia" w:hAnsi="Times New Roman"/>
+              <w:kern w:val="2"/>
+              <w:sz w:val="24"/>
+              <w:szCs w:val="24"/>
+              <w14:ligatures w14:val="standardContextual"/>
+            </w:rPr>
+          </w:pPr>
+          <w:hyperlink w:anchor="_Toc239409855" w:history="1">
             <w:r>
               <w:rPr>
-                <w:sz w:val="28"/>
+                <w:rStyle w:val="Hyperlink"/>
+                <w:rFonts w:ascii="Times New Roman" w:hAnsi="Times New Roman"/>
               </w:rPr>
-              <w:t>Instructor</w:t>
+              <w:t>6.</w:t>
             </w:r>
-          </w:p>
-        </w:tc>
-        <w:tc>
-          <w:tcPr>
-            <w:tcW w:w="8010" w:type="dxa"/>
-          </w:tcPr>
-          <w:p>
-            <w:pPr>
-              <w:jc w:val="left"/>
-              <w:rPr>
-                <w:sz w:val="28"/>
-              </w:rPr>
-            </w:pPr>
             <w:r>
               <w:rPr>
-                <w:sz w:val="28"/>
+                <w:rFonts w:ascii="Times New Roman" w:eastAsiaTheme="minorEastAsia" w:hAnsi="Times New Roman"/>
+                <w:kern w:val="2"/>
+                <w:sz w:val="24"/>
+                <w:szCs w:val="24"/>
+                <w14:ligatures w14:val="standardContextual"/>
               </w:rPr>
-              <w:t>Dr. Gerald Fudge</w:t>
+              <w:tab/>
             </w:r>
-          </w:p>
-        </w:tc>
-      </w:tr>
-    </w:tbl>
-    <w:p>
-      <w:pPr>
-        <w:rPr>
-          <w:sz w:val="28"/>
-        </w:rPr>
-      </w:pPr>
-    </w:p>
-    <w:p>
-      <w:pPr>
-        <w:rPr>
-          <w:sz w:val="28"/>
-        </w:rPr>
-      </w:pPr>
-    </w:p>
-    <w:p>
-      <w:pPr>
-        <w:jc w:val="center"/>
-        <w:rPr>
-          <w:sz w:val="28"/>
-        </w:rPr>
-      </w:pPr>
-    </w:p>
-    <w:p>
-      <w:pPr>
-        <w:jc w:val="center"/>
-        <w:rPr>
-          <w:sz w:val="28"/>
-        </w:rPr>
-      </w:pPr>
-    </w:p>
-    <w:p>
-      <w:pPr>
-        <w:jc w:val="center"/>
-        <w:rPr>
-          <w:sz w:val="28"/>
-        </w:rPr>
-      </w:pPr>
-    </w:p>
-    <w:p>
-      <w:pPr>
-        <w:jc w:val="center"/>
-        <w:rPr>
-          <w:sz w:val="28"/>
-        </w:rPr>
-      </w:pPr>
-    </w:p>
+            <w:r>
+              <w:rPr>
+                <w:rStyle w:val="Hyperlink"/>
+                <w:rFonts w:ascii="Times New Roman" w:hAnsi="Times New Roman"/>
+              </w:rPr>
+              <w:t>Discussion</w:t>
+            </w:r>
+            <w:r>
+              <w:rPr>
+                <w:rFonts w:ascii="Times New Roman" w:hAnsi="Times New Roman"/>
+                <w:webHidden/>
+              </w:rPr>
+              <w:tab/>
+            </w:r>
+            <w:r>
+              <w:rPr>
+                <w:rFonts w:ascii="Times New Roman" w:hAnsi="Times New Roman"/>
+                <w:webHidden/>
+              </w:rPr>
+              <w:fldChar w:fldCharType="begin"/>
+            </w:r>
+            <w:r>
+              <w:rPr>
+                <w:rFonts w:ascii="Times New Roman" w:hAnsi="Times New Roman"/>
+                <w:webHidden/>
+              </w:rPr>
+              <w:instrText xml:space="preserve"> PAGEREF _Toc239409855 \h </w:instrText>
+            </w:r>
+            <w:r>
+              <w:rPr>
+                <w:rFonts w:ascii="Times New Roman" w:hAnsi="Times New Roman"/>
+                <w:webHidden/>
+              </w:rPr>
+            </w:r>
+            <w:r>
+              <w:rPr>
+                <w:rFonts w:ascii="Times New Roman" w:hAnsi="Times New Roman"/>
+                <w:webHidden/>
+              </w:rPr>
+              <w:fldChar w:fldCharType="separate"/>
+            </w:r>
+            <w:r>
+              <w:rPr>
+                <w:rFonts w:ascii="Times New Roman" w:hAnsi="Times New Roman"/>
+                <w:webHidden/>
+              </w:rPr>
+              <w:t>3</w:t>
+            </w:r>
+            <w:r>
+              <w:rPr>
+                <w:rFonts w:ascii="Times New Roman" w:hAnsi="Times New Roman"/>
+                <w:webHidden/>
+              </w:rPr>
+              <w:fldChar w:fldCharType="end"/>
+            </w:r>
+          </w:hyperlink>
+        </w:p>
+        <w:p>
+          <w:pPr>
+            <w:pStyle w:val="TOC1"/>
+            <w:rPr>
+              <w:rFonts w:ascii="Times New Roman" w:hAnsi="Times New Roman"/>
+            </w:rPr>
+          </w:pPr>
+          <w:hyperlink w:anchor="_Toc239409856" w:history="1">
+            <w:r>
+              <w:rPr>
+                <w:rStyle w:val="Hyperlink"/>
+                <w:rFonts w:ascii="Times New Roman" w:hAnsi="Times New Roman"/>
+              </w:rPr>
+              <w:t>7.</w:t>
+            </w:r>
+            <w:r>
+              <w:rPr>
+                <w:rFonts w:ascii="Times New Roman" w:eastAsiaTheme="minorEastAsia" w:hAnsi="Times New Roman"/>
+                <w:kern w:val="2"/>
+                <w:sz w:val="24"/>
+                <w:szCs w:val="24"/>
+                <w14:ligatures w14:val="standardContextual"/>
+              </w:rPr>
+              <w:tab/>
+            </w:r>
+            <w:r>
+              <w:rPr>
+                <w:rStyle w:val="Hyperlink"/>
+                <w:rFonts w:ascii="Times New Roman" w:hAnsi="Times New Roman"/>
+              </w:rPr>
+              <w:t>Conclusions</w:t>
+            </w:r>
+            <w:r>
+              <w:rPr>
+                <w:rFonts w:ascii="Times New Roman" w:hAnsi="Times New Roman"/>
+                <w:webHidden/>
+              </w:rPr>
+              <w:tab/>
+            </w:r>
+            <w:r>
+              <w:rPr>
+                <w:rFonts w:ascii="Times New Roman" w:hAnsi="Times New Roman"/>
+                <w:webHidden/>
+              </w:rPr>
+              <w:fldChar w:fldCharType="begin"/>
+            </w:r>
+            <w:r>
+              <w:rPr>
+                <w:rFonts w:ascii="Times New Roman" w:hAnsi="Times New Roman"/>
+                <w:webHidden/>
+              </w:rPr>
+              <w:instrText xml:space="preserve"> PAGEREF _Toc239409856 \h </w:instrText>
+            </w:r>
+            <w:r>
+              <w:rPr>
+                <w:rFonts w:ascii="Times New Roman" w:hAnsi="Times New Roman"/>
+                <w:webHidden/>
+              </w:rPr>
+            </w:r>
+            <w:r>
+              <w:rPr>
+                <w:rFonts w:ascii="Times New Roman" w:hAnsi="Times New Roman"/>
+                <w:webHidden/>
+              </w:rPr>
+              <w:fldChar w:fldCharType="separate"/>
+            </w:r>
+            <w:r>
+              <w:rPr>
+                <w:rFonts w:ascii="Times New Roman" w:hAnsi="Times New Roman"/>
+                <w:webHidden/>
+              </w:rPr>
+              <w:t>3</w:t>
+            </w:r>
+            <w:r>
+              <w:rPr>
+                <w:rFonts w:ascii="Times New Roman" w:hAnsi="Times New Roman"/>
+                <w:webHidden/>
+              </w:rPr>
+              <w:fldChar w:fldCharType="end"/>
+            </w:r>
+          </w:hyperlink>
+        </w:p>
+        <w:p>
+          <w:pPr>
+            <w:rPr>
+              <w:rFonts w:ascii="Times New Roman" w:hAnsi="Times New Roman"/>
+              <w:b/>
+              <w:bCs/>
+              <w:noProof/>
+            </w:rPr>
+          </w:pPr>
+          <w:r>
+            <w:rPr>
+              <w:rFonts w:ascii="Times New Roman" w:hAnsi="Times New Roman"/>
+              <w:b/>
+              <w:bCs/>
+              <w:noProof/>
+            </w:rPr>
+            <w:fldChar w:fldCharType="end"/>
+          </w:r>
+        </w:p>
+      </w:sdtContent>
+    </w:sdt>
+    <w:p/>
+    <w:p/>
+    <w:p/>
+    <w:p/>
+    <w:p/>
+    <w:p/>
+    <w:p/>
+    <w:p/>
+    <w:p/>
+    <w:p/>
+    <w:p/>
+    <w:p/>
     <w:p/>
     <w:p/>
     <w:p/>
@@ -486,664 +1081,62 @@
     <w:p/>
     <w:p/>
     <w:p>
+      <w:pPr>
+        <w:rPr>
+          <w:rFonts w:ascii="Times New Roman" w:hAnsi="Times New Roman"/>
+          <w:b/>
+          <w:bCs/>
+          <w:noProof/>
+        </w:rPr>
+      </w:pPr>
+    </w:p>
+    <w:p>
+      <w:pPr>
+        <w:tabs>
+          <w:tab w:val="left" w:pos="5921"/>
+        </w:tabs>
+        <w:rPr>
+          <w:rFonts w:ascii="Times New Roman" w:hAnsi="Times New Roman"/>
+        </w:rPr>
+      </w:pPr>
       <w:r>
-        <w:br w:type="page"/>
+        <w:rPr>
+          <w:rFonts w:ascii="Times New Roman" w:hAnsi="Times New Roman"/>
+        </w:rPr>
+        <w:tab/>
       </w:r>
     </w:p>
     <w:p>
       <w:pPr>
-        <w:pStyle w:val="TOC1"/>
+        <w:sectPr>
+          <w:headerReference w:type="default" r:id="rId9"/>
+          <w:footerReference w:type="default" r:id="rId10"/>
+          <w:pgSz w:w="12240" w:h="15840"/>
+          <w:pgMar w:top="1080" w:right="1080" w:bottom="1080" w:left="1080" w:header="720" w:footer="432" w:gutter="0"/>
+          <w:pgBorders w:offsetFrom="page">
+            <w:top w:val="single" w:sz="4" w:space="24" w:color="auto"/>
+            <w:left w:val="single" w:sz="4" w:space="24" w:color="auto"/>
+            <w:bottom w:val="single" w:sz="4" w:space="24" w:color="auto"/>
+            <w:right w:val="single" w:sz="4" w:space="24" w:color="auto"/>
+          </w:pgBorders>
+          <w:cols w:space="720"/>
+          <w:titlePg/>
+          <w:docGrid w:linePitch="360"/>
+        </w:sectPr>
       </w:pPr>
     </w:p>
-    <w:sdt>
-      <w:sdtPr>
-        <w:rPr>
-          <w:rFonts w:ascii="Calibri" w:eastAsia="Times New Roman" w:hAnsi="Calibri" w:cs="Times New Roman"/>
-          <w:b w:val="0"/>
-          <w:bCs w:val="0"/>
-          <w:color w:val="auto"/>
-          <w:sz w:val="22"/>
-          <w:szCs w:val="20"/>
-        </w:rPr>
-        <w:id w:val="486522159"/>
-        <w:docPartObj>
-          <w:docPartGallery w:val="Table of Contents"/>
-          <w:docPartUnique/>
-        </w:docPartObj>
-      </w:sdtPr>
-      <w:sdtEndPr>
-        <w:rPr>
-          <w:noProof/>
-        </w:rPr>
-      </w:sdtEndPr>
-      <w:sdtContent>
-        <w:p>
-          <w:pPr>
-            <w:pStyle w:val="TOCHeading"/>
-          </w:pPr>
-          <w:r>
-            <w:t>Table of Contents</w:t>
-          </w:r>
-        </w:p>
-        <w:p>
-          <w:pPr>
-            <w:pStyle w:val="TOC1"/>
-            <w:rPr>
-              <w:rFonts w:eastAsiaTheme="minorEastAsia" w:cstheme="minorBidi"/>
-              <w:b w:val="0"/>
-              <w:bCs w:val="0"/>
-              <w:caps w:val="0"/>
-              <w:kern w:val="2"/>
-              <w:sz w:val="24"/>
-              <w:szCs w:val="24"/>
-              <w14:ligatures w14:val="standardContextual"/>
-            </w:rPr>
-          </w:pPr>
-          <w:r>
-            <w:fldChar w:fldCharType="begin"/>
-          </w:r>
-          <w:r>
-            <w:instrText xml:space="preserve"> TOC \o "1-3" \h \z \u </w:instrText>
-          </w:r>
-          <w:r>
-            <w:fldChar w:fldCharType="separate"/>
-          </w:r>
-          <w:hyperlink w:anchor="_Toc239409850" w:history="1">
-            <w:r>
-              <w:rPr>
-                <w:rStyle w:val="Hyperlink"/>
-              </w:rPr>
-              <w:t>1.</w:t>
-            </w:r>
-            <w:r>
-              <w:rPr>
-                <w:rFonts w:eastAsiaTheme="minorEastAsia" w:cstheme="minorBidi"/>
-                <w:b w:val="0"/>
-                <w:bCs w:val="0"/>
-                <w:caps w:val="0"/>
-                <w:kern w:val="2"/>
-                <w:sz w:val="24"/>
-                <w:szCs w:val="24"/>
-                <w14:ligatures w14:val="standardContextual"/>
-              </w:rPr>
-              <w:tab/>
-            </w:r>
-            <w:r>
-              <w:rPr>
-                <w:rStyle w:val="Hyperlink"/>
-              </w:rPr>
-              <w:t>Abstract</w:t>
-            </w:r>
-            <w:r>
-              <w:rPr>
-                <w:webHidden/>
-              </w:rPr>
-              <w:tab/>
-            </w:r>
-            <w:r>
-              <w:rPr>
-                <w:webHidden/>
-              </w:rPr>
-              <w:fldChar w:fldCharType="begin"/>
-            </w:r>
-            <w:r>
-              <w:rPr>
-                <w:webHidden/>
-              </w:rPr>
-              <w:instrText xml:space="preserve"> PAGEREF _Toc239409850 \h </w:instrText>
-            </w:r>
-            <w:r>
-              <w:rPr>
-                <w:webHidden/>
-              </w:rPr>
-            </w:r>
-            <w:r>
-              <w:rPr>
-                <w:webHidden/>
-              </w:rPr>
-              <w:fldChar w:fldCharType="separate"/>
-            </w:r>
-            <w:r>
-              <w:rPr>
-                <w:webHidden/>
-              </w:rPr>
-              <w:t>3</w:t>
-            </w:r>
-            <w:r>
-              <w:rPr>
-                <w:webHidden/>
-              </w:rPr>
-              <w:fldChar w:fldCharType="end"/>
-            </w:r>
-          </w:hyperlink>
-        </w:p>
-        <w:p>
-          <w:pPr>
-            <w:pStyle w:val="TOC1"/>
-            <w:rPr>
-              <w:rFonts w:eastAsiaTheme="minorEastAsia" w:cstheme="minorBidi"/>
-              <w:b w:val="0"/>
-              <w:bCs w:val="0"/>
-              <w:caps w:val="0"/>
-              <w:kern w:val="2"/>
-              <w:sz w:val="24"/>
-              <w:szCs w:val="24"/>
-              <w14:ligatures w14:val="standardContextual"/>
-            </w:rPr>
-          </w:pPr>
-          <w:hyperlink w:anchor="_Toc239409851" w:history="1">
-            <w:r>
-              <w:rPr>
-                <w:rStyle w:val="Hyperlink"/>
-              </w:rPr>
-              <w:t>2.</w:t>
-            </w:r>
-            <w:r>
-              <w:rPr>
-                <w:rFonts w:eastAsiaTheme="minorEastAsia" w:cstheme="minorBidi"/>
-                <w:b w:val="0"/>
-                <w:bCs w:val="0"/>
-                <w:caps w:val="0"/>
-                <w:kern w:val="2"/>
-                <w:sz w:val="24"/>
-                <w:szCs w:val="24"/>
-                <w14:ligatures w14:val="standardContextual"/>
-              </w:rPr>
-              <w:tab/>
-            </w:r>
-            <w:r>
-              <w:rPr>
-                <w:rStyle w:val="Hyperlink"/>
-              </w:rPr>
-              <w:t>Introduction</w:t>
-            </w:r>
-            <w:r>
-              <w:rPr>
-                <w:webHidden/>
-              </w:rPr>
-              <w:tab/>
-            </w:r>
-            <w:r>
-              <w:rPr>
-                <w:webHidden/>
-              </w:rPr>
-              <w:fldChar w:fldCharType="begin"/>
-            </w:r>
-            <w:r>
-              <w:rPr>
-                <w:webHidden/>
-              </w:rPr>
-              <w:instrText xml:space="preserve"> PAGEREF _Toc239409851 \h </w:instrText>
-            </w:r>
-            <w:r>
-              <w:rPr>
-                <w:webHidden/>
-              </w:rPr>
-            </w:r>
-            <w:r>
-              <w:rPr>
-                <w:webHidden/>
-              </w:rPr>
-              <w:fldChar w:fldCharType="separate"/>
-            </w:r>
-            <w:r>
-              <w:rPr>
-                <w:webHidden/>
-              </w:rPr>
-              <w:t>3</w:t>
-            </w:r>
-            <w:r>
-              <w:rPr>
-                <w:webHidden/>
-              </w:rPr>
-              <w:fldChar w:fldCharType="end"/>
-            </w:r>
-          </w:hyperlink>
-        </w:p>
-        <w:p>
-          <w:pPr>
-            <w:pStyle w:val="TOC1"/>
-            <w:rPr>
-              <w:rFonts w:eastAsiaTheme="minorEastAsia" w:cstheme="minorBidi"/>
-              <w:b w:val="0"/>
-              <w:bCs w:val="0"/>
-              <w:caps w:val="0"/>
-              <w:kern w:val="2"/>
-              <w:sz w:val="24"/>
-              <w:szCs w:val="24"/>
-              <w14:ligatures w14:val="standardContextual"/>
-            </w:rPr>
-          </w:pPr>
-          <w:hyperlink w:anchor="_Toc239409852" w:history="1">
-            <w:r>
-              <w:rPr>
-                <w:rStyle w:val="Hyperlink"/>
-              </w:rPr>
-              <w:t>3.</w:t>
-            </w:r>
-            <w:r>
-              <w:rPr>
-                <w:rFonts w:eastAsiaTheme="minorEastAsia" w:cstheme="minorBidi"/>
-                <w:b w:val="0"/>
-                <w:bCs w:val="0"/>
-                <w:caps w:val="0"/>
-                <w:kern w:val="2"/>
-                <w:sz w:val="24"/>
-                <w:szCs w:val="24"/>
-                <w14:ligatures w14:val="standardContextual"/>
-              </w:rPr>
-              <w:tab/>
-            </w:r>
-            <w:r>
-              <w:rPr>
-                <w:rStyle w:val="Hyperlink"/>
-              </w:rPr>
-              <w:t>Background</w:t>
-            </w:r>
-            <w:r>
-              <w:rPr>
-                <w:webHidden/>
-              </w:rPr>
-              <w:tab/>
-            </w:r>
-            <w:r>
-              <w:rPr>
-                <w:webHidden/>
-              </w:rPr>
-              <w:fldChar w:fldCharType="begin"/>
-            </w:r>
-            <w:r>
-              <w:rPr>
-                <w:webHidden/>
-              </w:rPr>
-              <w:instrText xml:space="preserve"> PAGEREF _Toc239409852 \h </w:instrText>
-            </w:r>
-            <w:r>
-              <w:rPr>
-                <w:webHidden/>
-              </w:rPr>
-            </w:r>
-            <w:r>
-              <w:rPr>
-                <w:webHidden/>
-              </w:rPr>
-              <w:fldChar w:fldCharType="separate"/>
-            </w:r>
-            <w:r>
-              <w:rPr>
-                <w:webHidden/>
-              </w:rPr>
-              <w:t>3</w:t>
-            </w:r>
-            <w:r>
-              <w:rPr>
-                <w:webHidden/>
-              </w:rPr>
-              <w:fldChar w:fldCharType="end"/>
-            </w:r>
-          </w:hyperlink>
-        </w:p>
-        <w:p>
-          <w:pPr>
-            <w:pStyle w:val="TOC1"/>
-            <w:rPr>
-              <w:rFonts w:eastAsiaTheme="minorEastAsia" w:cstheme="minorBidi"/>
-              <w:b w:val="0"/>
-              <w:bCs w:val="0"/>
-              <w:caps w:val="0"/>
-              <w:kern w:val="2"/>
-              <w:sz w:val="24"/>
-              <w:szCs w:val="24"/>
-              <w14:ligatures w14:val="standardContextual"/>
-            </w:rPr>
-          </w:pPr>
-          <w:hyperlink w:anchor="_Toc239409853" w:history="1">
-            <w:r>
-              <w:rPr>
-                <w:rStyle w:val="Hyperlink"/>
-              </w:rPr>
-              <w:t>4.</w:t>
-            </w:r>
-            <w:r>
-              <w:rPr>
-                <w:rFonts w:eastAsiaTheme="minorEastAsia" w:cstheme="minorBidi"/>
-                <w:b w:val="0"/>
-                <w:bCs w:val="0"/>
-                <w:caps w:val="0"/>
-                <w:kern w:val="2"/>
-                <w:sz w:val="24"/>
-                <w:szCs w:val="24"/>
-                <w14:ligatures w14:val="standardContextual"/>
-              </w:rPr>
-              <w:tab/>
-            </w:r>
-            <w:r>
-              <w:rPr>
-                <w:rStyle w:val="Hyperlink"/>
-              </w:rPr>
-              <w:t>Methodology</w:t>
-            </w:r>
-            <w:r>
-              <w:rPr>
-                <w:webHidden/>
-              </w:rPr>
-              <w:tab/>
-            </w:r>
-            <w:r>
-              <w:rPr>
-                <w:webHidden/>
-              </w:rPr>
-              <w:fldChar w:fldCharType="begin"/>
-            </w:r>
-            <w:r>
-              <w:rPr>
-                <w:webHidden/>
-              </w:rPr>
-              <w:instrText xml:space="preserve"> PAGEREF _Toc239409853 \h </w:instrText>
-            </w:r>
-            <w:r>
-              <w:rPr>
-                <w:webHidden/>
-              </w:rPr>
-            </w:r>
-            <w:r>
-              <w:rPr>
-                <w:webHidden/>
-              </w:rPr>
-              <w:fldChar w:fldCharType="separate"/>
-            </w:r>
-            <w:r>
-              <w:rPr>
-                <w:webHidden/>
-              </w:rPr>
-              <w:t>3</w:t>
-            </w:r>
-            <w:r>
-              <w:rPr>
-                <w:webHidden/>
-              </w:rPr>
-              <w:fldChar w:fldCharType="end"/>
-            </w:r>
-          </w:hyperlink>
-        </w:p>
-        <w:p>
-          <w:pPr>
-            <w:pStyle w:val="TOC1"/>
-            <w:rPr>
-              <w:rFonts w:eastAsiaTheme="minorEastAsia" w:cstheme="minorBidi"/>
-              <w:b w:val="0"/>
-              <w:bCs w:val="0"/>
-              <w:caps w:val="0"/>
-              <w:kern w:val="2"/>
-              <w:sz w:val="24"/>
-              <w:szCs w:val="24"/>
-              <w14:ligatures w14:val="standardContextual"/>
-            </w:rPr>
-          </w:pPr>
-          <w:hyperlink w:anchor="_Toc239409854" w:history="1">
-            <w:r>
-              <w:rPr>
-                <w:rStyle w:val="Hyperlink"/>
-              </w:rPr>
-              <w:t>5.</w:t>
-            </w:r>
-            <w:r>
-              <w:rPr>
-                <w:rFonts w:eastAsiaTheme="minorEastAsia" w:cstheme="minorBidi"/>
-                <w:b w:val="0"/>
-                <w:bCs w:val="0"/>
-                <w:caps w:val="0"/>
-                <w:kern w:val="2"/>
-                <w:sz w:val="24"/>
-                <w:szCs w:val="24"/>
-                <w14:ligatures w14:val="standardContextual"/>
-              </w:rPr>
-              <w:tab/>
-            </w:r>
-            <w:r>
-              <w:rPr>
-                <w:rStyle w:val="Hyperlink"/>
-              </w:rPr>
-              <w:t>Results</w:t>
-            </w:r>
-            <w:r>
-              <w:rPr>
-                <w:webHidden/>
-              </w:rPr>
-              <w:tab/>
-            </w:r>
-            <w:r>
-              <w:rPr>
-                <w:webHidden/>
-              </w:rPr>
-              <w:fldChar w:fldCharType="begin"/>
-            </w:r>
-            <w:r>
-              <w:rPr>
-                <w:webHidden/>
-              </w:rPr>
-              <w:instrText xml:space="preserve"> PAGEREF _Toc239409854 \h </w:instrText>
-            </w:r>
-            <w:r>
-              <w:rPr>
-                <w:webHidden/>
-              </w:rPr>
-            </w:r>
-            <w:r>
-              <w:rPr>
-                <w:webHidden/>
-              </w:rPr>
-              <w:fldChar w:fldCharType="separate"/>
-            </w:r>
-            <w:r>
-              <w:rPr>
-                <w:webHidden/>
-              </w:rPr>
-              <w:t>3</w:t>
-            </w:r>
-            <w:r>
-              <w:rPr>
-                <w:webHidden/>
-              </w:rPr>
-              <w:fldChar w:fldCharType="end"/>
-            </w:r>
-          </w:hyperlink>
-        </w:p>
-        <w:p>
-          <w:pPr>
-            <w:pStyle w:val="TOC1"/>
-            <w:rPr>
-              <w:rFonts w:eastAsiaTheme="minorEastAsia" w:cstheme="minorBidi"/>
-              <w:b w:val="0"/>
-              <w:bCs w:val="0"/>
-              <w:caps w:val="0"/>
-              <w:kern w:val="2"/>
-              <w:sz w:val="24"/>
-              <w:szCs w:val="24"/>
-              <w14:ligatures w14:val="standardContextual"/>
-            </w:rPr>
-          </w:pPr>
-          <w:hyperlink w:anchor="_Toc239409855" w:history="1">
-            <w:r>
-              <w:rPr>
-                <w:rStyle w:val="Hyperlink"/>
-              </w:rPr>
-              <w:t>6.</w:t>
-            </w:r>
-            <w:r>
-              <w:rPr>
-                <w:rFonts w:eastAsiaTheme="minorEastAsia" w:cstheme="minorBidi"/>
-                <w:b w:val="0"/>
-                <w:bCs w:val="0"/>
-                <w:caps w:val="0"/>
-                <w:kern w:val="2"/>
-                <w:sz w:val="24"/>
-                <w:szCs w:val="24"/>
-                <w14:ligatures w14:val="standardContextual"/>
-              </w:rPr>
-              <w:tab/>
-            </w:r>
-            <w:r>
-              <w:rPr>
-                <w:rStyle w:val="Hyperlink"/>
-              </w:rPr>
-              <w:t>Discussion</w:t>
-            </w:r>
-            <w:r>
-              <w:rPr>
-                <w:webHidden/>
-              </w:rPr>
-              <w:tab/>
-            </w:r>
-            <w:r>
-              <w:rPr>
-                <w:webHidden/>
-              </w:rPr>
-              <w:fldChar w:fldCharType="begin"/>
-            </w:r>
-            <w:r>
-              <w:rPr>
-                <w:webHidden/>
-              </w:rPr>
-              <w:instrText xml:space="preserve"> PAGEREF _Toc239409855 \h </w:instrText>
-            </w:r>
-            <w:r>
-              <w:rPr>
-                <w:webHidden/>
-              </w:rPr>
-            </w:r>
-            <w:r>
-              <w:rPr>
-                <w:webHidden/>
-              </w:rPr>
-              <w:fldChar w:fldCharType="separate"/>
-            </w:r>
-            <w:r>
-              <w:rPr>
-                <w:webHidden/>
-              </w:rPr>
-              <w:t>3</w:t>
-            </w:r>
-            <w:r>
-              <w:rPr>
-                <w:webHidden/>
-              </w:rPr>
-              <w:fldChar w:fldCharType="end"/>
-            </w:r>
-          </w:hyperlink>
-        </w:p>
-        <w:p>
-          <w:pPr>
-            <w:pStyle w:val="TOC1"/>
-            <w:rPr>
-              <w:rFonts w:eastAsiaTheme="minorEastAsia" w:cstheme="minorBidi"/>
-              <w:b w:val="0"/>
-              <w:bCs w:val="0"/>
-              <w:caps w:val="0"/>
-              <w:kern w:val="2"/>
-              <w:sz w:val="24"/>
-              <w:szCs w:val="24"/>
-              <w14:ligatures w14:val="standardContextual"/>
-            </w:rPr>
-          </w:pPr>
-          <w:hyperlink w:anchor="_Toc239409856" w:history="1">
-            <w:r>
-              <w:rPr>
-                <w:rStyle w:val="Hyperlink"/>
-              </w:rPr>
-              <w:t>7.</w:t>
-            </w:r>
-            <w:r>
-              <w:rPr>
-                <w:rFonts w:eastAsiaTheme="minorEastAsia" w:cstheme="minorBidi"/>
-                <w:b w:val="0"/>
-                <w:bCs w:val="0"/>
-                <w:caps w:val="0"/>
-                <w:kern w:val="2"/>
-                <w:sz w:val="24"/>
-                <w:szCs w:val="24"/>
-                <w14:ligatures w14:val="standardContextual"/>
-              </w:rPr>
-              <w:tab/>
-            </w:r>
-            <w:r>
-              <w:rPr>
-                <w:rStyle w:val="Hyperlink"/>
-              </w:rPr>
-              <w:t>Conclusions</w:t>
-            </w:r>
-            <w:r>
-              <w:rPr>
-                <w:webHidden/>
-              </w:rPr>
-              <w:tab/>
-            </w:r>
-            <w:r>
-              <w:rPr>
-                <w:webHidden/>
-              </w:rPr>
-              <w:fldChar w:fldCharType="begin"/>
-            </w:r>
-            <w:r>
-              <w:rPr>
-                <w:webHidden/>
-              </w:rPr>
-              <w:instrText xml:space="preserve"> PAGEREF _Toc239409856 \h </w:instrText>
-            </w:r>
-            <w:r>
-              <w:rPr>
-                <w:webHidden/>
-              </w:rPr>
-            </w:r>
-            <w:r>
-              <w:rPr>
-                <w:webHidden/>
-              </w:rPr>
-              <w:fldChar w:fldCharType="separate"/>
-            </w:r>
-            <w:r>
-              <w:rPr>
-                <w:webHidden/>
-              </w:rPr>
-              <w:t>3</w:t>
-            </w:r>
-            <w:r>
-              <w:rPr>
-                <w:webHidden/>
-              </w:rPr>
-              <w:fldChar w:fldCharType="end"/>
-            </w:r>
-          </w:hyperlink>
-        </w:p>
-        <w:p>
-          <w:pPr>
-            <w:sectPr>
-              <w:headerReference w:type="default" r:id="rId8"/>
-              <w:footerReference w:type="default" r:id="rId9"/>
-              <w:pgSz w:w="12240" w:h="15840"/>
-              <w:pgMar w:top="1080" w:right="1080" w:bottom="1080" w:left="1080" w:header="720" w:footer="720" w:gutter="0"/>
-              <w:pgNumType w:fmt="lowerRoman"/>
-              <w:cols w:space="720"/>
-              <w:docGrid w:linePitch="360"/>
-            </w:sectPr>
-          </w:pPr>
-          <w:r>
-            <w:rPr>
-              <w:b/>
-              <w:bCs/>
-              <w:noProof/>
-            </w:rPr>
-            <w:fldChar w:fldCharType="end"/>
-          </w:r>
-        </w:p>
-      </w:sdtContent>
-    </w:sdt>
     <w:p>
       <w:pPr>
         <w:pStyle w:val="Heading1"/>
+        <w:rPr>
+          <w:rFonts w:ascii="Times New Roman" w:hAnsi="Times New Roman" w:cs="Times New Roman"/>
+        </w:rPr>
       </w:pPr>
       <w:bookmarkStart w:id="0" w:name="_Toc239409850"/>
       <w:r>
+        <w:rPr>
+          <w:rFonts w:ascii="Times New Roman" w:hAnsi="Times New Roman" w:cs="Times New Roman"/>
+        </w:rPr>
         <w:lastRenderedPageBreak/>
         <w:t>Abstract</w:t>
       </w:r>
@@ -1154,8 +1147,14 @@
         <w:pStyle w:val="StyleJustified"/>
         <w:spacing w:after="120"/>
         <w:jc w:val="left"/>
+        <w:rPr>
+          <w:rFonts w:ascii="Times New Roman" w:hAnsi="Times New Roman"/>
+        </w:rPr>
       </w:pPr>
       <w:r>
+        <w:rPr>
+          <w:rFonts w:ascii="Times New Roman" w:hAnsi="Times New Roman"/>
+        </w:rPr>
         <w:t>This project analyzes fish population data and environmental attributes collected by Seth Callahan and expanded by Michael Beaty, adding long-term environmental records from government sources.</w:t>
       </w:r>
       <w:r>
@@ -1167,49 +1166,91 @@
         <w:t xml:space="preserve"> </w:t>
       </w:r>
       <w:r>
+        <w:rPr>
+          <w:rFonts w:ascii="Times New Roman" w:hAnsi="Times New Roman"/>
+        </w:rPr>
         <w:t>The goal is to identify ecological patterns, environmental drivers, and predictive relationships using engineering</w:t>
       </w:r>
       <w:r>
+        <w:rPr>
+          <w:rFonts w:ascii="Times New Roman" w:hAnsi="Times New Roman"/>
+        </w:rPr>
         <w:noBreakHyphen/>
         <w:t>based and machine</w:t>
       </w:r>
       <w:r>
+        <w:rPr>
+          <w:rFonts w:ascii="Times New Roman" w:hAnsi="Times New Roman"/>
+        </w:rPr>
         <w:noBreakHyphen/>
         <w:t>learning analysis. Early results show meaningful structure in both environmental variables and genus</w:t>
       </w:r>
       <w:r>
+        <w:rPr>
+          <w:rFonts w:ascii="Times New Roman" w:hAnsi="Times New Roman"/>
+        </w:rPr>
         <w:noBreakHyphen/>
         <w:t>level community composition. A decision tree classifier achieved an AUC of 0.7</w:t>
       </w:r>
       <w:r>
+        <w:rPr>
+          <w:rFonts w:ascii="Times New Roman" w:hAnsi="Times New Roman"/>
+        </w:rPr>
         <w:t>9</w:t>
       </w:r>
       <w:r>
+        <w:rPr>
+          <w:rFonts w:ascii="Times New Roman" w:hAnsi="Times New Roman"/>
+        </w:rPr>
         <w:t>, and UMAP revealed two well</w:t>
       </w:r>
       <w:r>
+        <w:rPr>
+          <w:rFonts w:ascii="Times New Roman" w:hAnsi="Times New Roman"/>
+        </w:rPr>
         <w:noBreakHyphen/>
         <w:t>separated clusters in both environmental and genus data</w:t>
       </w:r>
       <w:r>
+        <w:rPr>
+          <w:rFonts w:ascii="Times New Roman" w:hAnsi="Times New Roman"/>
+        </w:rPr>
         <w:t>,</w:t>
       </w:r>
       <w:r>
+        <w:rPr>
+          <w:rFonts w:ascii="Times New Roman" w:hAnsi="Times New Roman"/>
+        </w:rPr>
         <w:t xml:space="preserve"> with an overall prediction accuracy of 0.8</w:t>
       </w:r>
       <w:r>
+        <w:rPr>
+          <w:rFonts w:ascii="Times New Roman" w:hAnsi="Times New Roman"/>
+        </w:rPr>
         <w:t xml:space="preserve">3 </w:t>
       </w:r>
       <w:r>
+        <w:rPr>
+          <w:rFonts w:ascii="Times New Roman" w:hAnsi="Times New Roman"/>
+        </w:rPr>
         <w:t xml:space="preserve">when using environmental clusters to predict genus clusters. These findings indicate that environmental gradients contain </w:t>
       </w:r>
       <w:r>
+        <w:rPr>
+          <w:rFonts w:ascii="Times New Roman" w:hAnsi="Times New Roman"/>
+        </w:rPr>
         <w:t xml:space="preserve">a </w:t>
       </w:r>
       <w:r>
+        <w:rPr>
+          <w:rFonts w:ascii="Times New Roman" w:hAnsi="Times New Roman"/>
+        </w:rPr>
         <w:t>real signal relevant to fish community structure, supporting further analysis and development of predictive ecological models.</w:t>
       </w:r>
       <w:r>
+        <w:rPr>
+          <w:rFonts w:ascii="Times New Roman" w:hAnsi="Times New Roman"/>
+        </w:rPr>
         <w:t xml:space="preserve"> However, we must be mindful of the overlap between real significance and overfitting when combining ecology, machine learning, and limited data points.</w:t>
       </w:r>
     </w:p>
@@ -1219,16 +1260,47 @@
         <w:spacing w:after="120"/>
         <w:jc w:val="left"/>
         <w:rPr>
-          <w:szCs w:val="22"/>
+          <w:rFonts w:ascii="Times New Roman" w:hAnsi="Times New Roman"/>
         </w:rPr>
       </w:pPr>
     </w:p>
     <w:p>
       <w:pPr>
         <w:pStyle w:val="Heading1"/>
+        <w:rPr>
+          <w:rFonts w:ascii="Times New Roman" w:hAnsi="Times New Roman" w:cs="Times New Roman"/>
+        </w:rPr>
+      </w:pPr>
+      <w:r>
+        <w:rPr>
+          <w:rFonts w:ascii="Times New Roman" w:hAnsi="Times New Roman" w:cs="Times New Roman"/>
+        </w:rPr>
+        <w:t>Literature Review</w:t>
+      </w:r>
+    </w:p>
+    <w:p>
+      <w:pPr>
+        <w:pStyle w:val="StyleJustified"/>
+        <w:spacing w:after="120"/>
+        <w:jc w:val="left"/>
+        <w:rPr>
+          <w:rFonts w:ascii="Times New Roman" w:hAnsi="Times New Roman"/>
+          <w:szCs w:val="22"/>
+        </w:rPr>
+      </w:pPr>
+    </w:p>
+    <w:p>
+      <w:pPr>
+        <w:pStyle w:val="Heading1"/>
+        <w:rPr>
+          <w:rFonts w:ascii="Times New Roman" w:hAnsi="Times New Roman" w:cs="Times New Roman"/>
+        </w:rPr>
       </w:pPr>
       <w:bookmarkStart w:id="1" w:name="_Toc239409851"/>
       <w:r>
+        <w:rPr>
+          <w:rFonts w:ascii="Times New Roman" w:hAnsi="Times New Roman" w:cs="Times New Roman"/>
+        </w:rPr>
         <w:t>Introduction</w:t>
       </w:r>
       <w:bookmarkEnd w:id="1"/>
@@ -1238,21 +1310,27 @@
         <w:pStyle w:val="StyleJustified"/>
         <w:spacing w:after="120"/>
         <w:jc w:val="left"/>
+        <w:rPr>
+          <w:rFonts w:ascii="Times New Roman" w:hAnsi="Times New Roman"/>
+        </w:rPr>
       </w:pPr>
       <w:r>
-        <w:t>Freshwater fish communities respond strongly to environmental gradients such as flow regime, watershed size, substrate composition, and channel morphology, and understanding these relationships is important for identifying ecological change and supporting conservation.</w:t>
+        <w:rPr>
+          <w:rFonts w:ascii="Times New Roman" w:hAnsi="Times New Roman"/>
+        </w:rPr>
+        <w:t>Freshwater fish communities respond strongly to environmental gradients such as flow regime, watershed size, substrate composition, and channel morphology, and understanding these relationships is important for identifying ecological change and supporting conservation. This project investigates the relationship between environmental attributes and genus</w:t>
       </w:r>
       <w:r>
-        <w:t xml:space="preserve"> </w:t>
-      </w:r>
-      <w:r>
-        <w:t>This project investigates the relationship between environmental attributes and genus</w:t>
-      </w:r>
-      <w:r>
+        <w:rPr>
+          <w:rFonts w:ascii="Times New Roman" w:hAnsi="Times New Roman"/>
+        </w:rPr>
         <w:noBreakHyphen/>
         <w:t>level fish composition across sites in Northeast Texas and Southeast Oklahoma. The central research question is: Can environmental variables reliably predict fish community structure, and what environmental gradients best explain differences in genus diversity and composition?  This question matters because identifying environmental drivers of fish communities can help explain population decline, habitat sensitivity, and long</w:t>
       </w:r>
       <w:r>
+        <w:rPr>
+          <w:rFonts w:ascii="Times New Roman" w:hAnsi="Times New Roman"/>
+        </w:rPr>
         <w:noBreakHyphen/>
         <w:t>term ecological trends.</w:t>
       </w:r>
@@ -1260,14 +1338,23 @@
     <w:p>
       <w:pPr>
         <w:pStyle w:val="StyleJustified"/>
+        <w:rPr>
+          <w:rFonts w:ascii="Times New Roman" w:hAnsi="Times New Roman"/>
+        </w:rPr>
       </w:pPr>
     </w:p>
     <w:p>
       <w:pPr>
         <w:pStyle w:val="Heading1"/>
+        <w:rPr>
+          <w:rFonts w:ascii="Times New Roman" w:hAnsi="Times New Roman" w:cs="Times New Roman"/>
+        </w:rPr>
       </w:pPr>
       <w:bookmarkStart w:id="2" w:name="_Toc239409852"/>
       <w:r>
+        <w:rPr>
+          <w:rFonts w:ascii="Times New Roman" w:hAnsi="Times New Roman" w:cs="Times New Roman"/>
+        </w:rPr>
         <w:t>Background</w:t>
       </w:r>
       <w:bookmarkEnd w:id="2"/>
@@ -1276,26 +1363,25 @@
       <w:pPr>
         <w:pStyle w:val="StyleJustified"/>
         <w:rPr>
-          <w:rFonts w:asciiTheme="minorHAnsi" w:hAnsiTheme="minorHAnsi" w:cstheme="minorHAnsi"/>
+          <w:rFonts w:ascii="Times New Roman" w:hAnsi="Times New Roman"/>
         </w:rPr>
       </w:pPr>
       <w:r>
-        <w:t xml:space="preserve">Fish </w:t>
+        <w:rPr>
+          <w:rFonts w:ascii="Times New Roman" w:hAnsi="Times New Roman"/>
+        </w:rPr>
+        <w:t xml:space="preserve">Fish environments are </w:t>
       </w:r>
       <w:r>
-        <w:t>environments</w:t>
-      </w:r>
-      <w:r>
-        <w:t xml:space="preserve"> are </w:t>
-      </w:r>
-      <w:r>
-        <w:rPr>
+        <w:rPr>
+          <w:rFonts w:ascii="Times New Roman" w:hAnsi="Times New Roman"/>
           <w:szCs w:val="22"/>
         </w:rPr>
         <w:t>shaped by substrate composition, watershed size/ attributes, seasonal flow patterns, and hydrological stability. Prior studies emphasize the importance of flow variability and drainage area in determining species richness and diversity. This project builds on these ideas by incorporating both field</w:t>
       </w:r>
       <w:r>
         <w:rPr>
+          <w:rFonts w:ascii="Times New Roman" w:hAnsi="Times New Roman"/>
           <w:szCs w:val="22"/>
         </w:rPr>
         <w:noBreakHyphen/>
@@ -1303,53 +1389,45 @@
       </w:r>
       <w:r>
         <w:rPr>
+          <w:rFonts w:ascii="Times New Roman" w:hAnsi="Times New Roman"/>
           <w:szCs w:val="22"/>
         </w:rPr>
         <w:noBreakHyphen/>
-        <w:t xml:space="preserve">term </w:t>
+        <w:t>term hydrological records. While the simple question is which attributes keep fish communities alive in specific areas, we will use machine learning methods, such as decision trees, clustering, and dimensionality reduction, to reveal nonlinear ecological patterns that traditional statistics may miss. UMAP, NMDS, and supervised classification provide complementary</w:t>
       </w:r>
       <w:r>
         <w:rPr>
-          <w:rFonts w:asciiTheme="minorHAnsi" w:hAnsiTheme="minorHAnsi" w:cstheme="minorHAnsi"/>
-          <w:szCs w:val="22"/>
-        </w:rPr>
-        <w:t xml:space="preserve">hydrological records. While the simple question is </w:t>
-      </w:r>
-      <w:r>
-        <w:rPr>
-          <w:rFonts w:asciiTheme="minorHAnsi" w:hAnsiTheme="minorHAnsi" w:cstheme="minorHAnsi"/>
-          <w:szCs w:val="22"/>
-        </w:rPr>
-        <w:t>which attributes keep fish communities alive in specific areas, we will use</w:t>
-      </w:r>
-      <w:r>
-        <w:rPr>
-          <w:rFonts w:asciiTheme="minorHAnsi" w:hAnsiTheme="minorHAnsi" w:cstheme="minorHAnsi"/>
-          <w:szCs w:val="22"/>
-        </w:rPr>
-        <w:t xml:space="preserve"> machine learning methods, such as decision trees, clustering, and dimensionality reduction, to reveal nonlinear ecological patterns that traditional statistics may miss. UMAP, NMDS, and supervised classification provide complementary</w:t>
-      </w:r>
-      <w:r>
-        <w:rPr>
-          <w:rFonts w:asciiTheme="minorHAnsi" w:hAnsiTheme="minorHAnsi" w:cstheme="minorHAnsi"/>
+          <w:rFonts w:ascii="Times New Roman" w:hAnsi="Times New Roman"/>
         </w:rPr>
         <w:t xml:space="preserve"> views of environmental gradients and biological structure. Seasonal decomposition methods may further reveal long</w:t>
       </w:r>
       <w:r>
         <w:rPr>
-          <w:rFonts w:asciiTheme="minorHAnsi" w:hAnsiTheme="minorHAnsi" w:cstheme="minorHAnsi"/>
+          <w:rFonts w:ascii="Times New Roman" w:hAnsi="Times New Roman"/>
         </w:rPr>
         <w:noBreakHyphen/>
         <w:t>term hydrological trends relevant to fish populations.</w:t>
       </w:r>
     </w:p>
-    <w:p/>
     <w:p>
       <w:pPr>
+        <w:rPr>
+          <w:rFonts w:ascii="Times New Roman" w:hAnsi="Times New Roman"/>
+        </w:rPr>
+      </w:pPr>
+    </w:p>
+    <w:p>
+      <w:pPr>
         <w:pStyle w:val="Heading1"/>
+        <w:rPr>
+          <w:rFonts w:ascii="Times New Roman" w:hAnsi="Times New Roman" w:cs="Times New Roman"/>
+        </w:rPr>
       </w:pPr>
       <w:bookmarkStart w:id="3" w:name="_Toc239409853"/>
       <w:r>
+        <w:rPr>
+          <w:rFonts w:ascii="Times New Roman" w:hAnsi="Times New Roman" w:cs="Times New Roman"/>
+        </w:rPr>
         <w:t>Methodology</w:t>
       </w:r>
       <w:bookmarkEnd w:id="3"/>
@@ -1357,95 +1435,195 @@
     <w:p>
       <w:pPr>
         <w:pStyle w:val="StyleJustified"/>
+        <w:rPr>
+          <w:rFonts w:ascii="Times New Roman" w:hAnsi="Times New Roman"/>
+        </w:rPr>
       </w:pPr>
       <w:r>
+        <w:rPr>
+          <w:rFonts w:ascii="Times New Roman" w:hAnsi="Times New Roman"/>
+        </w:rPr>
         <w:t xml:space="preserve">The methodology includes gathering all data and appropriately splitting the data attributes based on the script/notebook goal and the algorithm being used. </w:t>
       </w:r>
       <w:r>
+        <w:rPr>
+          <w:rFonts w:ascii="Times New Roman" w:hAnsi="Times New Roman"/>
+        </w:rPr>
         <w:t>Fixing all scripts currently in the repo.</w:t>
       </w:r>
     </w:p>
     <w:p>
       <w:pPr>
         <w:pStyle w:val="StyleJustified"/>
+        <w:rPr>
+          <w:rFonts w:ascii="Times New Roman" w:hAnsi="Times New Roman"/>
+        </w:rPr>
       </w:pPr>
     </w:p>
     <w:p>
       <w:pPr>
         <w:pStyle w:val="StyleJustified"/>
+        <w:rPr>
+          <w:rFonts w:ascii="Times New Roman" w:hAnsi="Times New Roman"/>
+        </w:rPr>
       </w:pPr>
       <w:r>
+        <w:rPr>
+          <w:rFonts w:ascii="Times New Roman" w:hAnsi="Times New Roman"/>
+        </w:rPr>
         <w:t>NMDS get a significant score from this using SDL or normal time metrics for environmental data.</w:t>
       </w:r>
     </w:p>
     <w:p>
       <w:pPr>
         <w:pStyle w:val="StyleJustified"/>
+        <w:rPr>
+          <w:rFonts w:ascii="Times New Roman" w:hAnsi="Times New Roman"/>
+        </w:rPr>
       </w:pPr>
       <w:r>
+        <w:rPr>
+          <w:rFonts w:ascii="Times New Roman" w:hAnsi="Times New Roman"/>
+        </w:rPr>
         <w:t>Implement past scripts with SDL time metrics in case the seasonal amplitude has significant results with genus populations (UMAP, PCA, t-SNE).</w:t>
       </w:r>
     </w:p>
     <w:p>
       <w:pPr>
         <w:pStyle w:val="StyleJustified"/>
+        <w:rPr>
+          <w:rFonts w:ascii="Times New Roman" w:hAnsi="Times New Roman"/>
+        </w:rPr>
       </w:pPr>
     </w:p>
     <w:p>
       <w:pPr>
         <w:pStyle w:val="StyleJustified"/>
+        <w:rPr>
+          <w:rFonts w:ascii="Times New Roman" w:hAnsi="Times New Roman"/>
+        </w:rPr>
       </w:pPr>
       <w:r>
+        <w:rPr>
+          <w:rFonts w:ascii="Times New Roman" w:hAnsi="Times New Roman"/>
+        </w:rPr>
         <w:t>Clustering between TX and OK using results from previous scripts’ attributes with significant values (such as the ones from NMDS)</w:t>
       </w:r>
     </w:p>
     <w:p>
       <w:pPr>
         <w:pStyle w:val="StyleJustified"/>
+        <w:rPr>
+          <w:rFonts w:ascii="Times New Roman" w:hAnsi="Times New Roman"/>
+        </w:rPr>
       </w:pPr>
     </w:p>
     <w:p>
       <w:pPr>
         <w:pStyle w:val="Heading1"/>
+        <w:rPr>
+          <w:rFonts w:ascii="Times New Roman" w:hAnsi="Times New Roman" w:cs="Times New Roman"/>
+        </w:rPr>
       </w:pPr>
       <w:bookmarkStart w:id="4" w:name="_Toc239409854"/>
       <w:r>
+        <w:rPr>
+          <w:rFonts w:ascii="Times New Roman" w:hAnsi="Times New Roman" w:cs="Times New Roman"/>
+        </w:rPr>
         <w:t>Results</w:t>
       </w:r>
       <w:bookmarkEnd w:id="4"/>
     </w:p>
-    <w:p/>
     <w:p>
       <w:pPr>
+        <w:rPr>
+          <w:rFonts w:ascii="Times New Roman" w:hAnsi="Times New Roman"/>
+        </w:rPr>
+      </w:pPr>
+    </w:p>
+    <w:p>
+      <w:pPr>
         <w:pStyle w:val="Heading1"/>
+        <w:rPr>
+          <w:rFonts w:ascii="Times New Roman" w:hAnsi="Times New Roman" w:cs="Times New Roman"/>
+        </w:rPr>
       </w:pPr>
       <w:bookmarkStart w:id="5" w:name="_Toc239409855"/>
       <w:r>
+        <w:rPr>
+          <w:rFonts w:ascii="Times New Roman" w:hAnsi="Times New Roman" w:cs="Times New Roman"/>
+        </w:rPr>
+        <w:lastRenderedPageBreak/>
         <w:t>Discussion</w:t>
       </w:r>
       <w:bookmarkEnd w:id="5"/>
+      <w:r>
+        <w:rPr>
+          <w:rFonts w:ascii="Times New Roman" w:hAnsi="Times New Roman" w:cs="Times New Roman"/>
+        </w:rPr>
+        <w:t xml:space="preserve"> of Future Applications and Methodological Scalability</w:t>
+      </w:r>
     </w:p>
-    <w:p/>
     <w:p>
       <w:pPr>
+        <w:rPr>
+          <w:rFonts w:ascii="Times New Roman" w:hAnsi="Times New Roman"/>
+        </w:rPr>
+      </w:pPr>
+    </w:p>
+    <w:p>
+      <w:pPr>
         <w:pStyle w:val="Heading1"/>
+        <w:rPr>
+          <w:rFonts w:ascii="Times New Roman" w:hAnsi="Times New Roman" w:cs="Times New Roman"/>
+        </w:rPr>
       </w:pPr>
       <w:bookmarkStart w:id="6" w:name="_Toc239409856"/>
       <w:r>
+        <w:rPr>
+          <w:rFonts w:ascii="Times New Roman" w:hAnsi="Times New Roman" w:cs="Times New Roman"/>
+        </w:rPr>
         <w:t>Conclusions</w:t>
       </w:r>
       <w:bookmarkEnd w:id="6"/>
     </w:p>
     <w:p>
       <w:pPr>
-        <w:tabs>
-          <w:tab w:val="left" w:pos="440"/>
-        </w:tabs>
-      </w:pPr>
+        <w:rPr>
+          <w:rFonts w:ascii="Times New Roman" w:hAnsi="Times New Roman"/>
+        </w:rPr>
+      </w:pPr>
+    </w:p>
+    <w:p>
+      <w:pPr>
+        <w:rPr>
+          <w:rFonts w:ascii="Times New Roman" w:hAnsi="Times New Roman"/>
+        </w:rPr>
+      </w:pPr>
+    </w:p>
+    <w:p>
+      <w:pPr>
+        <w:pStyle w:val="Heading1"/>
+        <w:rPr>
+          <w:rFonts w:ascii="Times New Roman" w:hAnsi="Times New Roman" w:cs="Times New Roman"/>
+        </w:rPr>
+      </w:pPr>
+      <w:r>
+        <w:rPr>
+          <w:rFonts w:ascii="Times New Roman" w:hAnsi="Times New Roman" w:cs="Times New Roman"/>
+        </w:rPr>
+        <w:t>Works Cited</w:t>
+      </w:r>
     </w:p>
     <w:sectPr>
       <w:pgSz w:w="12240" w:h="15840"/>
       <w:pgMar w:top="1080" w:right="1080" w:bottom="1080" w:left="1080" w:header="720" w:footer="720" w:gutter="0"/>
+      <w:pgBorders w:offsetFrom="page">
+        <w:top w:val="single" w:sz="4" w:space="24" w:color="auto"/>
+        <w:left w:val="single" w:sz="4" w:space="24" w:color="auto"/>
+        <w:bottom w:val="single" w:sz="4" w:space="24" w:color="auto"/>
+        <w:right w:val="single" w:sz="4" w:space="24" w:color="auto"/>
+      </w:pgBorders>
       <w:cols w:space="720"/>
       <w:docGrid w:linePitch="360"/>
     </w:sectPr>
@@ -1454,7 +1632,7 @@
 </file>
 
 <file path=word/endnotes.xml><?xml version="1.0" encoding="utf-8"?>
-<w:endnotes xmlns:wpc="http://schemas.microsoft.com/office/word/2010/wordprocessingCanvas" xmlns:cx="http://schemas.microsoft.com/office/drawing/2014/chartex" xmlns:cx1="http://schemas.microsoft.com/office/drawing/2015/9/8/chartex" xmlns:cx2="http://schemas.microsoft.com/office/drawing/2015/10/21/chartex" xmlns:cx3="http://schemas.microsoft.com/office/drawing/2016/5/9/chartex" xmlns:cx4="http://schemas.microsoft.com/office/drawing/2016/5/10/chartex" xmlns:cx5="http://schemas.microsoft.com/office/drawing/2016/5/11/chartex" xmlns:cx6="http://schemas.microsoft.com/office/drawing/2016/5/12/chartex" xmlns:cx7="http://schemas.microsoft.com/office/drawing/2016/5/13/chartex" xmlns:cx8="http://schemas.microsoft.com/office/drawing/2016/5/14/chartex" xmlns:mc="http://schemas.openxmlformats.org/markup-compatibility/2006" xmlns:aink="http://schemas.microsoft.com/office/drawing/2016/ink" xmlns:am3d="http://schemas.microsoft.com/office/drawing/2017/model3d" xmlns:o="urn:schemas-microsoft-com:office:office" xmlns:oel="http://schemas.microsoft.com/office/2019/extlst" xmlns:r="http://schemas.openxmlformats.org/officeDocument/2006/relationships" xmlns:m="http://schemas.openxmlformats.org/officeDocument/2006/math" xmlns:v="urn:schemas-microsoft-com:vml" xmlns:wp14="http://schemas.microsoft.com/office/word/2010/wordprocessingDrawing" xmlns:wp="http://schemas.openxmlformats.org/drawingml/2006/wordprocessingDrawing" xmlns:w10="urn:schemas-microsoft-com:office:word" xmlns:w="http://schemas.openxmlformats.org/wordprocessingml/2006/main" xmlns:w14="http://schemas.microsoft.com/office/word/2010/wordml" xmlns:w15="http://schemas.microsoft.com/office/word/2012/wordml" xmlns:w16cei="http://schemas.microsoft.com/office/word/2026/wordml/cei" xmlns:w16cex="http://schemas.microsoft.com/office/word/2018/wordml/cex" xmlns:w16cid="http://schemas.microsoft.com/office/word/2016/wordml/cid" xmlns:w16="http://schemas.microsoft.com/office/word/2018/wordml" xmlns:w16du="http://schemas.microsoft.com/office/word/2023/wordml/word16du" xmlns:w16sdtdh="http://schemas.microsoft.com/office/word/2020/wordml/sdtdatahash" xmlns:w16sdtfl="http://schemas.microsoft.com/office/word/2024/wordml/sdtformatlock" xmlns:w16se="http://schemas.microsoft.com/office/word/2015/wordml/symex" xmlns:wpg="http://schemas.microsoft.com/office/word/2010/wordprocessingGroup" xmlns:wpi="http://schemas.microsoft.com/office/word/2010/wordprocessingInk" xmlns:wne="http://schemas.microsoft.com/office/word/2006/wordml" xmlns:wps="http://schemas.microsoft.com/office/word/2010/wordprocessingShape" mc:Ignorable="w14 w15 w16se w16cid w16 w16cex w16sdtdh w16sdtfl w16du wp14">
+<w:endnotes xmlns:wpc="http://schemas.microsoft.com/office/word/2010/wordprocessingCanvas" xmlns:cx="http://schemas.microsoft.com/office/drawing/2014/chartex" xmlns:cx1="http://schemas.microsoft.com/office/drawing/2015/9/8/chartex" xmlns:cx2="http://schemas.microsoft.com/office/drawing/2015/10/21/chartex" xmlns:cx3="http://schemas.microsoft.com/office/drawing/2016/5/9/chartex" xmlns:cx4="http://schemas.microsoft.com/office/drawing/2016/5/10/chartex" xmlns:cx5="http://schemas.microsoft.com/office/drawing/2016/5/11/chartex" xmlns:cx6="http://schemas.microsoft.com/office/drawing/2016/5/12/chartex" xmlns:cx7="http://schemas.microsoft.com/office/drawing/2016/5/13/chartex" xmlns:cx8="http://schemas.microsoft.com/office/drawing/2016/5/14/chartex" xmlns:mc="http://schemas.openxmlformats.org/markup-compatibility/2006" xmlns:aink="http://schemas.microsoft.com/office/drawing/2016/ink" xmlns:am3d="http://schemas.microsoft.com/office/drawing/2017/model3d" xmlns:o="urn:schemas-microsoft-com:office:office" xmlns:oel="http://schemas.microsoft.com/office/2019/extlst" xmlns:r="http://schemas.openxmlformats.org/officeDocument/2006/relationships" xmlns:m="http://schemas.openxmlformats.org/officeDocument/2006/math" xmlns:v="urn:schemas-microsoft-com:vml" xmlns:wp14="http://schemas.microsoft.com/office/word/2010/wordprocessingDrawing" xmlns:wp="http://schemas.openxmlformats.org/drawingml/2006/wordprocessingDrawing" xmlns:w10="urn:schemas-microsoft-com:office:word" xmlns:w="http://schemas.openxmlformats.org/wordprocessingml/2006/main" xmlns:w14="http://schemas.microsoft.com/office/word/2010/wordml" xmlns:w15="http://schemas.microsoft.com/office/word/2012/wordml" xmlns:w16cex="http://schemas.microsoft.com/office/word/2018/wordml/cex" xmlns:w16cid="http://schemas.microsoft.com/office/word/2016/wordml/cid" xmlns:w16="http://schemas.microsoft.com/office/word/2018/wordml" xmlns:w16du="http://schemas.microsoft.com/office/word/2023/wordml/word16du" xmlns:w16sdtdh="http://schemas.microsoft.com/office/word/2020/wordml/sdtdatahash" xmlns:w16sdtfl="http://schemas.microsoft.com/office/word/2024/wordml/sdtformatlock" xmlns:w16se="http://schemas.microsoft.com/office/word/2015/wordml/symex" xmlns:wpg="http://schemas.microsoft.com/office/word/2010/wordprocessingGroup" xmlns:wpi="http://schemas.microsoft.com/office/word/2010/wordprocessingInk" xmlns:wne="http://schemas.microsoft.com/office/word/2006/wordml" xmlns:wps="http://schemas.microsoft.com/office/word/2010/wordprocessingShape" mc:Ignorable="w14 w15 w16se w16cid w16 w16cex w16sdtdh w16sdtfl w16du wp14">
   <w:endnote w:type="separator" w:id="-1">
     <w:p>
       <w:r>
@@ -1473,7 +1651,97 @@
 </file>
 
 <file path=word/footer1.xml><?xml version="1.0" encoding="utf-8"?>
-<w:ftr xmlns:wpc="http://schemas.microsoft.com/office/word/2010/wordprocessingCanvas" xmlns:cx="http://schemas.microsoft.com/office/drawing/2014/chartex" xmlns:cx1="http://schemas.microsoft.com/office/drawing/2015/9/8/chartex" xmlns:cx2="http://schemas.microsoft.com/office/drawing/2015/10/21/chartex" xmlns:cx3="http://schemas.microsoft.com/office/drawing/2016/5/9/chartex" xmlns:cx4="http://schemas.microsoft.com/office/drawing/2016/5/10/chartex" xmlns:cx5="http://schemas.microsoft.com/office/drawing/2016/5/11/chartex" xmlns:cx6="http://schemas.microsoft.com/office/drawing/2016/5/12/chartex" xmlns:cx7="http://schemas.microsoft.com/office/drawing/2016/5/13/chartex" xmlns:cx8="http://schemas.microsoft.com/office/drawing/2016/5/14/chartex" xmlns:mc="http://schemas.openxmlformats.org/markup-compatibility/2006" xmlns:aink="http://schemas.microsoft.com/office/drawing/2016/ink" xmlns:am3d="http://schemas.microsoft.com/office/drawing/2017/model3d" xmlns:o="urn:schemas-microsoft-com:office:office" xmlns:oel="http://schemas.microsoft.com/office/2019/extlst" xmlns:r="http://schemas.openxmlformats.org/officeDocument/2006/relationships" xmlns:m="http://schemas.openxmlformats.org/officeDocument/2006/math" xmlns:v="urn:schemas-microsoft-com:vml" xmlns:wp14="http://schemas.microsoft.com/office/word/2010/wordprocessingDrawing" xmlns:wp="http://schemas.openxmlformats.org/drawingml/2006/wordprocessingDrawing" xmlns:w10="urn:schemas-microsoft-com:office:word" xmlns:w="http://schemas.openxmlformats.org/wordprocessingml/2006/main" xmlns:w14="http://schemas.microsoft.com/office/word/2010/wordml" xmlns:w15="http://schemas.microsoft.com/office/word/2012/wordml" xmlns:w16cei="http://schemas.microsoft.com/office/word/2026/wordml/cei" xmlns:w16cex="http://schemas.microsoft.com/office/word/2018/wordml/cex" xmlns:w16cid="http://schemas.microsoft.com/office/word/2016/wordml/cid" xmlns:w16="http://schemas.microsoft.com/office/word/2018/wordml" xmlns:w16du="http://schemas.microsoft.com/office/word/2023/wordml/word16du" xmlns:w16sdtdh="http://schemas.microsoft.com/office/word/2020/wordml/sdtdatahash" xmlns:w16sdtfl="http://schemas.microsoft.com/office/word/2024/wordml/sdtformatlock" xmlns:w16se="http://schemas.microsoft.com/office/word/2015/wordml/symex" xmlns:wpg="http://schemas.microsoft.com/office/word/2010/wordprocessingGroup" xmlns:wpi="http://schemas.microsoft.com/office/word/2010/wordprocessingInk" xmlns:wne="http://schemas.microsoft.com/office/word/2006/wordml" xmlns:wps="http://schemas.microsoft.com/office/word/2010/wordprocessingShape" mc:Ignorable="w14 w15 w16se w16cid w16 w16cex w16sdtdh w16sdtfl w16du wp14">
+<w:ftr xmlns:wpc="http://schemas.microsoft.com/office/word/2010/wordprocessingCanvas" xmlns:cx="http://schemas.microsoft.com/office/drawing/2014/chartex" xmlns:cx1="http://schemas.microsoft.com/office/drawing/2015/9/8/chartex" xmlns:cx2="http://schemas.microsoft.com/office/drawing/2015/10/21/chartex" xmlns:cx3="http://schemas.microsoft.com/office/drawing/2016/5/9/chartex" xmlns:cx4="http://schemas.microsoft.com/office/drawing/2016/5/10/chartex" xmlns:cx5="http://schemas.microsoft.com/office/drawing/2016/5/11/chartex" xmlns:cx6="http://schemas.microsoft.com/office/drawing/2016/5/12/chartex" xmlns:cx7="http://schemas.microsoft.com/office/drawing/2016/5/13/chartex" xmlns:cx8="http://schemas.microsoft.com/office/drawing/2016/5/14/chartex" xmlns:mc="http://schemas.openxmlformats.org/markup-compatibility/2006" xmlns:aink="http://schemas.microsoft.com/office/drawing/2016/ink" xmlns:am3d="http://schemas.microsoft.com/office/drawing/2017/model3d" xmlns:o="urn:schemas-microsoft-com:office:office" xmlns:oel="http://schemas.microsoft.com/office/2019/extlst" xmlns:r="http://schemas.openxmlformats.org/officeDocument/2006/relationships" xmlns:m="http://schemas.openxmlformats.org/officeDocument/2006/math" xmlns:v="urn:schemas-microsoft-com:vml" xmlns:wp14="http://schemas.microsoft.com/office/word/2010/wordprocessingDrawing" xmlns:wp="http://schemas.openxmlformats.org/drawingml/2006/wordprocessingDrawing" xmlns:w10="urn:schemas-microsoft-com:office:word" xmlns:w="http://schemas.openxmlformats.org/wordprocessingml/2006/main" xmlns:w14="http://schemas.microsoft.com/office/word/2010/wordml" xmlns:w15="http://schemas.microsoft.com/office/word/2012/wordml" xmlns:w16cex="http://schemas.microsoft.com/office/word/2018/wordml/cex" xmlns:w16cid="http://schemas.microsoft.com/office/word/2016/wordml/cid" xmlns:w16="http://schemas.microsoft.com/office/word/2018/wordml" xmlns:w16du="http://schemas.microsoft.com/office/word/2023/wordml/word16du" xmlns:w16sdtdh="http://schemas.microsoft.com/office/word/2020/wordml/sdtdatahash" xmlns:w16sdtfl="http://schemas.microsoft.com/office/word/2024/wordml/sdtformatlock" xmlns:w16se="http://schemas.microsoft.com/office/word/2015/wordml/symex" xmlns:wpg="http://schemas.microsoft.com/office/word/2010/wordprocessingGroup" xmlns:wpi="http://schemas.microsoft.com/office/word/2010/wordprocessingInk" xmlns:wne="http://schemas.microsoft.com/office/word/2006/wordml" xmlns:wps="http://schemas.microsoft.com/office/word/2010/wordprocessingShape" mc:Ignorable="w14 w15 w16se w16cid w16 w16cex w16sdtdh w16sdtfl w16du wp14">
+  <w:sdt>
+    <w:sdtPr>
+      <w:rPr>
+        <w:rFonts w:ascii="Times New Roman" w:hAnsi="Times New Roman"/>
+        <w:color w:val="00B0F0"/>
+      </w:rPr>
+      <w:id w:val="161823202"/>
+      <w:docPartObj>
+        <w:docPartGallery w:val="Page Numbers (Bottom of Page)"/>
+        <w:docPartUnique/>
+      </w:docPartObj>
+    </w:sdtPr>
+    <w:sdtEndPr>
+      <w:rPr>
+        <w:noProof/>
+      </w:rPr>
+    </w:sdtEndPr>
+    <w:sdtContent>
+      <w:p>
+        <w:pPr>
+          <w:pStyle w:val="Footer"/>
+          <w:jc w:val="center"/>
+          <w:rPr>
+            <w:rFonts w:ascii="Times New Roman" w:hAnsi="Times New Roman"/>
+            <w:color w:val="00B0F0"/>
+          </w:rPr>
+        </w:pPr>
+        <w:r>
+          <w:rPr>
+            <w:rFonts w:ascii="Times New Roman" w:hAnsi="Times New Roman"/>
+            <w:color w:val="0070C0"/>
+          </w:rPr>
+          <w:t xml:space="preserve">Page </w:t>
+        </w:r>
+        <w:r>
+          <w:rPr>
+            <w:rFonts w:ascii="Times New Roman" w:hAnsi="Times New Roman"/>
+            <w:color w:val="0070C0"/>
+          </w:rPr>
+          <w:fldChar w:fldCharType="begin"/>
+        </w:r>
+        <w:r>
+          <w:rPr>
+            <w:rFonts w:ascii="Times New Roman" w:hAnsi="Times New Roman"/>
+            <w:color w:val="0070C0"/>
+          </w:rPr>
+          <w:instrText xml:space="preserve"> PAGE   \* MERGEFORMAT </w:instrText>
+        </w:r>
+        <w:r>
+          <w:rPr>
+            <w:rFonts w:ascii="Times New Roman" w:hAnsi="Times New Roman"/>
+            <w:color w:val="0070C0"/>
+          </w:rPr>
+          <w:fldChar w:fldCharType="separate"/>
+        </w:r>
+        <w:r>
+          <w:rPr>
+            <w:rFonts w:ascii="Times New Roman" w:hAnsi="Times New Roman"/>
+            <w:noProof/>
+            <w:color w:val="0070C0"/>
+          </w:rPr>
+          <w:t>2</w:t>
+        </w:r>
+        <w:r>
+          <w:rPr>
+            <w:rFonts w:ascii="Times New Roman" w:hAnsi="Times New Roman"/>
+            <w:noProof/>
+            <w:color w:val="0070C0"/>
+          </w:rPr>
+          <w:fldChar w:fldCharType="end"/>
+        </w:r>
+        <w:r>
+          <w:rPr>
+            <w:rFonts w:ascii="Times New Roman" w:hAnsi="Times New Roman"/>
+            <w:noProof/>
+            <w:color w:val="0070C0"/>
+          </w:rPr>
+          <w:t xml:space="preserve"> of </w:t>
+        </w:r>
+        <w:r>
+          <w:rPr>
+            <w:rFonts w:ascii="Times New Roman" w:hAnsi="Times New Roman"/>
+            <w:noProof/>
+            <w:color w:val="0070C0"/>
+          </w:rPr>
+          <w:t>4</w:t>
+        </w:r>
+      </w:p>
+    </w:sdtContent>
+  </w:sdt>
   <w:p>
     <w:pPr>
       <w:pStyle w:val="Footer"/>
@@ -1483,48 +1751,12 @@
         <w:sz w:val="20"/>
       </w:rPr>
     </w:pPr>
-    <w:r>
-      <w:rPr>
-        <w:rStyle w:val="PageNumber"/>
-        <w:sz w:val="20"/>
-      </w:rPr>
-      <w:fldChar w:fldCharType="begin"/>
-    </w:r>
-    <w:r>
-      <w:rPr>
-        <w:rStyle w:val="PageNumber"/>
-        <w:sz w:val="20"/>
-      </w:rPr>
-      <w:instrText xml:space="preserve"> PAGE </w:instrText>
-    </w:r>
-    <w:r>
-      <w:rPr>
-        <w:rStyle w:val="PageNumber"/>
-        <w:sz w:val="20"/>
-      </w:rPr>
-      <w:fldChar w:fldCharType="separate"/>
-    </w:r>
-    <w:r>
-      <w:rPr>
-        <w:rStyle w:val="PageNumber"/>
-        <w:noProof/>
-        <w:sz w:val="20"/>
-      </w:rPr>
-      <w:t>3</w:t>
-    </w:r>
-    <w:r>
-      <w:rPr>
-        <w:rStyle w:val="PageNumber"/>
-        <w:sz w:val="20"/>
-      </w:rPr>
-      <w:fldChar w:fldCharType="end"/>
-    </w:r>
   </w:p>
 </w:ftr>
 </file>
 
 <file path=word/footnotes.xml><?xml version="1.0" encoding="utf-8"?>
-<w:footnotes xmlns:wpc="http://schemas.microsoft.com/office/word/2010/wordprocessingCanvas" xmlns:cx="http://schemas.microsoft.com/office/drawing/2014/chartex" xmlns:cx1="http://schemas.microsoft.com/office/drawing/2015/9/8/chartex" xmlns:cx2="http://schemas.microsoft.com/office/drawing/2015/10/21/chartex" xmlns:cx3="http://schemas.microsoft.com/office/drawing/2016/5/9/chartex" xmlns:cx4="http://schemas.microsoft.com/office/drawing/2016/5/10/chartex" xmlns:cx5="http://schemas.microsoft.com/office/drawing/2016/5/11/chartex" xmlns:cx6="http://schemas.microsoft.com/office/drawing/2016/5/12/chartex" xmlns:cx7="http://schemas.microsoft.com/office/drawing/2016/5/13/chartex" xmlns:cx8="http://schemas.microsoft.com/office/drawing/2016/5/14/chartex" xmlns:mc="http://schemas.openxmlformats.org/markup-compatibility/2006" xmlns:aink="http://schemas.microsoft.com/office/drawing/2016/ink" xmlns:am3d="http://schemas.microsoft.com/office/drawing/2017/model3d" xmlns:o="urn:schemas-microsoft-com:office:office" xmlns:oel="http://schemas.microsoft.com/office/2019/extlst" xmlns:r="http://schemas.openxmlformats.org/officeDocument/2006/relationships" xmlns:m="http://schemas.openxmlformats.org/officeDocument/2006/math" xmlns:v="urn:schemas-microsoft-com:vml" xmlns:wp14="http://schemas.microsoft.com/office/word/2010/wordprocessingDrawing" xmlns:wp="http://schemas.openxmlformats.org/drawingml/2006/wordprocessingDrawing" xmlns:w10="urn:schemas-microsoft-com:office:word" xmlns:w="http://schemas.openxmlformats.org/wordprocessingml/2006/main" xmlns:w14="http://schemas.microsoft.com/office/word/2010/wordml" xmlns:w15="http://schemas.microsoft.com/office/word/2012/wordml" xmlns:w16cei="http://schemas.microsoft.com/office/word/2026/wordml/cei" xmlns:w16cex="http://schemas.microsoft.com/office/word/2018/wordml/cex" xmlns:w16cid="http://schemas.microsoft.com/office/word/2016/wordml/cid" xmlns:w16="http://schemas.microsoft.com/office/word/2018/wordml" xmlns:w16du="http://schemas.microsoft.com/office/word/2023/wordml/word16du" xmlns:w16sdtdh="http://schemas.microsoft.com/office/word/2020/wordml/sdtdatahash" xmlns:w16sdtfl="http://schemas.microsoft.com/office/word/2024/wordml/sdtformatlock" xmlns:w16se="http://schemas.microsoft.com/office/word/2015/wordml/symex" xmlns:wpg="http://schemas.microsoft.com/office/word/2010/wordprocessingGroup" xmlns:wpi="http://schemas.microsoft.com/office/word/2010/wordprocessingInk" xmlns:wne="http://schemas.microsoft.com/office/word/2006/wordml" xmlns:wps="http://schemas.microsoft.com/office/word/2010/wordprocessingShape" mc:Ignorable="w14 w15 w16se w16cid w16 w16cex w16sdtdh w16sdtfl w16du wp14">
+<w:footnotes xmlns:wpc="http://schemas.microsoft.com/office/word/2010/wordprocessingCanvas" xmlns:cx="http://schemas.microsoft.com/office/drawing/2014/chartex" xmlns:cx1="http://schemas.microsoft.com/office/drawing/2015/9/8/chartex" xmlns:cx2="http://schemas.microsoft.com/office/drawing/2015/10/21/chartex" xmlns:cx3="http://schemas.microsoft.com/office/drawing/2016/5/9/chartex" xmlns:cx4="http://schemas.microsoft.com/office/drawing/2016/5/10/chartex" xmlns:cx5="http://schemas.microsoft.com/office/drawing/2016/5/11/chartex" xmlns:cx6="http://schemas.microsoft.com/office/drawing/2016/5/12/chartex" xmlns:cx7="http://schemas.microsoft.com/office/drawing/2016/5/13/chartex" xmlns:cx8="http://schemas.microsoft.com/office/drawing/2016/5/14/chartex" xmlns:mc="http://schemas.openxmlformats.org/markup-compatibility/2006" xmlns:aink="http://schemas.microsoft.com/office/drawing/2016/ink" xmlns:am3d="http://schemas.microsoft.com/office/drawing/2017/model3d" xmlns:o="urn:schemas-microsoft-com:office:office" xmlns:oel="http://schemas.microsoft.com/office/2019/extlst" xmlns:r="http://schemas.openxmlformats.org/officeDocument/2006/relationships" xmlns:m="http://schemas.openxmlformats.org/officeDocument/2006/math" xmlns:v="urn:schemas-microsoft-com:vml" xmlns:wp14="http://schemas.microsoft.com/office/word/2010/wordprocessingDrawing" xmlns:wp="http://schemas.openxmlformats.org/drawingml/2006/wordprocessingDrawing" xmlns:w10="urn:schemas-microsoft-com:office:word" xmlns:w="http://schemas.openxmlformats.org/wordprocessingml/2006/main" xmlns:w14="http://schemas.microsoft.com/office/word/2010/wordml" xmlns:w15="http://schemas.microsoft.com/office/word/2012/wordml" xmlns:w16cex="http://schemas.microsoft.com/office/word/2018/wordml/cex" xmlns:w16cid="http://schemas.microsoft.com/office/word/2016/wordml/cid" xmlns:w16="http://schemas.microsoft.com/office/word/2018/wordml" xmlns:w16du="http://schemas.microsoft.com/office/word/2023/wordml/word16du" xmlns:w16sdtdh="http://schemas.microsoft.com/office/word/2020/wordml/sdtdatahash" xmlns:w16sdtfl="http://schemas.microsoft.com/office/word/2024/wordml/sdtformatlock" xmlns:w16se="http://schemas.microsoft.com/office/word/2015/wordml/symex" xmlns:wpg="http://schemas.microsoft.com/office/word/2010/wordprocessingGroup" xmlns:wpi="http://schemas.microsoft.com/office/word/2010/wordprocessingInk" xmlns:wne="http://schemas.microsoft.com/office/word/2006/wordml" xmlns:wps="http://schemas.microsoft.com/office/word/2010/wordprocessingShape" mc:Ignorable="w14 w15 w16se w16cid w16 w16cex w16sdtdh w16sdtfl w16du wp14">
   <w:footnote w:type="separator" w:id="-1">
     <w:p>
       <w:r>
@@ -1543,7 +1775,7 @@
 </file>
 
 <file path=word/header1.xml><?xml version="1.0" encoding="utf-8"?>
-<w:hdr xmlns:wpc="http://schemas.microsoft.com/office/word/2010/wordprocessingCanvas" xmlns:cx="http://schemas.microsoft.com/office/drawing/2014/chartex" xmlns:cx1="http://schemas.microsoft.com/office/drawing/2015/9/8/chartex" xmlns:cx2="http://schemas.microsoft.com/office/drawing/2015/10/21/chartex" xmlns:cx3="http://schemas.microsoft.com/office/drawing/2016/5/9/chartex" xmlns:cx4="http://schemas.microsoft.com/office/drawing/2016/5/10/chartex" xmlns:cx5="http://schemas.microsoft.com/office/drawing/2016/5/11/chartex" xmlns:cx6="http://schemas.microsoft.com/office/drawing/2016/5/12/chartex" xmlns:cx7="http://schemas.microsoft.com/office/drawing/2016/5/13/chartex" xmlns:cx8="http://schemas.microsoft.com/office/drawing/2016/5/14/chartex" xmlns:mc="http://schemas.openxmlformats.org/markup-compatibility/2006" xmlns:aink="http://schemas.microsoft.com/office/drawing/2016/ink" xmlns:am3d="http://schemas.microsoft.com/office/drawing/2017/model3d" xmlns:o="urn:schemas-microsoft-com:office:office" xmlns:oel="http://schemas.microsoft.com/office/2019/extlst" xmlns:r="http://schemas.openxmlformats.org/officeDocument/2006/relationships" xmlns:m="http://schemas.openxmlformats.org/officeDocument/2006/math" xmlns:v="urn:schemas-microsoft-com:vml" xmlns:wp14="http://schemas.microsoft.com/office/word/2010/wordprocessingDrawing" xmlns:wp="http://schemas.openxmlformats.org/drawingml/2006/wordprocessingDrawing" xmlns:w10="urn:schemas-microsoft-com:office:word" xmlns:w="http://schemas.openxmlformats.org/wordprocessingml/2006/main" xmlns:w14="http://schemas.microsoft.com/office/word/2010/wordml" xmlns:w15="http://schemas.microsoft.com/office/word/2012/wordml" xmlns:w16cei="http://schemas.microsoft.com/office/word/2026/wordml/cei" xmlns:w16cex="http://schemas.microsoft.com/office/word/2018/wordml/cex" xmlns:w16cid="http://schemas.microsoft.com/office/word/2016/wordml/cid" xmlns:w16="http://schemas.microsoft.com/office/word/2018/wordml" xmlns:w16du="http://schemas.microsoft.com/office/word/2023/wordml/word16du" xmlns:w16sdtdh="http://schemas.microsoft.com/office/word/2020/wordml/sdtdatahash" xmlns:w16sdtfl="http://schemas.microsoft.com/office/word/2024/wordml/sdtformatlock" xmlns:w16se="http://schemas.microsoft.com/office/word/2015/wordml/symex" xmlns:wpg="http://schemas.microsoft.com/office/word/2010/wordprocessingGroup" xmlns:wpi="http://schemas.microsoft.com/office/word/2010/wordprocessingInk" xmlns:wne="http://schemas.microsoft.com/office/word/2006/wordml" xmlns:wps="http://schemas.microsoft.com/office/word/2010/wordprocessingShape" mc:Ignorable="w14 w15 w16se w16cid w16 w16cex w16sdtdh w16sdtfl w16du wp14">
+<w:hdr xmlns:wpc="http://schemas.microsoft.com/office/word/2010/wordprocessingCanvas" xmlns:cx="http://schemas.microsoft.com/office/drawing/2014/chartex" xmlns:cx1="http://schemas.microsoft.com/office/drawing/2015/9/8/chartex" xmlns:cx2="http://schemas.microsoft.com/office/drawing/2015/10/21/chartex" xmlns:cx3="http://schemas.microsoft.com/office/drawing/2016/5/9/chartex" xmlns:cx4="http://schemas.microsoft.com/office/drawing/2016/5/10/chartex" xmlns:cx5="http://schemas.microsoft.com/office/drawing/2016/5/11/chartex" xmlns:cx6="http://schemas.microsoft.com/office/drawing/2016/5/12/chartex" xmlns:cx7="http://schemas.microsoft.com/office/drawing/2016/5/13/chartex" xmlns:cx8="http://schemas.microsoft.com/office/drawing/2016/5/14/chartex" xmlns:mc="http://schemas.openxmlformats.org/markup-compatibility/2006" xmlns:aink="http://schemas.microsoft.com/office/drawing/2016/ink" xmlns:am3d="http://schemas.microsoft.com/office/drawing/2017/model3d" xmlns:o="urn:schemas-microsoft-com:office:office" xmlns:oel="http://schemas.microsoft.com/office/2019/extlst" xmlns:r="http://schemas.openxmlformats.org/officeDocument/2006/relationships" xmlns:m="http://schemas.openxmlformats.org/officeDocument/2006/math" xmlns:v="urn:schemas-microsoft-com:vml" xmlns:wp14="http://schemas.microsoft.com/office/word/2010/wordprocessingDrawing" xmlns:wp="http://schemas.openxmlformats.org/drawingml/2006/wordprocessingDrawing" xmlns:w10="urn:schemas-microsoft-com:office:word" xmlns:w="http://schemas.openxmlformats.org/wordprocessingml/2006/main" xmlns:w14="http://schemas.microsoft.com/office/word/2010/wordml" xmlns:w15="http://schemas.microsoft.com/office/word/2012/wordml" xmlns:w16cex="http://schemas.microsoft.com/office/word/2018/wordml/cex" xmlns:w16cid="http://schemas.microsoft.com/office/word/2016/wordml/cid" xmlns:w16="http://schemas.microsoft.com/office/word/2018/wordml" xmlns:w16du="http://schemas.microsoft.com/office/word/2023/wordml/word16du" xmlns:w16sdtdh="http://schemas.microsoft.com/office/word/2020/wordml/sdtdatahash" xmlns:w16sdtfl="http://schemas.microsoft.com/office/word/2024/wordml/sdtformatlock" xmlns:w16se="http://schemas.microsoft.com/office/word/2015/wordml/symex" xmlns:wpg="http://schemas.microsoft.com/office/word/2010/wordprocessingGroup" xmlns:wpi="http://schemas.microsoft.com/office/word/2010/wordprocessingInk" xmlns:wne="http://schemas.microsoft.com/office/word/2006/wordml" xmlns:wps="http://schemas.microsoft.com/office/word/2010/wordprocessingShape" mc:Ignorable="w14 w15 w16se w16cid w16 w16cex w16sdtdh w16sdtfl w16du wp14">
   <w:p>
     <w:pPr>
       <w:pStyle w:val="Header"/>
@@ -1554,7 +1786,7 @@
       </w:tabs>
       <w:jc w:val="right"/>
       <w:rPr>
-        <w:rFonts w:asciiTheme="minorHAnsi" w:hAnsiTheme="minorHAnsi" w:cstheme="minorHAnsi"/>
+        <w:rFonts w:ascii="Times New Roman" w:hAnsi="Times New Roman"/>
         <w:b w:val="0"/>
         <w:bCs/>
         <w:sz w:val="20"/>
@@ -1562,37 +1794,63 @@
     </w:pPr>
     <w:r>
       <w:rPr>
-        <w:rFonts w:asciiTheme="minorHAnsi" w:hAnsiTheme="minorHAnsi" w:cstheme="minorHAnsi"/>
+        <w:rFonts w:ascii="Times New Roman" w:hAnsi="Times New Roman"/>
         <w:b w:val="0"/>
         <w:bCs/>
         <w:sz w:val="20"/>
       </w:rPr>
       <w:tab/>
     </w:r>
-    <w:r>
-      <w:rPr>
-        <w:rFonts w:asciiTheme="minorHAnsi" w:hAnsiTheme="minorHAnsi" w:cstheme="minorHAnsi"/>
+  </w:p>
+  <w:p>
+    <w:pPr>
+      <w:pStyle w:val="Header"/>
+      <w:tabs>
+        <w:tab w:val="clear" w:pos="4320"/>
+        <w:tab w:val="clear" w:pos="8640"/>
+        <w:tab w:val="left" w:pos="6276"/>
+      </w:tabs>
+      <w:jc w:val="right"/>
+      <w:rPr>
+        <w:rFonts w:ascii="Times New Roman" w:hAnsi="Times New Roman"/>
         <w:b w:val="0"/>
         <w:bCs/>
         <w:sz w:val="20"/>
       </w:rPr>
+    </w:pPr>
+    <w:r>
+      <w:rPr>
+        <w:rFonts w:ascii="Times New Roman" w:hAnsi="Times New Roman"/>
+        <w:b w:val="0"/>
+        <w:bCs/>
+        <w:sz w:val="20"/>
+      </w:rPr>
       <w:t>EE 491</w:t>
     </w:r>
     <w:r>
       <w:rPr>
-        <w:rFonts w:asciiTheme="minorHAnsi" w:hAnsiTheme="minorHAnsi" w:cstheme="minorHAnsi"/>
+        <w:rFonts w:ascii="Times New Roman" w:hAnsi="Times New Roman"/>
         <w:b w:val="0"/>
         <w:bCs/>
         <w:sz w:val="20"/>
       </w:rPr>
-      <w:t xml:space="preserve"> Report Template</w:t>
+      <w:t xml:space="preserve"> </w:t>
+    </w:r>
+    <w:r>
+      <w:rPr>
+        <w:rFonts w:ascii="Times New Roman" w:hAnsi="Times New Roman"/>
+        <w:b w:val="0"/>
+        <w:bCs/>
+        <w:sz w:val="20"/>
+      </w:rPr>
+      <w:t>Honors Thesis Proposal</w:t>
     </w:r>
   </w:p>
 </w:hdr>
 </file>
 
 <file path=word/numbering.xml><?xml version="1.0" encoding="utf-8"?>
-<w:numbering xmlns:wpc="http://schemas.microsoft.com/office/word/2010/wordprocessingCanvas" xmlns:cx="http://schemas.microsoft.com/office/drawing/2014/chartex" xmlns:cx1="http://schemas.microsoft.com/office/drawing/2015/9/8/chartex" xmlns:cx2="http://schemas.microsoft.com/office/drawing/2015/10/21/chartex" xmlns:cx3="http://schemas.microsoft.com/office/drawing/2016/5/9/chartex" xmlns:cx4="http://schemas.microsoft.com/office/drawing/2016/5/10/chartex" xmlns:cx5="http://schemas.microsoft.com/office/drawing/2016/5/11/chartex" xmlns:cx6="http://schemas.microsoft.com/office/drawing/2016/5/12/chartex" xmlns:cx7="http://schemas.microsoft.com/office/drawing/2016/5/13/chartex" xmlns:cx8="http://schemas.microsoft.com/office/drawing/2016/5/14/chartex" xmlns:mc="http://schemas.openxmlformats.org/markup-compatibility/2006" xmlns:aink="http://schemas.microsoft.com/office/drawing/2016/ink" xmlns:am3d="http://schemas.microsoft.com/office/drawing/2017/model3d" xmlns:o="urn:schemas-microsoft-com:office:office" xmlns:oel="http://schemas.microsoft.com/office/2019/extlst" xmlns:r="http://schemas.openxmlformats.org/officeDocument/2006/relationships" xmlns:m="http://schemas.openxmlformats.org/officeDocument/2006/math" xmlns:v="urn:schemas-microsoft-com:vml" xmlns:wp14="http://schemas.microsoft.com/office/word/2010/wordprocessingDrawing" xmlns:wp="http://schemas.openxmlformats.org/drawingml/2006/wordprocessingDrawing" xmlns:w10="urn:schemas-microsoft-com:office:word" xmlns:w="http://schemas.openxmlformats.org/wordprocessingml/2006/main" xmlns:w14="http://schemas.microsoft.com/office/word/2010/wordml" xmlns:w15="http://schemas.microsoft.com/office/word/2012/wordml" xmlns:w16cei="http://schemas.microsoft.com/office/word/2026/wordml/cei" xmlns:w16cex="http://schemas.microsoft.com/office/word/2018/wordml/cex" xmlns:w16cid="http://schemas.microsoft.com/office/word/2016/wordml/cid" xmlns:w16="http://schemas.microsoft.com/office/word/2018/wordml" xmlns:w16du="http://schemas.microsoft.com/office/word/2023/wordml/word16du" xmlns:w16sdtdh="http://schemas.microsoft.com/office/word/2020/wordml/sdtdatahash" xmlns:w16sdtfl="http://schemas.microsoft.com/office/word/2024/wordml/sdtformatlock" xmlns:w16se="http://schemas.microsoft.com/office/word/2015/wordml/symex" xmlns:wpg="http://schemas.microsoft.com/office/word/2010/wordprocessingGroup" xmlns:wpi="http://schemas.microsoft.com/office/word/2010/wordprocessingInk" xmlns:wne="http://schemas.microsoft.com/office/word/2006/wordml" xmlns:wps="http://schemas.microsoft.com/office/word/2010/wordprocessingShape" mc:Ignorable="w14 w15 w16se w16cid w16 w16cex w16sdtdh w16sdtfl w16du wp14">
+<w:numbering xmlns:wpc="http://schemas.microsoft.com/office/word/2010/wordprocessingCanvas" xmlns:cx="http://schemas.microsoft.com/office/drawing/2014/chartex" xmlns:cx1="http://schemas.microsoft.com/office/drawing/2015/9/8/chartex" xmlns:cx2="http://schemas.microsoft.com/office/drawing/2015/10/21/chartex" xmlns:cx3="http://schemas.microsoft.com/office/drawing/2016/5/9/chartex" xmlns:cx4="http://schemas.microsoft.com/office/drawing/2016/5/10/chartex" xmlns:cx5="http://schemas.microsoft.com/office/drawing/2016/5/11/chartex" xmlns:cx6="http://schemas.microsoft.com/office/drawing/2016/5/12/chartex" xmlns:cx7="http://schemas.microsoft.com/office/drawing/2016/5/13/chartex" xmlns:cx8="http://schemas.microsoft.com/office/drawing/2016/5/14/chartex" xmlns:mc="http://schemas.openxmlformats.org/markup-compatibility/2006" xmlns:aink="http://schemas.microsoft.com/office/drawing/2016/ink" xmlns:am3d="http://schemas.microsoft.com/office/drawing/2017/model3d" xmlns:o="urn:schemas-microsoft-com:office:office" xmlns:oel="http://schemas.microsoft.com/office/2019/extlst" xmlns:r="http://schemas.openxmlformats.org/officeDocument/2006/relationships" xmlns:m="http://schemas.openxmlformats.org/officeDocument/2006/math" xmlns:v="urn:schemas-microsoft-com:vml" xmlns:wp14="http://schemas.microsoft.com/office/word/2010/wordprocessingDrawing" xmlns:wp="http://schemas.openxmlformats.org/drawingml/2006/wordprocessingDrawing" xmlns:w10="urn:schemas-microsoft-com:office:word" xmlns:w="http://schemas.openxmlformats.org/wordprocessingml/2006/main" xmlns:w14="http://schemas.microsoft.com/office/word/2010/wordml" xmlns:w15="http://schemas.microsoft.com/office/word/2012/wordml" xmlns:w16cex="http://schemas.microsoft.com/office/word/2018/wordml/cex" xmlns:w16cid="http://schemas.microsoft.com/office/word/2016/wordml/cid" xmlns:w16="http://schemas.microsoft.com/office/word/2018/wordml" xmlns:w16du="http://schemas.microsoft.com/office/word/2023/wordml/word16du" xmlns:w16sdtdh="http://schemas.microsoft.com/office/word/2020/wordml/sdtdatahash" xmlns:w16sdtfl="http://schemas.microsoft.com/office/word/2024/wordml/sdtformatlock" xmlns:w16se="http://schemas.microsoft.com/office/word/2015/wordml/symex" xmlns:wpg="http://schemas.microsoft.com/office/word/2010/wordprocessingGroup" xmlns:wpi="http://schemas.microsoft.com/office/word/2010/wordprocessingInk" xmlns:wne="http://schemas.microsoft.com/office/word/2006/wordml" xmlns:wps="http://schemas.microsoft.com/office/word/2010/wordprocessingShape" mc:Ignorable="w14 w15 w16se w16cid w16 w16cex w16sdtdh w16sdtfl w16du wp14">
   <w:abstractNum w:abstractNumId="0" w15:restartNumberingAfterBreak="0">
     <w:nsid w:val="00015051"/>
     <w:multiLevelType w:val="hybridMultilevel"/>
@@ -6236,6 +6494,8 @@
   <w:style w:type="paragraph" w:styleId="Footer">
     <w:name w:val="footer"/>
     <w:basedOn w:val="Normal"/>
+    <w:link w:val="FooterChar"/>
+    <w:uiPriority w:val="99"/>
     <w:rsid w:val="0033344E"/>
     <w:pPr>
       <w:tabs>
@@ -6353,14 +6613,14 @@
     <w:autoRedefine/>
     <w:uiPriority w:val="39"/>
     <w:qFormat/>
-    <w:rsid w:val="004E1F6D"/>
+    <w:rsid w:val="001B6766"/>
     <w:pPr>
       <w:tabs>
         <w:tab w:val="left" w:pos="440"/>
         <w:tab w:val="right" w:leader="dot" w:pos="10070"/>
       </w:tabs>
       <w:spacing w:before="120" w:after="120"/>
-      <w:jc w:val="left"/>
+      <w:jc w:val="center"/>
     </w:pPr>
     <w:rPr>
       <w:rFonts w:asciiTheme="minorHAnsi" w:hAnsiTheme="minorHAnsi"/>
@@ -6749,6 +7009,56 @@
       <w:vertAlign w:val="superscript"/>
     </w:rPr>
   </w:style>
+  <w:style w:type="paragraph" w:styleId="Title">
+    <w:name w:val="Title"/>
+    <w:basedOn w:val="Normal"/>
+    <w:next w:val="Normal"/>
+    <w:link w:val="TitleChar"/>
+    <w:uiPriority w:val="10"/>
+    <w:qFormat/>
+    <w:rsid w:val="001B6766"/>
+    <w:pPr>
+      <w:widowControl w:val="0"/>
+      <w:autoSpaceDE w:val="0"/>
+      <w:autoSpaceDN w:val="0"/>
+      <w:contextualSpacing/>
+      <w:jc w:val="left"/>
+    </w:pPr>
+    <w:rPr>
+      <w:rFonts w:asciiTheme="majorHAnsi" w:eastAsiaTheme="majorEastAsia" w:hAnsiTheme="majorHAnsi" w:cstheme="majorBidi"/>
+      <w:spacing w:val="-10"/>
+      <w:kern w:val="28"/>
+      <w:sz w:val="56"/>
+      <w:szCs w:val="56"/>
+      <w:lang w:bidi="en-US"/>
+    </w:rPr>
+  </w:style>
+  <w:style w:type="character" w:customStyle="1" w:styleId="TitleChar">
+    <w:name w:val="Title Char"/>
+    <w:basedOn w:val="DefaultParagraphFont"/>
+    <w:link w:val="Title"/>
+    <w:uiPriority w:val="10"/>
+    <w:rsid w:val="001B6766"/>
+    <w:rPr>
+      <w:rFonts w:asciiTheme="majorHAnsi" w:eastAsiaTheme="majorEastAsia" w:hAnsiTheme="majorHAnsi" w:cstheme="majorBidi"/>
+      <w:spacing w:val="-10"/>
+      <w:kern w:val="28"/>
+      <w:sz w:val="56"/>
+      <w:szCs w:val="56"/>
+      <w:lang w:bidi="en-US"/>
+    </w:rPr>
+  </w:style>
+  <w:style w:type="character" w:customStyle="1" w:styleId="FooterChar">
+    <w:name w:val="Footer Char"/>
+    <w:basedOn w:val="DefaultParagraphFont"/>
+    <w:link w:val="Footer"/>
+    <w:uiPriority w:val="99"/>
+    <w:rsid w:val="00EE6651"/>
+    <w:rPr>
+      <w:rFonts w:ascii="Calibri" w:hAnsi="Calibri"/>
+      <w:sz w:val="22"/>
+    </w:rPr>
+  </w:style>
 </w:styles>
 </file>
 

</xml_diff>

<commit_message>
updates to rough draft. incomplete but has future plans, will add onto and put methodology/results too soon.
</commit_message>
<xml_diff>
--- a/roughDraft_thesisProposal/ramirezXavier_draft_initialReport_ee491.docx
+++ b/roughDraft_thesisProposal/ramirezXavier_draft_initialReport_ee491.docx
@@ -18,7 +18,7 @@
       </w:pPr>
       <w:r>
         <w:drawing>
-          <wp:inline distT="0" distB="0" distL="0" distR="0" wp14:anchorId="479944FA" wp14:editId="6A7B22AD">
+          <wp:inline distT="0" distB="0" distL="0" distR="0" wp14:anchorId="479944FA" wp14:editId="5DE726CB">
             <wp:extent cx="1624330" cy="309880"/>
             <wp:effectExtent l="0" t="0" r="0" b="0"/>
             <wp:docPr id="1625552710" name="Picture 2" descr="East Texas A&amp;M University | College Works"/>
@@ -272,14 +272,7 @@
           <w:rFonts w:ascii="Times New Roman" w:hAnsi="Times New Roman"/>
           <w:sz w:val="28"/>
         </w:rPr>
-        <w:t>By</w:t>
-      </w:r>
-      <w:r>
-        <w:rPr>
-          <w:rFonts w:ascii="Times New Roman" w:hAnsi="Times New Roman"/>
-          <w:sz w:val="28"/>
-        </w:rPr>
-        <w:t>:</w:t>
+        <w:t>By:</w:t>
       </w:r>
       <w:proofErr w:type="gramEnd"/>
     </w:p>
@@ -418,7 +411,14 @@
           <w:pPr>
             <w:pStyle w:val="TOC1"/>
             <w:rPr>
-              <w:rFonts w:ascii="Times New Roman" w:hAnsi="Times New Roman"/>
+              <w:rFonts w:eastAsiaTheme="minorEastAsia" w:cstheme="minorBidi"/>
+              <w:b w:val="0"/>
+              <w:bCs w:val="0"/>
+              <w:caps w:val="0"/>
+              <w:kern w:val="2"/>
+              <w:sz w:val="24"/>
+              <w:szCs w:val="24"/>
+              <w14:ligatures w14:val="standardContextual"/>
             </w:rPr>
           </w:pPr>
           <w:r>
@@ -439,7 +439,7 @@
             </w:rPr>
             <w:fldChar w:fldCharType="separate"/>
           </w:r>
-          <w:hyperlink w:anchor="_Toc239409850" w:history="1">
+          <w:hyperlink w:anchor="_Toc240627976" w:history="1">
             <w:r>
               <w:rPr>
                 <w:rStyle w:val="Hyperlink"/>
@@ -449,7 +449,10 @@
             </w:r>
             <w:r>
               <w:rPr>
-                <w:rFonts w:ascii="Times New Roman" w:eastAsiaTheme="minorEastAsia" w:hAnsi="Times New Roman"/>
+                <w:rFonts w:eastAsiaTheme="minorEastAsia" w:cstheme="minorBidi"/>
+                <w:b w:val="0"/>
+                <w:bCs w:val="0"/>
+                <w:caps w:val="0"/>
                 <w:kern w:val="2"/>
                 <w:sz w:val="24"/>
                 <w:szCs w:val="24"/>
@@ -466,48 +469,41 @@
             </w:r>
             <w:r>
               <w:rPr>
-                <w:rFonts w:ascii="Times New Roman" w:hAnsi="Times New Roman"/>
                 <w:webHidden/>
               </w:rPr>
               <w:tab/>
             </w:r>
             <w:r>
               <w:rPr>
-                <w:rFonts w:ascii="Times New Roman" w:hAnsi="Times New Roman"/>
                 <w:webHidden/>
               </w:rPr>
               <w:fldChar w:fldCharType="begin"/>
             </w:r>
             <w:r>
               <w:rPr>
-                <w:rFonts w:ascii="Times New Roman" w:hAnsi="Times New Roman"/>
-                <w:webHidden/>
-              </w:rPr>
-              <w:instrText xml:space="preserve"> PAGEREF _Toc239409850 \h </w:instrText>
-            </w:r>
-            <w:r>
-              <w:rPr>
-                <w:rFonts w:ascii="Times New Roman" w:hAnsi="Times New Roman"/>
-                <w:webHidden/>
-              </w:rPr>
-            </w:r>
-            <w:r>
-              <w:rPr>
-                <w:rFonts w:ascii="Times New Roman" w:hAnsi="Times New Roman"/>
+                <w:webHidden/>
+              </w:rPr>
+              <w:instrText xml:space="preserve"> PAGEREF _Toc240627976 \h </w:instrText>
+            </w:r>
+            <w:r>
+              <w:rPr>
+                <w:webHidden/>
+              </w:rPr>
+            </w:r>
+            <w:r>
+              <w:rPr>
                 <w:webHidden/>
               </w:rPr>
               <w:fldChar w:fldCharType="separate"/>
             </w:r>
             <w:r>
               <w:rPr>
-                <w:rFonts w:ascii="Times New Roman" w:hAnsi="Times New Roman"/>
                 <w:webHidden/>
               </w:rPr>
               <w:t>3</w:t>
             </w:r>
             <w:r>
               <w:rPr>
-                <w:rFonts w:ascii="Times New Roman" w:hAnsi="Times New Roman"/>
                 <w:webHidden/>
               </w:rPr>
               <w:fldChar w:fldCharType="end"/>
@@ -518,14 +514,17 @@
           <w:pPr>
             <w:pStyle w:val="TOC1"/>
             <w:rPr>
-              <w:rFonts w:ascii="Times New Roman" w:eastAsiaTheme="minorEastAsia" w:hAnsi="Times New Roman"/>
+              <w:rFonts w:eastAsiaTheme="minorEastAsia" w:cstheme="minorBidi"/>
+              <w:b w:val="0"/>
+              <w:bCs w:val="0"/>
+              <w:caps w:val="0"/>
               <w:kern w:val="2"/>
               <w:sz w:val="24"/>
               <w:szCs w:val="24"/>
               <w14:ligatures w14:val="standardContextual"/>
             </w:rPr>
           </w:pPr>
-          <w:hyperlink w:anchor="_Toc239409851" w:history="1">
+          <w:hyperlink w:anchor="_Toc240627977" w:history="1">
             <w:r>
               <w:rPr>
                 <w:rStyle w:val="Hyperlink"/>
@@ -535,7 +534,10 @@
             </w:r>
             <w:r>
               <w:rPr>
-                <w:rFonts w:ascii="Times New Roman" w:eastAsiaTheme="minorEastAsia" w:hAnsi="Times New Roman"/>
+                <w:rFonts w:eastAsiaTheme="minorEastAsia" w:cstheme="minorBidi"/>
+                <w:b w:val="0"/>
+                <w:bCs w:val="0"/>
+                <w:caps w:val="0"/>
                 <w:kern w:val="2"/>
                 <w:sz w:val="24"/>
                 <w:szCs w:val="24"/>
@@ -548,52 +550,377 @@
                 <w:rStyle w:val="Hyperlink"/>
                 <w:rFonts w:ascii="Times New Roman" w:hAnsi="Times New Roman"/>
               </w:rPr>
-              <w:t>Introduction</w:t>
-            </w:r>
-            <w:r>
-              <w:rPr>
+              <w:t>Literature Review</w:t>
+            </w:r>
+            <w:r>
+              <w:rPr>
+                <w:webHidden/>
+              </w:rPr>
+              <w:tab/>
+            </w:r>
+            <w:r>
+              <w:rPr>
+                <w:webHidden/>
+              </w:rPr>
+              <w:fldChar w:fldCharType="begin"/>
+            </w:r>
+            <w:r>
+              <w:rPr>
+                <w:webHidden/>
+              </w:rPr>
+              <w:instrText xml:space="preserve"> PAGEREF _Toc240627977 \h </w:instrText>
+            </w:r>
+            <w:r>
+              <w:rPr>
+                <w:webHidden/>
+              </w:rPr>
+            </w:r>
+            <w:r>
+              <w:rPr>
+                <w:webHidden/>
+              </w:rPr>
+              <w:fldChar w:fldCharType="separate"/>
+            </w:r>
+            <w:r>
+              <w:rPr>
+                <w:webHidden/>
+              </w:rPr>
+              <w:t>3</w:t>
+            </w:r>
+            <w:r>
+              <w:rPr>
+                <w:webHidden/>
+              </w:rPr>
+              <w:fldChar w:fldCharType="end"/>
+            </w:r>
+          </w:hyperlink>
+        </w:p>
+        <w:p>
+          <w:pPr>
+            <w:pStyle w:val="TOC2"/>
+            <w:rPr>
+              <w:rFonts w:eastAsiaTheme="minorEastAsia" w:cstheme="minorBidi"/>
+              <w:smallCaps w:val="0"/>
+              <w:kern w:val="2"/>
+              <w:sz w:val="24"/>
+              <w:szCs w:val="24"/>
+              <w14:ligatures w14:val="standardContextual"/>
+            </w:rPr>
+          </w:pPr>
+          <w:hyperlink w:anchor="_Toc240627978" w:history="1">
+            <w:r>
+              <w:rPr>
+                <w:rStyle w:val="Hyperlink"/>
                 <w:rFonts w:ascii="Times New Roman" w:hAnsi="Times New Roman"/>
-                <w:webHidden/>
+              </w:rPr>
+              <w:t>2.1.</w:t>
+            </w:r>
+            <w:r>
+              <w:rPr>
+                <w:rFonts w:eastAsiaTheme="minorEastAsia" w:cstheme="minorBidi"/>
+                <w:smallCaps w:val="0"/>
+                <w:kern w:val="2"/>
+                <w:sz w:val="24"/>
+                <w:szCs w:val="24"/>
+                <w14:ligatures w14:val="standardContextual"/>
               </w:rPr>
               <w:tab/>
             </w:r>
             <w:r>
               <w:rPr>
+                <w:rStyle w:val="Hyperlink"/>
                 <w:rFonts w:ascii="Times New Roman" w:hAnsi="Times New Roman"/>
+              </w:rPr>
+              <w:t>Environmental Drivers of Freshwater Fish Communities</w:t>
+            </w:r>
+            <w:r>
+              <w:rPr>
+                <w:webHidden/>
+              </w:rPr>
+              <w:tab/>
+            </w:r>
+            <w:r>
+              <w:rPr>
                 <w:webHidden/>
               </w:rPr>
               <w:fldChar w:fldCharType="begin"/>
             </w:r>
             <w:r>
               <w:rPr>
+                <w:webHidden/>
+              </w:rPr>
+              <w:instrText xml:space="preserve"> PAGEREF _Toc240627978 \h </w:instrText>
+            </w:r>
+            <w:r>
+              <w:rPr>
+                <w:webHidden/>
+              </w:rPr>
+            </w:r>
+            <w:r>
+              <w:rPr>
+                <w:webHidden/>
+              </w:rPr>
+              <w:fldChar w:fldCharType="separate"/>
+            </w:r>
+            <w:r>
+              <w:rPr>
+                <w:webHidden/>
+              </w:rPr>
+              <w:t>3</w:t>
+            </w:r>
+            <w:r>
+              <w:rPr>
+                <w:webHidden/>
+              </w:rPr>
+              <w:fldChar w:fldCharType="end"/>
+            </w:r>
+          </w:hyperlink>
+        </w:p>
+        <w:p>
+          <w:pPr>
+            <w:pStyle w:val="TOC2"/>
+            <w:rPr>
+              <w:rFonts w:eastAsiaTheme="minorEastAsia" w:cstheme="minorBidi"/>
+              <w:smallCaps w:val="0"/>
+              <w:kern w:val="2"/>
+              <w:sz w:val="24"/>
+              <w:szCs w:val="24"/>
+              <w14:ligatures w14:val="standardContextual"/>
+            </w:rPr>
+          </w:pPr>
+          <w:hyperlink w:anchor="_Toc240627979" w:history="1">
+            <w:r>
+              <w:rPr>
+                <w:rStyle w:val="Hyperlink"/>
                 <w:rFonts w:ascii="Times New Roman" w:hAnsi="Times New Roman"/>
-                <w:webHidden/>
-              </w:rPr>
-              <w:instrText xml:space="preserve"> PAGEREF _Toc239409851 \h </w:instrText>
-            </w:r>
-            <w:r>
-              <w:rPr>
+              </w:rPr>
+              <w:t>2.2.</w:t>
+            </w:r>
+            <w:r>
+              <w:rPr>
+                <w:rFonts w:eastAsiaTheme="minorEastAsia" w:cstheme="minorBidi"/>
+                <w:smallCaps w:val="0"/>
+                <w:kern w:val="2"/>
+                <w:sz w:val="24"/>
+                <w:szCs w:val="24"/>
+                <w14:ligatures w14:val="standardContextual"/>
+              </w:rPr>
+              <w:tab/>
+            </w:r>
+            <w:r>
+              <w:rPr>
+                <w:rStyle w:val="Hyperlink"/>
                 <w:rFonts w:ascii="Times New Roman" w:hAnsi="Times New Roman"/>
-                <w:webHidden/>
-              </w:rPr>
-            </w:r>
-            <w:r>
-              <w:rPr>
+              </w:rPr>
+              <w:t>Seasonal Hydrological Variability and Ecological Response</w:t>
+            </w:r>
+            <w:r>
+              <w:rPr>
+                <w:webHidden/>
+              </w:rPr>
+              <w:tab/>
+            </w:r>
+            <w:r>
+              <w:rPr>
+                <w:webHidden/>
+              </w:rPr>
+              <w:fldChar w:fldCharType="begin"/>
+            </w:r>
+            <w:r>
+              <w:rPr>
+                <w:webHidden/>
+              </w:rPr>
+              <w:instrText xml:space="preserve"> PAGEREF _Toc240627979 \h </w:instrText>
+            </w:r>
+            <w:r>
+              <w:rPr>
+                <w:webHidden/>
+              </w:rPr>
+            </w:r>
+            <w:r>
+              <w:rPr>
+                <w:webHidden/>
+              </w:rPr>
+              <w:fldChar w:fldCharType="separate"/>
+            </w:r>
+            <w:r>
+              <w:rPr>
+                <w:webHidden/>
+              </w:rPr>
+              <w:t>3</w:t>
+            </w:r>
+            <w:r>
+              <w:rPr>
+                <w:webHidden/>
+              </w:rPr>
+              <w:fldChar w:fldCharType="end"/>
+            </w:r>
+          </w:hyperlink>
+        </w:p>
+        <w:p>
+          <w:pPr>
+            <w:pStyle w:val="TOC2"/>
+            <w:rPr>
+              <w:rFonts w:eastAsiaTheme="minorEastAsia" w:cstheme="minorBidi"/>
+              <w:smallCaps w:val="0"/>
+              <w:kern w:val="2"/>
+              <w:sz w:val="24"/>
+              <w:szCs w:val="24"/>
+              <w14:ligatures w14:val="standardContextual"/>
+            </w:rPr>
+          </w:pPr>
+          <w:hyperlink w:anchor="_Toc240627980" w:history="1">
+            <w:r>
+              <w:rPr>
+                <w:rStyle w:val="Hyperlink"/>
                 <w:rFonts w:ascii="Times New Roman" w:hAnsi="Times New Roman"/>
+              </w:rPr>
+              <w:t>2.3.</w:t>
+            </w:r>
+            <w:r>
+              <w:rPr>
+                <w:rFonts w:eastAsiaTheme="minorEastAsia" w:cstheme="minorBidi"/>
+                <w:smallCaps w:val="0"/>
+                <w:kern w:val="2"/>
+                <w:sz w:val="24"/>
+                <w:szCs w:val="24"/>
+                <w14:ligatures w14:val="standardContextual"/>
+              </w:rPr>
+              <w:tab/>
+            </w:r>
+            <w:r>
+              <w:rPr>
+                <w:rStyle w:val="Hyperlink"/>
+                <w:rFonts w:ascii="Times New Roman" w:hAnsi="Times New Roman"/>
+              </w:rPr>
+              <w:t>Machine Learning and Dimensionality Reduction in Hydro</w:t>
+            </w:r>
+            <w:r>
+              <w:rPr>
+                <w:rStyle w:val="Hyperlink"/>
+                <w:rFonts w:ascii="Times New Roman" w:hAnsi="Times New Roman"/>
+              </w:rPr>
+              <w:noBreakHyphen/>
+              <w:t>Ecology</w:t>
+            </w:r>
+            <w:r>
+              <w:rPr>
+                <w:webHidden/>
+              </w:rPr>
+              <w:tab/>
+            </w:r>
+            <w:r>
+              <w:rPr>
+                <w:webHidden/>
+              </w:rPr>
+              <w:fldChar w:fldCharType="begin"/>
+            </w:r>
+            <w:r>
+              <w:rPr>
+                <w:webHidden/>
+              </w:rPr>
+              <w:instrText xml:space="preserve"> PAGEREF _Toc240627980 \h </w:instrText>
+            </w:r>
+            <w:r>
+              <w:rPr>
+                <w:webHidden/>
+              </w:rPr>
+            </w:r>
+            <w:r>
+              <w:rPr>
                 <w:webHidden/>
               </w:rPr>
               <w:fldChar w:fldCharType="separate"/>
             </w:r>
             <w:r>
               <w:rPr>
+                <w:webHidden/>
+              </w:rPr>
+              <w:t>3</w:t>
+            </w:r>
+            <w:r>
+              <w:rPr>
+                <w:webHidden/>
+              </w:rPr>
+              <w:fldChar w:fldCharType="end"/>
+            </w:r>
+          </w:hyperlink>
+        </w:p>
+        <w:p>
+          <w:pPr>
+            <w:pStyle w:val="TOC2"/>
+            <w:rPr>
+              <w:rFonts w:eastAsiaTheme="minorEastAsia" w:cstheme="minorBidi"/>
+              <w:smallCaps w:val="0"/>
+              <w:kern w:val="2"/>
+              <w:sz w:val="24"/>
+              <w:szCs w:val="24"/>
+              <w14:ligatures w14:val="standardContextual"/>
+            </w:rPr>
+          </w:pPr>
+          <w:hyperlink w:anchor="_Toc240627981" w:history="1">
+            <w:r>
+              <w:rPr>
+                <w:rStyle w:val="Hyperlink"/>
                 <w:rFonts w:ascii="Times New Roman" w:hAnsi="Times New Roman"/>
+              </w:rPr>
+              <w:t>2.4.</w:t>
+            </w:r>
+            <w:r>
+              <w:rPr>
+                <w:rFonts w:eastAsiaTheme="minorEastAsia" w:cstheme="minorBidi"/>
+                <w:smallCaps w:val="0"/>
+                <w:kern w:val="2"/>
+                <w:sz w:val="24"/>
+                <w:szCs w:val="24"/>
+                <w14:ligatures w14:val="standardContextual"/>
+              </w:rPr>
+              <w:tab/>
+            </w:r>
+            <w:r>
+              <w:rPr>
+                <w:rStyle w:val="Hyperlink"/>
+                <w:rFonts w:ascii="Times New Roman" w:hAnsi="Times New Roman"/>
+              </w:rPr>
+              <w:t>Our Addition and Computational Integration</w:t>
+            </w:r>
+            <w:r>
+              <w:rPr>
+                <w:webHidden/>
+              </w:rPr>
+              <w:tab/>
+            </w:r>
+            <w:r>
+              <w:rPr>
+                <w:webHidden/>
+              </w:rPr>
+              <w:fldChar w:fldCharType="begin"/>
+            </w:r>
+            <w:r>
+              <w:rPr>
+                <w:webHidden/>
+              </w:rPr>
+              <w:instrText xml:space="preserve"> PAGEREF _Toc240627981 \h </w:instrText>
+            </w:r>
+            <w:r>
+              <w:rPr>
+                <w:webHidden/>
+              </w:rPr>
+            </w:r>
+            <w:r>
+              <w:rPr>
+                <w:webHidden/>
+              </w:rPr>
+              <w:fldChar w:fldCharType="separate"/>
+            </w:r>
+            <w:r>
+              <w:rPr>
                 <w:webHidden/>
               </w:rPr>
               <w:t>3</w:t>
             </w:r>
             <w:r>
               <w:rPr>
-                <w:rFonts w:ascii="Times New Roman" w:hAnsi="Times New Roman"/>
                 <w:webHidden/>
               </w:rPr>
               <w:fldChar w:fldCharType="end"/>
@@ -604,14 +931,17 @@
           <w:pPr>
             <w:pStyle w:val="TOC1"/>
             <w:rPr>
-              <w:rFonts w:ascii="Times New Roman" w:eastAsiaTheme="minorEastAsia" w:hAnsi="Times New Roman"/>
+              <w:rFonts w:eastAsiaTheme="minorEastAsia" w:cstheme="minorBidi"/>
+              <w:b w:val="0"/>
+              <w:bCs w:val="0"/>
+              <w:caps w:val="0"/>
               <w:kern w:val="2"/>
               <w:sz w:val="24"/>
               <w:szCs w:val="24"/>
               <w14:ligatures w14:val="standardContextual"/>
             </w:rPr>
           </w:pPr>
-          <w:hyperlink w:anchor="_Toc239409852" w:history="1">
+          <w:hyperlink w:anchor="_Toc240627982" w:history="1">
             <w:r>
               <w:rPr>
                 <w:rStyle w:val="Hyperlink"/>
@@ -621,7 +951,10 @@
             </w:r>
             <w:r>
               <w:rPr>
-                <w:rFonts w:ascii="Times New Roman" w:eastAsiaTheme="minorEastAsia" w:hAnsi="Times New Roman"/>
+                <w:rFonts w:eastAsiaTheme="minorEastAsia" w:cstheme="minorBidi"/>
+                <w:b w:val="0"/>
+                <w:bCs w:val="0"/>
+                <w:caps w:val="0"/>
                 <w:kern w:val="2"/>
                 <w:sz w:val="24"/>
                 <w:szCs w:val="24"/>
@@ -634,52 +967,45 @@
                 <w:rStyle w:val="Hyperlink"/>
                 <w:rFonts w:ascii="Times New Roman" w:hAnsi="Times New Roman"/>
               </w:rPr>
-              <w:t>Background</w:t>
-            </w:r>
-            <w:r>
-              <w:rPr>
-                <w:rFonts w:ascii="Times New Roman" w:hAnsi="Times New Roman"/>
+              <w:t>Introduction</w:t>
+            </w:r>
+            <w:r>
+              <w:rPr>
                 <w:webHidden/>
               </w:rPr>
               <w:tab/>
             </w:r>
             <w:r>
               <w:rPr>
-                <w:rFonts w:ascii="Times New Roman" w:hAnsi="Times New Roman"/>
                 <w:webHidden/>
               </w:rPr>
               <w:fldChar w:fldCharType="begin"/>
             </w:r>
             <w:r>
               <w:rPr>
-                <w:rFonts w:ascii="Times New Roman" w:hAnsi="Times New Roman"/>
-                <w:webHidden/>
-              </w:rPr>
-              <w:instrText xml:space="preserve"> PAGEREF _Toc239409852 \h </w:instrText>
-            </w:r>
-            <w:r>
-              <w:rPr>
-                <w:rFonts w:ascii="Times New Roman" w:hAnsi="Times New Roman"/>
-                <w:webHidden/>
-              </w:rPr>
-            </w:r>
-            <w:r>
-              <w:rPr>
-                <w:rFonts w:ascii="Times New Roman" w:hAnsi="Times New Roman"/>
+                <w:webHidden/>
+              </w:rPr>
+              <w:instrText xml:space="preserve"> PAGEREF _Toc240627982 \h </w:instrText>
+            </w:r>
+            <w:r>
+              <w:rPr>
+                <w:webHidden/>
+              </w:rPr>
+            </w:r>
+            <w:r>
+              <w:rPr>
                 <w:webHidden/>
               </w:rPr>
               <w:fldChar w:fldCharType="separate"/>
             </w:r>
             <w:r>
               <w:rPr>
-                <w:rFonts w:ascii="Times New Roman" w:hAnsi="Times New Roman"/>
-                <w:webHidden/>
-              </w:rPr>
-              <w:t>3</w:t>
-            </w:r>
-            <w:r>
-              <w:rPr>
-                <w:rFonts w:ascii="Times New Roman" w:hAnsi="Times New Roman"/>
+                <w:webHidden/>
+              </w:rPr>
+              <w:t>4</w:t>
+            </w:r>
+            <w:r>
+              <w:rPr>
                 <w:webHidden/>
               </w:rPr>
               <w:fldChar w:fldCharType="end"/>
@@ -690,14 +1016,17 @@
           <w:pPr>
             <w:pStyle w:val="TOC1"/>
             <w:rPr>
-              <w:rFonts w:ascii="Times New Roman" w:eastAsiaTheme="minorEastAsia" w:hAnsi="Times New Roman"/>
+              <w:rFonts w:eastAsiaTheme="minorEastAsia" w:cstheme="minorBidi"/>
+              <w:b w:val="0"/>
+              <w:bCs w:val="0"/>
+              <w:caps w:val="0"/>
               <w:kern w:val="2"/>
               <w:sz w:val="24"/>
               <w:szCs w:val="24"/>
               <w14:ligatures w14:val="standardContextual"/>
             </w:rPr>
           </w:pPr>
-          <w:hyperlink w:anchor="_Toc239409853" w:history="1">
+          <w:hyperlink w:anchor="_Toc240627983" w:history="1">
             <w:r>
               <w:rPr>
                 <w:rStyle w:val="Hyperlink"/>
@@ -707,7 +1036,10 @@
             </w:r>
             <w:r>
               <w:rPr>
-                <w:rFonts w:ascii="Times New Roman" w:eastAsiaTheme="minorEastAsia" w:hAnsi="Times New Roman"/>
+                <w:rFonts w:eastAsiaTheme="minorEastAsia" w:cstheme="minorBidi"/>
+                <w:b w:val="0"/>
+                <w:bCs w:val="0"/>
+                <w:caps w:val="0"/>
                 <w:kern w:val="2"/>
                 <w:sz w:val="24"/>
                 <w:szCs w:val="24"/>
@@ -720,52 +1052,45 @@
                 <w:rStyle w:val="Hyperlink"/>
                 <w:rFonts w:ascii="Times New Roman" w:hAnsi="Times New Roman"/>
               </w:rPr>
-              <w:t>Methodology</w:t>
-            </w:r>
-            <w:r>
-              <w:rPr>
-                <w:rFonts w:ascii="Times New Roman" w:hAnsi="Times New Roman"/>
+              <w:t>Background</w:t>
+            </w:r>
+            <w:r>
+              <w:rPr>
                 <w:webHidden/>
               </w:rPr>
               <w:tab/>
             </w:r>
             <w:r>
               <w:rPr>
-                <w:rFonts w:ascii="Times New Roman" w:hAnsi="Times New Roman"/>
                 <w:webHidden/>
               </w:rPr>
               <w:fldChar w:fldCharType="begin"/>
             </w:r>
             <w:r>
               <w:rPr>
-                <w:rFonts w:ascii="Times New Roman" w:hAnsi="Times New Roman"/>
-                <w:webHidden/>
-              </w:rPr>
-              <w:instrText xml:space="preserve"> PAGEREF _Toc239409853 \h </w:instrText>
-            </w:r>
-            <w:r>
-              <w:rPr>
-                <w:rFonts w:ascii="Times New Roman" w:hAnsi="Times New Roman"/>
-                <w:webHidden/>
-              </w:rPr>
-            </w:r>
-            <w:r>
-              <w:rPr>
-                <w:rFonts w:ascii="Times New Roman" w:hAnsi="Times New Roman"/>
+                <w:webHidden/>
+              </w:rPr>
+              <w:instrText xml:space="preserve"> PAGEREF _Toc240627983 \h </w:instrText>
+            </w:r>
+            <w:r>
+              <w:rPr>
+                <w:webHidden/>
+              </w:rPr>
+            </w:r>
+            <w:r>
+              <w:rPr>
                 <w:webHidden/>
               </w:rPr>
               <w:fldChar w:fldCharType="separate"/>
             </w:r>
             <w:r>
               <w:rPr>
-                <w:rFonts w:ascii="Times New Roman" w:hAnsi="Times New Roman"/>
-                <w:webHidden/>
-              </w:rPr>
-              <w:t>3</w:t>
-            </w:r>
-            <w:r>
-              <w:rPr>
-                <w:rFonts w:ascii="Times New Roman" w:hAnsi="Times New Roman"/>
+                <w:webHidden/>
+              </w:rPr>
+              <w:t>4</w:t>
+            </w:r>
+            <w:r>
+              <w:rPr>
                 <w:webHidden/>
               </w:rPr>
               <w:fldChar w:fldCharType="end"/>
@@ -776,14 +1101,17 @@
           <w:pPr>
             <w:pStyle w:val="TOC1"/>
             <w:rPr>
-              <w:rFonts w:ascii="Times New Roman" w:eastAsiaTheme="minorEastAsia" w:hAnsi="Times New Roman"/>
+              <w:rFonts w:eastAsiaTheme="minorEastAsia" w:cstheme="minorBidi"/>
+              <w:b w:val="0"/>
+              <w:bCs w:val="0"/>
+              <w:caps w:val="0"/>
               <w:kern w:val="2"/>
               <w:sz w:val="24"/>
               <w:szCs w:val="24"/>
               <w14:ligatures w14:val="standardContextual"/>
             </w:rPr>
           </w:pPr>
-          <w:hyperlink w:anchor="_Toc239409854" w:history="1">
+          <w:hyperlink w:anchor="_Toc240627984" w:history="1">
             <w:r>
               <w:rPr>
                 <w:rStyle w:val="Hyperlink"/>
@@ -793,7 +1121,10 @@
             </w:r>
             <w:r>
               <w:rPr>
-                <w:rFonts w:ascii="Times New Roman" w:eastAsiaTheme="minorEastAsia" w:hAnsi="Times New Roman"/>
+                <w:rFonts w:eastAsiaTheme="minorEastAsia" w:cstheme="minorBidi"/>
+                <w:b w:val="0"/>
+                <w:bCs w:val="0"/>
+                <w:caps w:val="0"/>
                 <w:kern w:val="2"/>
                 <w:sz w:val="24"/>
                 <w:szCs w:val="24"/>
@@ -806,52 +1137,45 @@
                 <w:rStyle w:val="Hyperlink"/>
                 <w:rFonts w:ascii="Times New Roman" w:hAnsi="Times New Roman"/>
               </w:rPr>
-              <w:t>Results</w:t>
-            </w:r>
-            <w:r>
-              <w:rPr>
-                <w:rFonts w:ascii="Times New Roman" w:hAnsi="Times New Roman"/>
+              <w:t>Methodology</w:t>
+            </w:r>
+            <w:r>
+              <w:rPr>
                 <w:webHidden/>
               </w:rPr>
               <w:tab/>
             </w:r>
             <w:r>
               <w:rPr>
-                <w:rFonts w:ascii="Times New Roman" w:hAnsi="Times New Roman"/>
                 <w:webHidden/>
               </w:rPr>
               <w:fldChar w:fldCharType="begin"/>
             </w:r>
             <w:r>
               <w:rPr>
-                <w:rFonts w:ascii="Times New Roman" w:hAnsi="Times New Roman"/>
-                <w:webHidden/>
-              </w:rPr>
-              <w:instrText xml:space="preserve"> PAGEREF _Toc239409854 \h </w:instrText>
-            </w:r>
-            <w:r>
-              <w:rPr>
-                <w:rFonts w:ascii="Times New Roman" w:hAnsi="Times New Roman"/>
-                <w:webHidden/>
-              </w:rPr>
-            </w:r>
-            <w:r>
-              <w:rPr>
-                <w:rFonts w:ascii="Times New Roman" w:hAnsi="Times New Roman"/>
+                <w:webHidden/>
+              </w:rPr>
+              <w:instrText xml:space="preserve"> PAGEREF _Toc240627984 \h </w:instrText>
+            </w:r>
+            <w:r>
+              <w:rPr>
+                <w:webHidden/>
+              </w:rPr>
+            </w:r>
+            <w:r>
+              <w:rPr>
                 <w:webHidden/>
               </w:rPr>
               <w:fldChar w:fldCharType="separate"/>
             </w:r>
             <w:r>
               <w:rPr>
-                <w:rFonts w:ascii="Times New Roman" w:hAnsi="Times New Roman"/>
-                <w:webHidden/>
-              </w:rPr>
-              <w:t>3</w:t>
-            </w:r>
-            <w:r>
-              <w:rPr>
-                <w:rFonts w:ascii="Times New Roman" w:hAnsi="Times New Roman"/>
+                <w:webHidden/>
+              </w:rPr>
+              <w:t>4</w:t>
+            </w:r>
+            <w:r>
+              <w:rPr>
                 <w:webHidden/>
               </w:rPr>
               <w:fldChar w:fldCharType="end"/>
@@ -862,14 +1186,17 @@
           <w:pPr>
             <w:pStyle w:val="TOC1"/>
             <w:rPr>
-              <w:rFonts w:ascii="Times New Roman" w:eastAsiaTheme="minorEastAsia" w:hAnsi="Times New Roman"/>
+              <w:rFonts w:eastAsiaTheme="minorEastAsia" w:cstheme="minorBidi"/>
+              <w:b w:val="0"/>
+              <w:bCs w:val="0"/>
+              <w:caps w:val="0"/>
               <w:kern w:val="2"/>
               <w:sz w:val="24"/>
               <w:szCs w:val="24"/>
               <w14:ligatures w14:val="standardContextual"/>
             </w:rPr>
           </w:pPr>
-          <w:hyperlink w:anchor="_Toc239409855" w:history="1">
+          <w:hyperlink w:anchor="_Toc240627985" w:history="1">
             <w:r>
               <w:rPr>
                 <w:rStyle w:val="Hyperlink"/>
@@ -879,7 +1206,10 @@
             </w:r>
             <w:r>
               <w:rPr>
-                <w:rFonts w:ascii="Times New Roman" w:eastAsiaTheme="minorEastAsia" w:hAnsi="Times New Roman"/>
+                <w:rFonts w:eastAsiaTheme="minorEastAsia" w:cstheme="minorBidi"/>
+                <w:b w:val="0"/>
+                <w:bCs w:val="0"/>
+                <w:caps w:val="0"/>
                 <w:kern w:val="2"/>
                 <w:sz w:val="24"/>
                 <w:szCs w:val="24"/>
@@ -892,52 +1222,45 @@
                 <w:rStyle w:val="Hyperlink"/>
                 <w:rFonts w:ascii="Times New Roman" w:hAnsi="Times New Roman"/>
               </w:rPr>
-              <w:t>Discussion</w:t>
-            </w:r>
-            <w:r>
-              <w:rPr>
-                <w:rFonts w:ascii="Times New Roman" w:hAnsi="Times New Roman"/>
+              <w:t>Results</w:t>
+            </w:r>
+            <w:r>
+              <w:rPr>
                 <w:webHidden/>
               </w:rPr>
               <w:tab/>
             </w:r>
             <w:r>
               <w:rPr>
-                <w:rFonts w:ascii="Times New Roman" w:hAnsi="Times New Roman"/>
                 <w:webHidden/>
               </w:rPr>
               <w:fldChar w:fldCharType="begin"/>
             </w:r>
             <w:r>
               <w:rPr>
-                <w:rFonts w:ascii="Times New Roman" w:hAnsi="Times New Roman"/>
-                <w:webHidden/>
-              </w:rPr>
-              <w:instrText xml:space="preserve"> PAGEREF _Toc239409855 \h </w:instrText>
-            </w:r>
-            <w:r>
-              <w:rPr>
-                <w:rFonts w:ascii="Times New Roman" w:hAnsi="Times New Roman"/>
-                <w:webHidden/>
-              </w:rPr>
-            </w:r>
-            <w:r>
-              <w:rPr>
-                <w:rFonts w:ascii="Times New Roman" w:hAnsi="Times New Roman"/>
+                <w:webHidden/>
+              </w:rPr>
+              <w:instrText xml:space="preserve"> PAGEREF _Toc240627985 \h </w:instrText>
+            </w:r>
+            <w:r>
+              <w:rPr>
+                <w:webHidden/>
+              </w:rPr>
+            </w:r>
+            <w:r>
+              <w:rPr>
                 <w:webHidden/>
               </w:rPr>
               <w:fldChar w:fldCharType="separate"/>
             </w:r>
             <w:r>
               <w:rPr>
-                <w:rFonts w:ascii="Times New Roman" w:hAnsi="Times New Roman"/>
-                <w:webHidden/>
-              </w:rPr>
-              <w:t>3</w:t>
-            </w:r>
-            <w:r>
-              <w:rPr>
-                <w:rFonts w:ascii="Times New Roman" w:hAnsi="Times New Roman"/>
+                <w:webHidden/>
+              </w:rPr>
+              <w:t>5</w:t>
+            </w:r>
+            <w:r>
+              <w:rPr>
                 <w:webHidden/>
               </w:rPr>
               <w:fldChar w:fldCharType="end"/>
@@ -948,10 +1271,17 @@
           <w:pPr>
             <w:pStyle w:val="TOC1"/>
             <w:rPr>
-              <w:rFonts w:ascii="Times New Roman" w:hAnsi="Times New Roman"/>
+              <w:rFonts w:eastAsiaTheme="minorEastAsia" w:cstheme="minorBidi"/>
+              <w:b w:val="0"/>
+              <w:bCs w:val="0"/>
+              <w:caps w:val="0"/>
+              <w:kern w:val="2"/>
+              <w:sz w:val="24"/>
+              <w:szCs w:val="24"/>
+              <w14:ligatures w14:val="standardContextual"/>
             </w:rPr>
           </w:pPr>
-          <w:hyperlink w:anchor="_Toc239409856" w:history="1">
+          <w:hyperlink w:anchor="_Toc240627986" w:history="1">
             <w:r>
               <w:rPr>
                 <w:rStyle w:val="Hyperlink"/>
@@ -961,7 +1291,10 @@
             </w:r>
             <w:r>
               <w:rPr>
-                <w:rFonts w:ascii="Times New Roman" w:eastAsiaTheme="minorEastAsia" w:hAnsi="Times New Roman"/>
+                <w:rFonts w:eastAsiaTheme="minorEastAsia" w:cstheme="minorBidi"/>
+                <w:b w:val="0"/>
+                <w:bCs w:val="0"/>
+                <w:caps w:val="0"/>
                 <w:kern w:val="2"/>
                 <w:sz w:val="24"/>
                 <w:szCs w:val="24"/>
@@ -974,52 +1307,620 @@
                 <w:rStyle w:val="Hyperlink"/>
                 <w:rFonts w:ascii="Times New Roman" w:hAnsi="Times New Roman"/>
               </w:rPr>
+              <w:t>Discussion of Future Applications and Methodological Scalability</w:t>
+            </w:r>
+            <w:r>
+              <w:rPr>
+                <w:webHidden/>
+              </w:rPr>
+              <w:tab/>
+            </w:r>
+            <w:r>
+              <w:rPr>
+                <w:webHidden/>
+              </w:rPr>
+              <w:fldChar w:fldCharType="begin"/>
+            </w:r>
+            <w:r>
+              <w:rPr>
+                <w:webHidden/>
+              </w:rPr>
+              <w:instrText xml:space="preserve"> PAGEREF _Toc240627986 \h </w:instrText>
+            </w:r>
+            <w:r>
+              <w:rPr>
+                <w:webHidden/>
+              </w:rPr>
+            </w:r>
+            <w:r>
+              <w:rPr>
+                <w:webHidden/>
+              </w:rPr>
+              <w:fldChar w:fldCharType="separate"/>
+            </w:r>
+            <w:r>
+              <w:rPr>
+                <w:webHidden/>
+              </w:rPr>
+              <w:t>5</w:t>
+            </w:r>
+            <w:r>
+              <w:rPr>
+                <w:webHidden/>
+              </w:rPr>
+              <w:fldChar w:fldCharType="end"/>
+            </w:r>
+          </w:hyperlink>
+        </w:p>
+        <w:p>
+          <w:pPr>
+            <w:pStyle w:val="TOC2"/>
+            <w:rPr>
+              <w:rFonts w:eastAsiaTheme="minorEastAsia" w:cstheme="minorBidi"/>
+              <w:smallCaps w:val="0"/>
+              <w:kern w:val="2"/>
+              <w:sz w:val="24"/>
+              <w:szCs w:val="24"/>
+              <w14:ligatures w14:val="standardContextual"/>
+            </w:rPr>
+          </w:pPr>
+          <w:hyperlink w:anchor="_Toc240627987" w:history="1">
+            <w:r>
+              <w:rPr>
+                <w:rStyle w:val="Hyperlink"/>
+                <w:rFonts w:ascii="Times New Roman" w:hAnsi="Times New Roman"/>
+              </w:rPr>
+              <w:t>7.1.</w:t>
+            </w:r>
+            <w:r>
+              <w:rPr>
+                <w:rFonts w:eastAsiaTheme="minorEastAsia" w:cstheme="minorBidi"/>
+                <w:smallCaps w:val="0"/>
+                <w:kern w:val="2"/>
+                <w:sz w:val="24"/>
+                <w:szCs w:val="24"/>
+                <w14:ligatures w14:val="standardContextual"/>
+              </w:rPr>
+              <w:tab/>
+            </w:r>
+            <w:r>
+              <w:rPr>
+                <w:rStyle w:val="Hyperlink"/>
+                <w:rFonts w:ascii="Times New Roman" w:hAnsi="Times New Roman"/>
+              </w:rPr>
+              <w:t>SDL Integration and Seasonal Amplitude Analysis</w:t>
+            </w:r>
+            <w:r>
+              <w:rPr>
+                <w:webHidden/>
+              </w:rPr>
+              <w:tab/>
+            </w:r>
+            <w:r>
+              <w:rPr>
+                <w:webHidden/>
+              </w:rPr>
+              <w:fldChar w:fldCharType="begin"/>
+            </w:r>
+            <w:r>
+              <w:rPr>
+                <w:webHidden/>
+              </w:rPr>
+              <w:instrText xml:space="preserve"> PAGEREF _Toc240627987 \h </w:instrText>
+            </w:r>
+            <w:r>
+              <w:rPr>
+                <w:webHidden/>
+              </w:rPr>
+            </w:r>
+            <w:r>
+              <w:rPr>
+                <w:webHidden/>
+              </w:rPr>
+              <w:fldChar w:fldCharType="separate"/>
+            </w:r>
+            <w:r>
+              <w:rPr>
+                <w:webHidden/>
+              </w:rPr>
+              <w:t>5</w:t>
+            </w:r>
+            <w:r>
+              <w:rPr>
+                <w:webHidden/>
+              </w:rPr>
+              <w:fldChar w:fldCharType="end"/>
+            </w:r>
+          </w:hyperlink>
+        </w:p>
+        <w:p>
+          <w:pPr>
+            <w:pStyle w:val="TOC2"/>
+            <w:rPr>
+              <w:rFonts w:eastAsiaTheme="minorEastAsia" w:cstheme="minorBidi"/>
+              <w:smallCaps w:val="0"/>
+              <w:kern w:val="2"/>
+              <w:sz w:val="24"/>
+              <w:szCs w:val="24"/>
+              <w14:ligatures w14:val="standardContextual"/>
+            </w:rPr>
+          </w:pPr>
+          <w:hyperlink w:anchor="_Toc240627988" w:history="1">
+            <w:r>
+              <w:rPr>
+                <w:rStyle w:val="Hyperlink"/>
+                <w:rFonts w:ascii="Times New Roman" w:hAnsi="Times New Roman"/>
+              </w:rPr>
+              <w:t>7.2.</w:t>
+            </w:r>
+            <w:r>
+              <w:rPr>
+                <w:rFonts w:eastAsiaTheme="minorEastAsia" w:cstheme="minorBidi"/>
+                <w:smallCaps w:val="0"/>
+                <w:kern w:val="2"/>
+                <w:sz w:val="24"/>
+                <w:szCs w:val="24"/>
+                <w14:ligatures w14:val="standardContextual"/>
+              </w:rPr>
+              <w:tab/>
+            </w:r>
+            <w:r>
+              <w:rPr>
+                <w:rStyle w:val="Hyperlink"/>
+                <w:rFonts w:ascii="Times New Roman" w:hAnsi="Times New Roman"/>
+              </w:rPr>
+              <w:t>Dimensionality Reduction with Seasonal Metrics</w:t>
+            </w:r>
+            <w:r>
+              <w:rPr>
+                <w:webHidden/>
+              </w:rPr>
+              <w:tab/>
+            </w:r>
+            <w:r>
+              <w:rPr>
+                <w:webHidden/>
+              </w:rPr>
+              <w:fldChar w:fldCharType="begin"/>
+            </w:r>
+            <w:r>
+              <w:rPr>
+                <w:webHidden/>
+              </w:rPr>
+              <w:instrText xml:space="preserve"> PAGEREF _Toc240627988 \h </w:instrText>
+            </w:r>
+            <w:r>
+              <w:rPr>
+                <w:webHidden/>
+              </w:rPr>
+            </w:r>
+            <w:r>
+              <w:rPr>
+                <w:webHidden/>
+              </w:rPr>
+              <w:fldChar w:fldCharType="separate"/>
+            </w:r>
+            <w:r>
+              <w:rPr>
+                <w:webHidden/>
+              </w:rPr>
+              <w:t>5</w:t>
+            </w:r>
+            <w:r>
+              <w:rPr>
+                <w:webHidden/>
+              </w:rPr>
+              <w:fldChar w:fldCharType="end"/>
+            </w:r>
+          </w:hyperlink>
+        </w:p>
+        <w:p>
+          <w:pPr>
+            <w:pStyle w:val="TOC2"/>
+            <w:rPr>
+              <w:rFonts w:eastAsiaTheme="minorEastAsia" w:cstheme="minorBidi"/>
+              <w:smallCaps w:val="0"/>
+              <w:kern w:val="2"/>
+              <w:sz w:val="24"/>
+              <w:szCs w:val="24"/>
+              <w14:ligatures w14:val="standardContextual"/>
+            </w:rPr>
+          </w:pPr>
+          <w:hyperlink w:anchor="_Toc240627989" w:history="1">
+            <w:r>
+              <w:rPr>
+                <w:rStyle w:val="Hyperlink"/>
+                <w:rFonts w:ascii="Times New Roman" w:hAnsi="Times New Roman"/>
+              </w:rPr>
+              <w:t>7.3.</w:t>
+            </w:r>
+            <w:r>
+              <w:rPr>
+                <w:rFonts w:eastAsiaTheme="minorEastAsia" w:cstheme="minorBidi"/>
+                <w:smallCaps w:val="0"/>
+                <w:kern w:val="2"/>
+                <w:sz w:val="24"/>
+                <w:szCs w:val="24"/>
+                <w14:ligatures w14:val="standardContextual"/>
+              </w:rPr>
+              <w:tab/>
+            </w:r>
+            <w:r>
+              <w:rPr>
+                <w:rStyle w:val="Hyperlink"/>
+                <w:rFonts w:ascii="Times New Roman" w:hAnsi="Times New Roman"/>
+              </w:rPr>
+              <w:t>UMAP + KMeans Seasonal Clustering</w:t>
+            </w:r>
+            <w:r>
+              <w:rPr>
+                <w:webHidden/>
+              </w:rPr>
+              <w:tab/>
+            </w:r>
+            <w:r>
+              <w:rPr>
+                <w:webHidden/>
+              </w:rPr>
+              <w:fldChar w:fldCharType="begin"/>
+            </w:r>
+            <w:r>
+              <w:rPr>
+                <w:webHidden/>
+              </w:rPr>
+              <w:instrText xml:space="preserve"> PAGEREF _Toc240627989 \h </w:instrText>
+            </w:r>
+            <w:r>
+              <w:rPr>
+                <w:webHidden/>
+              </w:rPr>
+            </w:r>
+            <w:r>
+              <w:rPr>
+                <w:webHidden/>
+              </w:rPr>
+              <w:fldChar w:fldCharType="separate"/>
+            </w:r>
+            <w:r>
+              <w:rPr>
+                <w:webHidden/>
+              </w:rPr>
+              <w:t>5</w:t>
+            </w:r>
+            <w:r>
+              <w:rPr>
+                <w:webHidden/>
+              </w:rPr>
+              <w:fldChar w:fldCharType="end"/>
+            </w:r>
+          </w:hyperlink>
+        </w:p>
+        <w:p>
+          <w:pPr>
+            <w:pStyle w:val="TOC2"/>
+            <w:rPr>
+              <w:rFonts w:eastAsiaTheme="minorEastAsia" w:cstheme="minorBidi"/>
+              <w:smallCaps w:val="0"/>
+              <w:kern w:val="2"/>
+              <w:sz w:val="24"/>
+              <w:szCs w:val="24"/>
+              <w14:ligatures w14:val="standardContextual"/>
+            </w:rPr>
+          </w:pPr>
+          <w:hyperlink w:anchor="_Toc240627990" w:history="1">
+            <w:r>
+              <w:rPr>
+                <w:rStyle w:val="Hyperlink"/>
+                <w:rFonts w:ascii="Times New Roman" w:hAnsi="Times New Roman"/>
+              </w:rPr>
+              <w:t>7.4.</w:t>
+            </w:r>
+            <w:r>
+              <w:rPr>
+                <w:rFonts w:eastAsiaTheme="minorEastAsia" w:cstheme="minorBidi"/>
+                <w:smallCaps w:val="0"/>
+                <w:kern w:val="2"/>
+                <w:sz w:val="24"/>
+                <w:szCs w:val="24"/>
+                <w14:ligatures w14:val="standardContextual"/>
+              </w:rPr>
+              <w:tab/>
+            </w:r>
+            <w:r>
+              <w:rPr>
+                <w:rStyle w:val="Hyperlink"/>
+                <w:rFonts w:ascii="Times New Roman" w:hAnsi="Times New Roman"/>
+              </w:rPr>
+              <w:t>Refinement of NMDS Arrows and Environmental Drivers</w:t>
+            </w:r>
+            <w:r>
+              <w:rPr>
+                <w:webHidden/>
+              </w:rPr>
+              <w:tab/>
+            </w:r>
+            <w:r>
+              <w:rPr>
+                <w:webHidden/>
+              </w:rPr>
+              <w:fldChar w:fldCharType="begin"/>
+            </w:r>
+            <w:r>
+              <w:rPr>
+                <w:webHidden/>
+              </w:rPr>
+              <w:instrText xml:space="preserve"> PAGEREF _Toc240627990 \h </w:instrText>
+            </w:r>
+            <w:r>
+              <w:rPr>
+                <w:webHidden/>
+              </w:rPr>
+            </w:r>
+            <w:r>
+              <w:rPr>
+                <w:webHidden/>
+              </w:rPr>
+              <w:fldChar w:fldCharType="separate"/>
+            </w:r>
+            <w:r>
+              <w:rPr>
+                <w:webHidden/>
+              </w:rPr>
+              <w:t>5</w:t>
+            </w:r>
+            <w:r>
+              <w:rPr>
+                <w:webHidden/>
+              </w:rPr>
+              <w:fldChar w:fldCharType="end"/>
+            </w:r>
+          </w:hyperlink>
+        </w:p>
+        <w:p>
+          <w:pPr>
+            <w:pStyle w:val="TOC2"/>
+            <w:rPr>
+              <w:rFonts w:eastAsiaTheme="minorEastAsia" w:cstheme="minorBidi"/>
+              <w:smallCaps w:val="0"/>
+              <w:kern w:val="2"/>
+              <w:sz w:val="24"/>
+              <w:szCs w:val="24"/>
+              <w14:ligatures w14:val="standardContextual"/>
+            </w:rPr>
+          </w:pPr>
+          <w:hyperlink w:anchor="_Toc240627991" w:history="1">
+            <w:r>
+              <w:rPr>
+                <w:rStyle w:val="Hyperlink"/>
+                <w:rFonts w:ascii="Times New Roman" w:hAnsi="Times New Roman"/>
+              </w:rPr>
+              <w:t>7.5.</w:t>
+            </w:r>
+            <w:r>
+              <w:rPr>
+                <w:rFonts w:eastAsiaTheme="minorEastAsia" w:cstheme="minorBidi"/>
+                <w:smallCaps w:val="0"/>
+                <w:kern w:val="2"/>
+                <w:sz w:val="24"/>
+                <w:szCs w:val="24"/>
+                <w14:ligatures w14:val="standardContextual"/>
+              </w:rPr>
+              <w:tab/>
+            </w:r>
+            <w:r>
+              <w:rPr>
+                <w:rStyle w:val="Hyperlink"/>
+                <w:rFonts w:ascii="Times New Roman" w:hAnsi="Times New Roman"/>
+              </w:rPr>
+              <w:t>Regression and Predictive Modeling</w:t>
+            </w:r>
+            <w:r>
+              <w:rPr>
+                <w:webHidden/>
+              </w:rPr>
+              <w:tab/>
+            </w:r>
+            <w:r>
+              <w:rPr>
+                <w:webHidden/>
+              </w:rPr>
+              <w:fldChar w:fldCharType="begin"/>
+            </w:r>
+            <w:r>
+              <w:rPr>
+                <w:webHidden/>
+              </w:rPr>
+              <w:instrText xml:space="preserve"> PAGEREF _Toc240627991 \h </w:instrText>
+            </w:r>
+            <w:r>
+              <w:rPr>
+                <w:webHidden/>
+              </w:rPr>
+            </w:r>
+            <w:r>
+              <w:rPr>
+                <w:webHidden/>
+              </w:rPr>
+              <w:fldChar w:fldCharType="separate"/>
+            </w:r>
+            <w:r>
+              <w:rPr>
+                <w:webHidden/>
+              </w:rPr>
+              <w:t>5</w:t>
+            </w:r>
+            <w:r>
+              <w:rPr>
+                <w:webHidden/>
+              </w:rPr>
+              <w:fldChar w:fldCharType="end"/>
+            </w:r>
+          </w:hyperlink>
+        </w:p>
+        <w:p>
+          <w:pPr>
+            <w:pStyle w:val="TOC1"/>
+            <w:rPr>
+              <w:rFonts w:eastAsiaTheme="minorEastAsia" w:cstheme="minorBidi"/>
+              <w:b w:val="0"/>
+              <w:bCs w:val="0"/>
+              <w:caps w:val="0"/>
+              <w:kern w:val="2"/>
+              <w:sz w:val="24"/>
+              <w:szCs w:val="24"/>
+              <w14:ligatures w14:val="standardContextual"/>
+            </w:rPr>
+          </w:pPr>
+          <w:hyperlink w:anchor="_Toc240627992" w:history="1">
+            <w:r>
+              <w:rPr>
+                <w:rStyle w:val="Hyperlink"/>
+                <w:rFonts w:ascii="Times New Roman" w:hAnsi="Times New Roman"/>
+              </w:rPr>
+              <w:t>8.</w:t>
+            </w:r>
+            <w:r>
+              <w:rPr>
+                <w:rFonts w:eastAsiaTheme="minorEastAsia" w:cstheme="minorBidi"/>
+                <w:b w:val="0"/>
+                <w:bCs w:val="0"/>
+                <w:caps w:val="0"/>
+                <w:kern w:val="2"/>
+                <w:sz w:val="24"/>
+                <w:szCs w:val="24"/>
+                <w14:ligatures w14:val="standardContextual"/>
+              </w:rPr>
+              <w:tab/>
+            </w:r>
+            <w:r>
+              <w:rPr>
+                <w:rStyle w:val="Hyperlink"/>
+                <w:rFonts w:ascii="Times New Roman" w:hAnsi="Times New Roman"/>
+              </w:rPr>
               <w:t>Conclusions</w:t>
             </w:r>
             <w:r>
               <w:rPr>
+                <w:webHidden/>
+              </w:rPr>
+              <w:tab/>
+            </w:r>
+            <w:r>
+              <w:rPr>
+                <w:webHidden/>
+              </w:rPr>
+              <w:fldChar w:fldCharType="begin"/>
+            </w:r>
+            <w:r>
+              <w:rPr>
+                <w:webHidden/>
+              </w:rPr>
+              <w:instrText xml:space="preserve"> PAGEREF _Toc240627992 \h </w:instrText>
+            </w:r>
+            <w:r>
+              <w:rPr>
+                <w:webHidden/>
+              </w:rPr>
+            </w:r>
+            <w:r>
+              <w:rPr>
+                <w:webHidden/>
+              </w:rPr>
+              <w:fldChar w:fldCharType="separate"/>
+            </w:r>
+            <w:r>
+              <w:rPr>
+                <w:webHidden/>
+              </w:rPr>
+              <w:t>6</w:t>
+            </w:r>
+            <w:r>
+              <w:rPr>
+                <w:webHidden/>
+              </w:rPr>
+              <w:fldChar w:fldCharType="end"/>
+            </w:r>
+          </w:hyperlink>
+        </w:p>
+        <w:p>
+          <w:pPr>
+            <w:pStyle w:val="TOC1"/>
+            <w:rPr>
+              <w:rFonts w:eastAsiaTheme="minorEastAsia" w:cstheme="minorBidi"/>
+              <w:b w:val="0"/>
+              <w:bCs w:val="0"/>
+              <w:caps w:val="0"/>
+              <w:kern w:val="2"/>
+              <w:sz w:val="24"/>
+              <w:szCs w:val="24"/>
+              <w14:ligatures w14:val="standardContextual"/>
+            </w:rPr>
+          </w:pPr>
+          <w:hyperlink w:anchor="_Toc240627993" w:history="1">
+            <w:r>
+              <w:rPr>
+                <w:rStyle w:val="Hyperlink"/>
                 <w:rFonts w:ascii="Times New Roman" w:hAnsi="Times New Roman"/>
-                <w:webHidden/>
+              </w:rPr>
+              <w:t>9.</w:t>
+            </w:r>
+            <w:r>
+              <w:rPr>
+                <w:rFonts w:eastAsiaTheme="minorEastAsia" w:cstheme="minorBidi"/>
+                <w:b w:val="0"/>
+                <w:bCs w:val="0"/>
+                <w:caps w:val="0"/>
+                <w:kern w:val="2"/>
+                <w:sz w:val="24"/>
+                <w:szCs w:val="24"/>
+                <w14:ligatures w14:val="standardContextual"/>
               </w:rPr>
               <w:tab/>
             </w:r>
             <w:r>
               <w:rPr>
+                <w:rStyle w:val="Hyperlink"/>
                 <w:rFonts w:ascii="Times New Roman" w:hAnsi="Times New Roman"/>
+              </w:rPr>
+              <w:t>Works Cited</w:t>
+            </w:r>
+            <w:r>
+              <w:rPr>
+                <w:webHidden/>
+              </w:rPr>
+              <w:tab/>
+            </w:r>
+            <w:r>
+              <w:rPr>
                 <w:webHidden/>
               </w:rPr>
               <w:fldChar w:fldCharType="begin"/>
             </w:r>
             <w:r>
               <w:rPr>
-                <w:rFonts w:ascii="Times New Roman" w:hAnsi="Times New Roman"/>
-                <w:webHidden/>
-              </w:rPr>
-              <w:instrText xml:space="preserve"> PAGEREF _Toc239409856 \h </w:instrText>
-            </w:r>
-            <w:r>
-              <w:rPr>
-                <w:rFonts w:ascii="Times New Roman" w:hAnsi="Times New Roman"/>
-                <w:webHidden/>
-              </w:rPr>
-            </w:r>
-            <w:r>
-              <w:rPr>
-                <w:rFonts w:ascii="Times New Roman" w:hAnsi="Times New Roman"/>
+                <w:webHidden/>
+              </w:rPr>
+              <w:instrText xml:space="preserve"> PAGEREF _Toc240627993 \h </w:instrText>
+            </w:r>
+            <w:r>
+              <w:rPr>
+                <w:webHidden/>
+              </w:rPr>
+            </w:r>
+            <w:r>
+              <w:rPr>
                 <w:webHidden/>
               </w:rPr>
               <w:fldChar w:fldCharType="separate"/>
             </w:r>
             <w:r>
               <w:rPr>
-                <w:rFonts w:ascii="Times New Roman" w:hAnsi="Times New Roman"/>
-                <w:webHidden/>
-              </w:rPr>
-              <w:t>3</w:t>
-            </w:r>
-            <w:r>
-              <w:rPr>
-                <w:rFonts w:ascii="Times New Roman" w:hAnsi="Times New Roman"/>
+                <w:webHidden/>
+              </w:rPr>
+              <w:t>6</w:t>
+            </w:r>
+            <w:r>
+              <w:rPr>
                 <w:webHidden/>
               </w:rPr>
               <w:fldChar w:fldCharType="end"/>
@@ -1047,67 +1948,11 @@
         </w:p>
       </w:sdtContent>
     </w:sdt>
-    <w:p/>
-    <w:p/>
-    <w:p/>
-    <w:p/>
-    <w:p/>
-    <w:p/>
-    <w:p/>
-    <w:p/>
-    <w:p/>
-    <w:p/>
-    <w:p/>
-    <w:p/>
-    <w:p/>
-    <w:p/>
-    <w:p/>
-    <w:p/>
-    <w:p/>
-    <w:p/>
-    <w:p/>
-    <w:p/>
-    <w:p/>
-    <w:p/>
-    <w:p/>
-    <w:p/>
-    <w:p/>
-    <w:p/>
-    <w:p/>
-    <w:p/>
-    <w:p/>
-    <w:p/>
-    <w:p/>
-    <w:p/>
-    <w:p/>
     <w:p>
       <w:pPr>
         <w:rPr>
           <w:rFonts w:ascii="Times New Roman" w:hAnsi="Times New Roman"/>
-          <w:b/>
-          <w:bCs/>
-          <w:noProof/>
-        </w:rPr>
-      </w:pPr>
-    </w:p>
-    <w:p>
-      <w:pPr>
-        <w:tabs>
-          <w:tab w:val="left" w:pos="5921"/>
-        </w:tabs>
-        <w:rPr>
-          <w:rFonts w:ascii="Times New Roman" w:hAnsi="Times New Roman"/>
-        </w:rPr>
-      </w:pPr>
-      <w:r>
-        <w:rPr>
-          <w:rFonts w:ascii="Times New Roman" w:hAnsi="Times New Roman"/>
-        </w:rPr>
-        <w:tab/>
-      </w:r>
-    </w:p>
-    <w:p>
-      <w:pPr>
+        </w:rPr>
         <w:sectPr>
           <w:headerReference w:type="default" r:id="rId9"/>
           <w:footerReference w:type="default" r:id="rId10"/>
@@ -1132,7 +1977,7 @@
           <w:rFonts w:ascii="Times New Roman" w:hAnsi="Times New Roman" w:cs="Times New Roman"/>
         </w:rPr>
       </w:pPr>
-      <w:bookmarkStart w:id="0" w:name="_Toc239409850"/>
+      <w:bookmarkStart w:id="0" w:name="_Toc240627976"/>
       <w:r>
         <w:rPr>
           <w:rFonts w:ascii="Times New Roman" w:hAnsi="Times New Roman" w:cs="Times New Roman"/>
@@ -1145,475 +1990,1280 @@
     <w:p>
       <w:pPr>
         <w:pStyle w:val="StyleJustified"/>
-        <w:spacing w:after="120"/>
+        <w:spacing w:afterLines="120" w:after="288"/>
         <w:jc w:val="left"/>
         <w:rPr>
           <w:rFonts w:ascii="Times New Roman" w:hAnsi="Times New Roman"/>
-        </w:rPr>
-      </w:pPr>
-      <w:r>
-        <w:rPr>
-          <w:rFonts w:ascii="Times New Roman" w:hAnsi="Times New Roman"/>
-        </w:rPr>
-        <w:t>This project analyzes fish population data and environmental attributes collected by Seth Callahan and expanded by Michael Beaty, adding long-term environmental records from government sources.</w:t>
-      </w:r>
-      <w:r>
-        <w:rPr>
-          <w:rFonts w:ascii="Times New Roman" w:hAnsi="Times New Roman"/>
-          <w:sz w:val="24"/>
-          <w:szCs w:val="24"/>
-        </w:rPr>
-        <w:t xml:space="preserve"> </w:t>
-      </w:r>
-      <w:r>
-        <w:rPr>
-          <w:rFonts w:ascii="Times New Roman" w:hAnsi="Times New Roman"/>
-        </w:rPr>
-        <w:t>The goal is to identify ecological patterns, environmental drivers, and predictive relationships using engineering</w:t>
-      </w:r>
-      <w:r>
-        <w:rPr>
-          <w:rFonts w:ascii="Times New Roman" w:hAnsi="Times New Roman"/>
+          <w:sz w:val="24"/>
+          <w:szCs w:val="24"/>
+        </w:rPr>
+      </w:pPr>
+      <w:r>
+        <w:rPr>
+          <w:rFonts w:ascii="Times New Roman" w:hAnsi="Times New Roman"/>
+          <w:sz w:val="24"/>
+          <w:szCs w:val="24"/>
+        </w:rPr>
+        <w:t>This project analyzes fish population data and environmental attributes collected by Seth Callahan and expanded by Michael Beaty, incorporating long</w:t>
+      </w:r>
+      <w:r>
+        <w:rPr>
+          <w:rFonts w:ascii="Times New Roman" w:hAnsi="Times New Roman"/>
+          <w:sz w:val="24"/>
+          <w:szCs w:val="24"/>
         </w:rPr>
         <w:noBreakHyphen/>
-        <w:t>based and machine</w:t>
-      </w:r>
-      <w:r>
-        <w:rPr>
-          <w:rFonts w:ascii="Times New Roman" w:hAnsi="Times New Roman"/>
+        <w:t xml:space="preserve">term hydrological records from government sources. The goal is to identify ecological patterns, environmental drivers, and predictive relationships using dimensionality reduction, clustering, and machine learning. Early </w:t>
+      </w:r>
+      <w:proofErr w:type="gramStart"/>
+      <w:r>
+        <w:rPr>
+          <w:rFonts w:ascii="Times New Roman" w:hAnsi="Times New Roman"/>
+          <w:sz w:val="24"/>
+          <w:szCs w:val="24"/>
+        </w:rPr>
+        <w:t>exploratory</w:t>
+      </w:r>
+      <w:proofErr w:type="gramEnd"/>
+      <w:r>
+        <w:rPr>
+          <w:rFonts w:ascii="Times New Roman" w:hAnsi="Times New Roman"/>
+          <w:sz w:val="24"/>
+          <w:szCs w:val="24"/>
+        </w:rPr>
+        <w:t xml:space="preserve"> results reveal meaningful structure in both environmental variables and genus</w:t>
+      </w:r>
+      <w:r>
+        <w:rPr>
+          <w:rFonts w:ascii="Times New Roman" w:hAnsi="Times New Roman"/>
+          <w:sz w:val="24"/>
+          <w:szCs w:val="24"/>
         </w:rPr>
         <w:noBreakHyphen/>
-        <w:t>learning analysis. Early results show meaningful structure in both environmental variables and genus</w:t>
-      </w:r>
-      <w:r>
-        <w:rPr>
-          <w:rFonts w:ascii="Times New Roman" w:hAnsi="Times New Roman"/>
+        <w:t>level community composition. NMDS and UMAP embeddings consistently separate Texas and Oklahoma sites, suggesting underlying environmental gradients that influence fish assemblages. A decision tree classifier achieved an AUC of 0.79, and environmental UMAP clusters predicted genus</w:t>
+      </w:r>
+      <w:r>
+        <w:rPr>
+          <w:rFonts w:ascii="Times New Roman" w:hAnsi="Times New Roman"/>
+          <w:sz w:val="24"/>
+          <w:szCs w:val="24"/>
         </w:rPr>
         <w:noBreakHyphen/>
-        <w:t>level community composition. A decision tree classifier achieved an AUC of 0.7</w:t>
-      </w:r>
-      <w:r>
-        <w:rPr>
-          <w:rFonts w:ascii="Times New Roman" w:hAnsi="Times New Roman"/>
-        </w:rPr>
-        <w:t>9</w:t>
-      </w:r>
-      <w:r>
-        <w:rPr>
-          <w:rFonts w:ascii="Times New Roman" w:hAnsi="Times New Roman"/>
-        </w:rPr>
-        <w:t>, and UMAP revealed two well</w:t>
-      </w:r>
-      <w:r>
-        <w:rPr>
-          <w:rFonts w:ascii="Times New Roman" w:hAnsi="Times New Roman"/>
+        <w:t>level clusters with an accuracy of 0.83. These findings indicate that environmental gradients contain a real ecological signal relevant to fish community structure. As the project expands to include seasonal decomposition metrics (SDL), long</w:t>
+      </w:r>
+      <w:r>
+        <w:rPr>
+          <w:rFonts w:ascii="Times New Roman" w:hAnsi="Times New Roman"/>
+          <w:sz w:val="24"/>
+          <w:szCs w:val="24"/>
         </w:rPr>
         <w:noBreakHyphen/>
-        <w:t>separated clusters in both environmental and genus data</w:t>
-      </w:r>
-      <w:r>
-        <w:rPr>
-          <w:rFonts w:ascii="Times New Roman" w:hAnsi="Times New Roman"/>
-        </w:rPr>
-        <w:t>,</w:t>
-      </w:r>
-      <w:r>
-        <w:rPr>
-          <w:rFonts w:ascii="Times New Roman" w:hAnsi="Times New Roman"/>
-        </w:rPr>
-        <w:t xml:space="preserve"> with an overall prediction accuracy of 0.8</w:t>
-      </w:r>
-      <w:r>
-        <w:rPr>
-          <w:rFonts w:ascii="Times New Roman" w:hAnsi="Times New Roman"/>
-        </w:rPr>
-        <w:t xml:space="preserve">3 </w:t>
-      </w:r>
-      <w:r>
-        <w:rPr>
-          <w:rFonts w:ascii="Times New Roman" w:hAnsi="Times New Roman"/>
-        </w:rPr>
-        <w:t xml:space="preserve">when using environmental clusters to predict genus clusters. These findings indicate that environmental gradients contain </w:t>
-      </w:r>
-      <w:r>
-        <w:rPr>
-          <w:rFonts w:ascii="Times New Roman" w:hAnsi="Times New Roman"/>
-        </w:rPr>
-        <w:t xml:space="preserve">a </w:t>
-      </w:r>
-      <w:r>
-        <w:rPr>
-          <w:rFonts w:ascii="Times New Roman" w:hAnsi="Times New Roman"/>
-        </w:rPr>
-        <w:t>real signal relevant to fish community structure, supporting further analysis and development of predictive ecological models.</w:t>
-      </w:r>
-      <w:r>
-        <w:rPr>
-          <w:rFonts w:ascii="Times New Roman" w:hAnsi="Times New Roman"/>
-        </w:rPr>
-        <w:t xml:space="preserve"> However, we must be mindful of the overlap between real significance and overfitting when combining ecology, machine learning, and limited data points.</w:t>
+        <w:t>term hydrological trends may further clarify how flow variability, seasonal amplitude, and residual variance shape fish populations across the region.</w:t>
       </w:r>
     </w:p>
     <w:p>
       <w:pPr>
-        <w:pStyle w:val="StyleJustified"/>
-        <w:spacing w:after="120"/>
-        <w:jc w:val="left"/>
-        <w:rPr>
-          <w:rFonts w:ascii="Times New Roman" w:hAnsi="Times New Roman"/>
-        </w:rPr>
-      </w:pPr>
-    </w:p>
-    <w:p>
-      <w:pPr>
         <w:pStyle w:val="Heading1"/>
         <w:rPr>
           <w:rFonts w:ascii="Times New Roman" w:hAnsi="Times New Roman" w:cs="Times New Roman"/>
         </w:rPr>
       </w:pPr>
+      <w:bookmarkStart w:id="1" w:name="_Toc240627977"/>
       <w:r>
         <w:rPr>
           <w:rFonts w:ascii="Times New Roman" w:hAnsi="Times New Roman" w:cs="Times New Roman"/>
         </w:rPr>
         <w:t>Literature Review</w:t>
-      </w:r>
-    </w:p>
-    <w:p>
-      <w:pPr>
-        <w:pStyle w:val="StyleJustified"/>
-        <w:spacing w:after="120"/>
-        <w:jc w:val="left"/>
-        <w:rPr>
-          <w:rFonts w:ascii="Times New Roman" w:hAnsi="Times New Roman"/>
-          <w:szCs w:val="22"/>
-        </w:rPr>
-      </w:pPr>
-    </w:p>
-    <w:p>
-      <w:pPr>
-        <w:pStyle w:val="Heading1"/>
-        <w:rPr>
-          <w:rFonts w:ascii="Times New Roman" w:hAnsi="Times New Roman" w:cs="Times New Roman"/>
-        </w:rPr>
-      </w:pPr>
-      <w:bookmarkStart w:id="1" w:name="_Toc239409851"/>
-      <w:r>
-        <w:rPr>
-          <w:rFonts w:ascii="Times New Roman" w:hAnsi="Times New Roman" w:cs="Times New Roman"/>
-        </w:rPr>
-        <w:t>Introduction</w:t>
       </w:r>
       <w:bookmarkEnd w:id="1"/>
     </w:p>
     <w:p>
       <w:pPr>
-        <w:pStyle w:val="StyleJustified"/>
-        <w:spacing w:after="120"/>
-        <w:jc w:val="left"/>
-        <w:rPr>
-          <w:rFonts w:ascii="Times New Roman" w:hAnsi="Times New Roman"/>
-        </w:rPr>
-      </w:pPr>
-      <w:r>
-        <w:rPr>
-          <w:rFonts w:ascii="Times New Roman" w:hAnsi="Times New Roman"/>
-        </w:rPr>
-        <w:t>Freshwater fish communities respond strongly to environmental gradients such as flow regime, watershed size, substrate composition, and channel morphology, and understanding these relationships is important for identifying ecological change and supporting conservation. This project investigates the relationship between environmental attributes and genus</w:t>
-      </w:r>
-      <w:r>
-        <w:rPr>
-          <w:rFonts w:ascii="Times New Roman" w:hAnsi="Times New Roman"/>
-        </w:rPr>
-        <w:noBreakHyphen/>
-        <w:t>level fish composition across sites in Northeast Texas and Southeast Oklahoma. The central research question is: Can environmental variables reliably predict fish community structure, and what environmental gradients best explain differences in genus diversity and composition?  This question matters because identifying environmental drivers of fish communities can help explain population decline, habitat sensitivity, and long</w:t>
-      </w:r>
-      <w:r>
-        <w:rPr>
-          <w:rFonts w:ascii="Times New Roman" w:hAnsi="Times New Roman"/>
-        </w:rPr>
-        <w:noBreakHyphen/>
-        <w:t>term ecological trends.</w:t>
-      </w:r>
-    </w:p>
-    <w:p>
-      <w:pPr>
-        <w:pStyle w:val="StyleJustified"/>
-        <w:rPr>
-          <w:rFonts w:ascii="Times New Roman" w:hAnsi="Times New Roman"/>
-        </w:rPr>
-      </w:pPr>
-    </w:p>
-    <w:p>
-      <w:pPr>
-        <w:pStyle w:val="Heading1"/>
-        <w:rPr>
-          <w:rFonts w:ascii="Times New Roman" w:hAnsi="Times New Roman" w:cs="Times New Roman"/>
-        </w:rPr>
-      </w:pPr>
-      <w:bookmarkStart w:id="2" w:name="_Toc239409852"/>
-      <w:r>
-        <w:rPr>
-          <w:rFonts w:ascii="Times New Roman" w:hAnsi="Times New Roman" w:cs="Times New Roman"/>
-        </w:rPr>
-        <w:t>Background</w:t>
+        <w:pStyle w:val="Heading2"/>
+        <w:rPr>
+          <w:rFonts w:ascii="Times New Roman" w:hAnsi="Times New Roman"/>
+        </w:rPr>
+      </w:pPr>
+      <w:bookmarkStart w:id="2" w:name="_Toc240627978"/>
+      <w:r>
+        <w:rPr>
+          <w:rFonts w:ascii="Times New Roman" w:hAnsi="Times New Roman"/>
+        </w:rPr>
+        <w:t>Environmental Drivers of Freshwater Fish Communities</w:t>
       </w:r>
       <w:bookmarkEnd w:id="2"/>
     </w:p>
     <w:p>
       <w:pPr>
-        <w:pStyle w:val="StyleJustified"/>
-        <w:rPr>
-          <w:rFonts w:ascii="Times New Roman" w:hAnsi="Times New Roman"/>
-        </w:rPr>
-      </w:pPr>
-      <w:r>
-        <w:rPr>
-          <w:rFonts w:ascii="Times New Roman" w:hAnsi="Times New Roman"/>
-        </w:rPr>
-        <w:t xml:space="preserve">Fish environments are </w:t>
-      </w:r>
-      <w:r>
-        <w:rPr>
-          <w:rFonts w:ascii="Times New Roman" w:hAnsi="Times New Roman"/>
-          <w:szCs w:val="22"/>
-        </w:rPr>
-        <w:t>shaped by substrate composition, watershed size/ attributes, seasonal flow patterns, and hydrological stability. Prior studies emphasize the importance of flow variability and drainage area in determining species richness and diversity. This project builds on these ideas by incorporating both field</w:t>
-      </w:r>
-      <w:r>
-        <w:rPr>
-          <w:rFonts w:ascii="Times New Roman" w:hAnsi="Times New Roman"/>
-          <w:szCs w:val="22"/>
+        <w:spacing w:afterLines="120" w:after="288"/>
+        <w:rPr>
+          <w:rFonts w:ascii="Times New Roman" w:hAnsi="Times New Roman"/>
+          <w:sz w:val="24"/>
+          <w:szCs w:val="24"/>
+        </w:rPr>
+      </w:pPr>
+      <w:r>
+        <w:rPr>
+          <w:rFonts w:ascii="Times New Roman" w:hAnsi="Times New Roman"/>
+          <w:sz w:val="24"/>
+          <w:szCs w:val="24"/>
+        </w:rPr>
+        <w:t xml:space="preserve">Freshwater fish communities respond strongly to environmental gradients such as flow regime, watershed size, substrate composition, and channel morphology. Regional studies across the Red River basin show that landscape disturbance and hydrologic variability act as primary environmental filters, influencing </w:t>
+      </w:r>
+      <w:r>
+        <w:rPr>
+          <w:rFonts w:ascii="Times New Roman" w:hAnsi="Times New Roman"/>
+          <w:sz w:val="24"/>
+          <w:szCs w:val="24"/>
+        </w:rPr>
+        <w:t>species’</w:t>
+      </w:r>
+      <w:r>
+        <w:rPr>
+          <w:rFonts w:ascii="Times New Roman" w:hAnsi="Times New Roman"/>
+          <w:sz w:val="24"/>
+          <w:szCs w:val="24"/>
+        </w:rPr>
+        <w:t xml:space="preserve"> richness and community turnover. Generalist species tolerate disturbed or variable reaches, whereas narrow</w:t>
+      </w:r>
+      <w:r>
+        <w:rPr>
+          <w:rFonts w:ascii="Times New Roman" w:hAnsi="Times New Roman"/>
+          <w:sz w:val="24"/>
+          <w:szCs w:val="24"/>
         </w:rPr>
         <w:noBreakHyphen/>
-        <w:t>collected environmental data and long</w:t>
-      </w:r>
-      <w:r>
-        <w:rPr>
-          <w:rFonts w:ascii="Times New Roman" w:hAnsi="Times New Roman"/>
-          <w:szCs w:val="22"/>
-        </w:rPr>
-        <w:noBreakHyphen/>
-        <w:t>term hydrological records. While the simple question is which attributes keep fish communities alive in specific areas, we will use machine learning methods, such as decision trees, clustering, and dimensionality reduction, to reveal nonlinear ecological patterns that traditional statistics may miss. UMAP, NMDS, and supervised classification provide complementary</w:t>
-      </w:r>
-      <w:r>
-        <w:rPr>
-          <w:rFonts w:ascii="Times New Roman" w:hAnsi="Times New Roman"/>
-        </w:rPr>
-        <w:t xml:space="preserve"> views of environmental gradients and biological structure. Seasonal decomposition methods may further reveal long</w:t>
-      </w:r>
-      <w:r>
-        <w:rPr>
-          <w:rFonts w:ascii="Times New Roman" w:hAnsi="Times New Roman"/>
-        </w:rPr>
-        <w:noBreakHyphen/>
-        <w:t>term hydrological trends relevant to fish populations.</w:t>
+        <w:t>ranged taxa depend on stable flow regimes and low disturbance.</w:t>
       </w:r>
     </w:p>
     <w:p>
       <w:pPr>
-        <w:rPr>
-          <w:rFonts w:ascii="Times New Roman" w:hAnsi="Times New Roman"/>
-        </w:rPr>
-      </w:pPr>
-    </w:p>
-    <w:p>
-      <w:pPr>
-        <w:pStyle w:val="Heading1"/>
-        <w:rPr>
-          <w:rFonts w:ascii="Times New Roman" w:hAnsi="Times New Roman" w:cs="Times New Roman"/>
-        </w:rPr>
-      </w:pPr>
-      <w:bookmarkStart w:id="3" w:name="_Toc239409853"/>
-      <w:r>
-        <w:rPr>
-          <w:rFonts w:ascii="Times New Roman" w:hAnsi="Times New Roman" w:cs="Times New Roman"/>
-        </w:rPr>
-        <w:t>Methodology</w:t>
+        <w:pStyle w:val="Heading2"/>
+        <w:rPr>
+          <w:rFonts w:ascii="Times New Roman" w:hAnsi="Times New Roman"/>
+        </w:rPr>
+      </w:pPr>
+      <w:bookmarkStart w:id="3" w:name="_Toc240627979"/>
+      <w:r>
+        <w:rPr>
+          <w:rFonts w:ascii="Times New Roman" w:hAnsi="Times New Roman"/>
+        </w:rPr>
+        <w:t>S</w:t>
+      </w:r>
+      <w:r>
+        <w:rPr>
+          <w:rFonts w:ascii="Times New Roman" w:hAnsi="Times New Roman"/>
+        </w:rPr>
+        <w:t>easonal Hydrological Variability and Ecological Response</w:t>
       </w:r>
       <w:bookmarkEnd w:id="3"/>
     </w:p>
     <w:p>
       <w:pPr>
-        <w:pStyle w:val="StyleJustified"/>
-        <w:rPr>
-          <w:rFonts w:ascii="Times New Roman" w:hAnsi="Times New Roman"/>
-        </w:rPr>
-      </w:pPr>
-      <w:r>
-        <w:rPr>
-          <w:rFonts w:ascii="Times New Roman" w:hAnsi="Times New Roman"/>
-        </w:rPr>
-        <w:t xml:space="preserve">The methodology includes gathering all data and appropriately splitting the data attributes based on the script/notebook goal and the algorithm being used. </w:t>
-      </w:r>
-      <w:r>
-        <w:rPr>
-          <w:rFonts w:ascii="Times New Roman" w:hAnsi="Times New Roman"/>
-        </w:rPr>
-        <w:t>Fixing all scripts currently in the repo.</w:t>
+        <w:spacing w:afterLines="120" w:after="288"/>
+        <w:rPr>
+          <w:rFonts w:ascii="Times New Roman" w:hAnsi="Times New Roman"/>
+          <w:sz w:val="24"/>
+          <w:szCs w:val="24"/>
+        </w:rPr>
+      </w:pPr>
+      <w:r>
+        <w:rPr>
+          <w:rFonts w:ascii="Times New Roman" w:hAnsi="Times New Roman"/>
+          <w:sz w:val="24"/>
+          <w:szCs w:val="24"/>
+        </w:rPr>
+        <w:t>Seasonal flow patterns, drought cycles, and hydrological stability are critical determinants of fish persistence. Seasonal amplitude — the magnitude of seasonal oscillation in flow or temperature — can influence habitat suitability, spawning conditions, and refuge availability. High seasonal variability often corresponds with increased ecological stress, while stable seasonal patterns support equilibrium species sensitive to drying events. Incorporating seasonal amplitude and residual variance into ecological models may reveal long</w:t>
+      </w:r>
+      <w:r>
+        <w:rPr>
+          <w:rFonts w:ascii="Times New Roman" w:hAnsi="Times New Roman"/>
+          <w:sz w:val="24"/>
+          <w:szCs w:val="24"/>
+        </w:rPr>
+        <w:noBreakHyphen/>
+        <w:t>term hydrological pressures that shape fish communities.</w:t>
       </w:r>
     </w:p>
     <w:p>
       <w:pPr>
-        <w:pStyle w:val="StyleJustified"/>
-        <w:rPr>
-          <w:rFonts w:ascii="Times New Roman" w:hAnsi="Times New Roman"/>
-        </w:rPr>
-      </w:pPr>
-    </w:p>
-    <w:p>
-      <w:pPr>
-        <w:pStyle w:val="StyleJustified"/>
-        <w:rPr>
-          <w:rFonts w:ascii="Times New Roman" w:hAnsi="Times New Roman"/>
-        </w:rPr>
-      </w:pPr>
-      <w:r>
-        <w:rPr>
-          <w:rFonts w:ascii="Times New Roman" w:hAnsi="Times New Roman"/>
-        </w:rPr>
-        <w:t>NMDS get a significant score from this using SDL or normal time metrics for environmental data.</w:t>
-      </w:r>
-    </w:p>
-    <w:p>
-      <w:pPr>
-        <w:pStyle w:val="StyleJustified"/>
-        <w:rPr>
-          <w:rFonts w:ascii="Times New Roman" w:hAnsi="Times New Roman"/>
-        </w:rPr>
-      </w:pPr>
-      <w:r>
-        <w:rPr>
-          <w:rFonts w:ascii="Times New Roman" w:hAnsi="Times New Roman"/>
-        </w:rPr>
-        <w:t>Implement past scripts with SDL time metrics in case the seasonal amplitude has significant results with genus populations (UMAP, PCA, t-SNE).</w:t>
-      </w:r>
-    </w:p>
-    <w:p>
-      <w:pPr>
-        <w:pStyle w:val="StyleJustified"/>
-        <w:rPr>
-          <w:rFonts w:ascii="Times New Roman" w:hAnsi="Times New Roman"/>
-        </w:rPr>
-      </w:pPr>
-    </w:p>
-    <w:p>
-      <w:pPr>
-        <w:pStyle w:val="StyleJustified"/>
-        <w:rPr>
-          <w:rFonts w:ascii="Times New Roman" w:hAnsi="Times New Roman"/>
-        </w:rPr>
-      </w:pPr>
-      <w:r>
-        <w:rPr>
-          <w:rFonts w:ascii="Times New Roman" w:hAnsi="Times New Roman"/>
-        </w:rPr>
-        <w:t>Clustering between TX and OK using results from previous scripts’ attributes with significant values (such as the ones from NMDS)</w:t>
-      </w:r>
-    </w:p>
-    <w:p>
-      <w:pPr>
-        <w:pStyle w:val="StyleJustified"/>
-        <w:rPr>
-          <w:rFonts w:ascii="Times New Roman" w:hAnsi="Times New Roman"/>
-        </w:rPr>
-      </w:pPr>
-    </w:p>
-    <w:p>
-      <w:pPr>
-        <w:pStyle w:val="Heading1"/>
-        <w:rPr>
-          <w:rFonts w:ascii="Times New Roman" w:hAnsi="Times New Roman" w:cs="Times New Roman"/>
-        </w:rPr>
-      </w:pPr>
-      <w:bookmarkStart w:id="4" w:name="_Toc239409854"/>
-      <w:r>
-        <w:rPr>
-          <w:rFonts w:ascii="Times New Roman" w:hAnsi="Times New Roman" w:cs="Times New Roman"/>
-        </w:rPr>
-        <w:t>Results</w:t>
+        <w:pStyle w:val="Heading2"/>
+        <w:rPr>
+          <w:rFonts w:ascii="Times New Roman" w:hAnsi="Times New Roman"/>
+        </w:rPr>
+      </w:pPr>
+      <w:bookmarkStart w:id="4" w:name="_Toc240627980"/>
+      <w:r>
+        <w:rPr>
+          <w:rFonts w:ascii="Times New Roman" w:hAnsi="Times New Roman"/>
+        </w:rPr>
+        <w:t>Machine Learning and Dimensionality Reduction in Hydro</w:t>
+      </w:r>
+      <w:r>
+        <w:rPr>
+          <w:rFonts w:ascii="Times New Roman" w:hAnsi="Times New Roman"/>
+        </w:rPr>
+        <w:noBreakHyphen/>
+        <w:t>Ecology</w:t>
       </w:r>
       <w:bookmarkEnd w:id="4"/>
     </w:p>
     <w:p>
       <w:pPr>
-        <w:rPr>
-          <w:rFonts w:ascii="Times New Roman" w:hAnsi="Times New Roman"/>
-        </w:rPr>
-      </w:pPr>
+        <w:spacing w:afterLines="120" w:after="288"/>
+        <w:rPr>
+          <w:rFonts w:ascii="Times New Roman" w:hAnsi="Times New Roman"/>
+          <w:sz w:val="24"/>
+          <w:szCs w:val="24"/>
+        </w:rPr>
+      </w:pPr>
+      <w:r>
+        <w:rPr>
+          <w:rFonts w:ascii="Times New Roman" w:hAnsi="Times New Roman"/>
+          <w:sz w:val="24"/>
+          <w:szCs w:val="24"/>
+        </w:rPr>
+        <w:t xml:space="preserve">Machine learning methods such as Random Forest, </w:t>
+      </w:r>
+      <w:proofErr w:type="spellStart"/>
+      <w:r>
+        <w:rPr>
+          <w:rFonts w:ascii="Times New Roman" w:hAnsi="Times New Roman"/>
+          <w:sz w:val="24"/>
+          <w:szCs w:val="24"/>
+        </w:rPr>
+        <w:t>XGBoost</w:t>
+      </w:r>
+      <w:proofErr w:type="spellEnd"/>
+      <w:r>
+        <w:rPr>
+          <w:rFonts w:ascii="Times New Roman" w:hAnsi="Times New Roman"/>
+          <w:sz w:val="24"/>
+          <w:szCs w:val="24"/>
+        </w:rPr>
+        <w:t>, and ensemble models frequently outperform traditional linear models when predicting species richness or abundance. Dimensionality reduction techniques — NMDS, PCA, UMAP, and t</w:t>
+      </w:r>
+      <w:r>
+        <w:rPr>
+          <w:rFonts w:ascii="Times New Roman" w:hAnsi="Times New Roman"/>
+          <w:sz w:val="24"/>
+          <w:szCs w:val="24"/>
+        </w:rPr>
+        <w:noBreakHyphen/>
+        <w:t>SNE — help uncover nonlinear ecological gradients and visualize complex environmental relationships. These tools are increasingly used to identify habitat clusters, ecological niches, and environmental boundaries that influence species presence.</w:t>
+      </w:r>
     </w:p>
     <w:p>
       <w:pPr>
-        <w:pStyle w:val="Heading1"/>
-        <w:rPr>
-          <w:rFonts w:ascii="Times New Roman" w:hAnsi="Times New Roman" w:cs="Times New Roman"/>
-        </w:rPr>
-      </w:pPr>
-      <w:bookmarkStart w:id="5" w:name="_Toc239409855"/>
-      <w:r>
-        <w:rPr>
-          <w:rFonts w:ascii="Times New Roman" w:hAnsi="Times New Roman" w:cs="Times New Roman"/>
-        </w:rPr>
-        <w:lastRenderedPageBreak/>
-        <w:t>Discussion</w:t>
+        <w:pStyle w:val="Heading2"/>
+        <w:rPr>
+          <w:rFonts w:ascii="Times New Roman" w:hAnsi="Times New Roman"/>
+        </w:rPr>
+      </w:pPr>
+      <w:bookmarkStart w:id="5" w:name="_Toc240566075"/>
+      <w:bookmarkStart w:id="6" w:name="_Toc240627981"/>
+      <w:r>
+        <w:rPr>
+          <w:rFonts w:ascii="Times New Roman" w:hAnsi="Times New Roman"/>
+        </w:rPr>
+        <w:t>Our Addition and Computational Integration</w:t>
       </w:r>
       <w:bookmarkEnd w:id="5"/>
-      <w:r>
-        <w:rPr>
-          <w:rFonts w:ascii="Times New Roman" w:hAnsi="Times New Roman" w:cs="Times New Roman"/>
-        </w:rPr>
-        <w:t xml:space="preserve"> of Future Applications and Methodological Scalability</w:t>
-      </w:r>
-    </w:p>
-    <w:p>
-      <w:pPr>
-        <w:rPr>
-          <w:rFonts w:ascii="Times New Roman" w:hAnsi="Times New Roman"/>
-        </w:rPr>
-      </w:pPr>
-    </w:p>
-    <w:p>
-      <w:pPr>
-        <w:pStyle w:val="Heading1"/>
-        <w:rPr>
-          <w:rFonts w:ascii="Times New Roman" w:hAnsi="Times New Roman" w:cs="Times New Roman"/>
-        </w:rPr>
-      </w:pPr>
-      <w:bookmarkStart w:id="6" w:name="_Toc239409856"/>
-      <w:r>
-        <w:rPr>
-          <w:rFonts w:ascii="Times New Roman" w:hAnsi="Times New Roman" w:cs="Times New Roman"/>
-        </w:rPr>
-        <w:t>Conclusions</w:t>
-      </w:r>
       <w:bookmarkEnd w:id="6"/>
     </w:p>
     <w:p>
       <w:pPr>
-        <w:rPr>
-          <w:rFonts w:ascii="Times New Roman" w:hAnsi="Times New Roman"/>
-        </w:rPr>
-      </w:pPr>
+        <w:spacing w:afterLines="120" w:after="288"/>
+        <w:rPr>
+          <w:rFonts w:ascii="Times New Roman" w:hAnsi="Times New Roman"/>
+          <w:sz w:val="24"/>
+          <w:szCs w:val="24"/>
+        </w:rPr>
+      </w:pPr>
+      <w:r>
+        <w:rPr>
+          <w:rFonts w:ascii="Times New Roman" w:hAnsi="Times New Roman"/>
+          <w:sz w:val="24"/>
+          <w:szCs w:val="24"/>
+        </w:rPr>
+        <w:t>This project integrates field</w:t>
+      </w:r>
+      <w:r>
+        <w:rPr>
+          <w:rFonts w:ascii="Times New Roman" w:hAnsi="Times New Roman"/>
+          <w:sz w:val="24"/>
+          <w:szCs w:val="24"/>
+        </w:rPr>
+        <w:noBreakHyphen/>
+        <w:t>collected environmental data, genus</w:t>
+      </w:r>
+      <w:r>
+        <w:rPr>
+          <w:rFonts w:ascii="Times New Roman" w:hAnsi="Times New Roman"/>
+          <w:sz w:val="24"/>
+          <w:szCs w:val="24"/>
+        </w:rPr>
+        <w:noBreakHyphen/>
+        <w:t>level fish counts, and long</w:t>
+      </w:r>
+      <w:r>
+        <w:rPr>
+          <w:rFonts w:ascii="Times New Roman" w:hAnsi="Times New Roman"/>
+          <w:sz w:val="24"/>
+          <w:szCs w:val="24"/>
+        </w:rPr>
+        <w:noBreakHyphen/>
+        <w:t>term hydrological metrics (SDL) into a unified Python</w:t>
+      </w:r>
+      <w:r>
+        <w:rPr>
+          <w:rFonts w:ascii="Times New Roman" w:hAnsi="Times New Roman"/>
+          <w:sz w:val="24"/>
+          <w:szCs w:val="24"/>
+        </w:rPr>
+        <w:noBreakHyphen/>
+        <w:t xml:space="preserve">based analysis pipeline. By combining NMDS, PCA, UMAP, </w:t>
+      </w:r>
+      <w:proofErr w:type="spellStart"/>
+      <w:r>
+        <w:rPr>
+          <w:rFonts w:ascii="Times New Roman" w:hAnsi="Times New Roman"/>
+          <w:sz w:val="24"/>
+          <w:szCs w:val="24"/>
+        </w:rPr>
+        <w:t>KMeans</w:t>
+      </w:r>
+      <w:proofErr w:type="spellEnd"/>
+      <w:r>
+        <w:rPr>
+          <w:rFonts w:ascii="Times New Roman" w:hAnsi="Times New Roman"/>
+          <w:sz w:val="24"/>
+          <w:szCs w:val="24"/>
+        </w:rPr>
+        <w:t xml:space="preserve"> clustering, and supervised learning, we aim to identify environmental gradients that predict fish community structure. A key addition is the incorporation of seasonal amplitude and residual variance metrics, which may reveal hydrological drivers not captured by static environmental attributes. This computational framework supports both exploratory ecological analysis and predictive modeling.</w:t>
+      </w:r>
     </w:p>
     <w:p>
       <w:pPr>
-        <w:rPr>
-          <w:rFonts w:ascii="Times New Roman" w:hAnsi="Times New Roman"/>
-        </w:rPr>
-      </w:pPr>
+        <w:pStyle w:val="Heading1"/>
+        <w:rPr>
+          <w:rFonts w:ascii="Times New Roman" w:hAnsi="Times New Roman" w:cs="Times New Roman"/>
+        </w:rPr>
+      </w:pPr>
+      <w:bookmarkStart w:id="7" w:name="_Toc240627982"/>
+      <w:r>
+        <w:rPr>
+          <w:rFonts w:ascii="Times New Roman" w:hAnsi="Times New Roman" w:cs="Times New Roman"/>
+        </w:rPr>
+        <w:lastRenderedPageBreak/>
+        <w:t>Introduction</w:t>
+      </w:r>
+      <w:bookmarkEnd w:id="7"/>
     </w:p>
     <w:p>
       <w:pPr>
+        <w:pStyle w:val="StyleJustified"/>
+        <w:spacing w:afterLines="120" w:after="288"/>
+        <w:jc w:val="left"/>
+        <w:rPr>
+          <w:rFonts w:ascii="Times New Roman" w:hAnsi="Times New Roman"/>
+          <w:sz w:val="24"/>
+          <w:szCs w:val="24"/>
+        </w:rPr>
+      </w:pPr>
+      <w:r>
+        <w:rPr>
+          <w:rFonts w:ascii="Times New Roman" w:hAnsi="Times New Roman"/>
+          <w:sz w:val="24"/>
+          <w:szCs w:val="24"/>
+        </w:rPr>
+        <w:t>Freshwater fish communities respond strongly to environmental gradients such as flow regime, watershed size, substrate composition, and channel morphology</w:t>
+      </w:r>
+      <w:r>
+        <w:rPr>
+          <w:rFonts w:ascii="Times New Roman" w:hAnsi="Times New Roman"/>
+          <w:sz w:val="24"/>
+          <w:szCs w:val="24"/>
+        </w:rPr>
+        <w:t>. U</w:t>
+      </w:r>
+      <w:r>
+        <w:rPr>
+          <w:rFonts w:ascii="Times New Roman" w:hAnsi="Times New Roman"/>
+          <w:sz w:val="24"/>
+          <w:szCs w:val="24"/>
+        </w:rPr>
+        <w:t>nderstanding these relationships is important for identifying ecological change and supporting conservation. This project investigates the relationship between environmental attributes and genus</w:t>
+      </w:r>
+      <w:r>
+        <w:rPr>
+          <w:rFonts w:ascii="Times New Roman" w:hAnsi="Times New Roman"/>
+          <w:sz w:val="24"/>
+          <w:szCs w:val="24"/>
+        </w:rPr>
+        <w:noBreakHyphen/>
+        <w:t>level fish composition across</w:t>
+      </w:r>
+      <w:r>
+        <w:rPr>
+          <w:rFonts w:ascii="Times New Roman" w:hAnsi="Times New Roman"/>
+          <w:sz w:val="24"/>
+          <w:szCs w:val="24"/>
+        </w:rPr>
+        <w:t xml:space="preserve"> 46</w:t>
+      </w:r>
+      <w:r>
+        <w:rPr>
+          <w:rFonts w:ascii="Times New Roman" w:hAnsi="Times New Roman"/>
+          <w:sz w:val="24"/>
+          <w:szCs w:val="24"/>
+        </w:rPr>
+        <w:t xml:space="preserve"> sites in Northeast Texas and Southeast Oklahoma. The central research question is: Can environmental variables reliably predict fish community structure, and what environmental gradients best explain differences in genus diversity and composition?  </w:t>
+      </w:r>
+    </w:p>
+    <w:p>
+      <w:pPr>
+        <w:pStyle w:val="StyleJustified"/>
+        <w:spacing w:afterLines="120" w:after="288"/>
+        <w:jc w:val="left"/>
+        <w:rPr>
+          <w:rFonts w:ascii="Times New Roman" w:hAnsi="Times New Roman"/>
+          <w:sz w:val="24"/>
+          <w:szCs w:val="24"/>
+        </w:rPr>
+      </w:pPr>
+      <w:r>
+        <w:rPr>
+          <w:rFonts w:ascii="Times New Roman" w:hAnsi="Times New Roman"/>
+          <w:sz w:val="24"/>
+          <w:szCs w:val="24"/>
+        </w:rPr>
+        <w:t>This question matters because identifying environmental drivers of fish communities can help explain population decline, habitat sensitivity, and long</w:t>
+      </w:r>
+      <w:r>
+        <w:rPr>
+          <w:rFonts w:ascii="Times New Roman" w:hAnsi="Times New Roman"/>
+          <w:sz w:val="24"/>
+          <w:szCs w:val="24"/>
+        </w:rPr>
+        <w:noBreakHyphen/>
+        <w:t>term ecological trends.</w:t>
+      </w:r>
+      <w:r>
+        <w:rPr>
+          <w:rFonts w:ascii="Times New Roman" w:hAnsi="Times New Roman"/>
+          <w:sz w:val="24"/>
+          <w:szCs w:val="24"/>
+        </w:rPr>
+        <w:t xml:space="preserve"> </w:t>
+      </w:r>
+      <w:r>
+        <w:rPr>
+          <w:rFonts w:ascii="Times New Roman" w:hAnsi="Times New Roman"/>
+          <w:sz w:val="24"/>
+          <w:szCs w:val="24"/>
+        </w:rPr>
+        <w:t>By integrating field</w:t>
+      </w:r>
+      <w:r>
+        <w:rPr>
+          <w:rFonts w:ascii="Times New Roman" w:hAnsi="Times New Roman"/>
+          <w:sz w:val="24"/>
+          <w:szCs w:val="24"/>
+        </w:rPr>
+        <w:noBreakHyphen/>
+        <w:t>collected environmental data with long</w:t>
+      </w:r>
+      <w:r>
+        <w:rPr>
+          <w:rFonts w:ascii="Times New Roman" w:hAnsi="Times New Roman"/>
+          <w:sz w:val="24"/>
+          <w:szCs w:val="24"/>
+        </w:rPr>
+        <w:noBreakHyphen/>
+        <w:t>term hydrological metrics (SDL), we aim to determine whether seasonal amplitude, flow variability, and residual variance contribute significantly to fish community patterns. Dimensionality reduction and machine learning provide a modern framework for uncovering nonlinear ecological relationships that traditional statistics may miss.</w:t>
+      </w:r>
+    </w:p>
+    <w:p>
+      <w:pPr>
         <w:pStyle w:val="Heading1"/>
         <w:rPr>
           <w:rFonts w:ascii="Times New Roman" w:hAnsi="Times New Roman" w:cs="Times New Roman"/>
         </w:rPr>
       </w:pPr>
+      <w:bookmarkStart w:id="8" w:name="_Toc240627983"/>
       <w:r>
         <w:rPr>
           <w:rFonts w:ascii="Times New Roman" w:hAnsi="Times New Roman" w:cs="Times New Roman"/>
         </w:rPr>
+        <w:t>Background</w:t>
+      </w:r>
+      <w:bookmarkEnd w:id="8"/>
+    </w:p>
+    <w:p>
+      <w:pPr>
+        <w:pStyle w:val="StyleJustified"/>
+        <w:spacing w:afterLines="120" w:after="288"/>
+        <w:rPr>
+          <w:rFonts w:ascii="Times New Roman" w:hAnsi="Times New Roman"/>
+          <w:sz w:val="24"/>
+          <w:szCs w:val="24"/>
+        </w:rPr>
+      </w:pPr>
+      <w:r>
+        <w:rPr>
+          <w:rFonts w:ascii="Times New Roman" w:hAnsi="Times New Roman"/>
+          <w:sz w:val="24"/>
+          <w:szCs w:val="24"/>
+        </w:rPr>
+        <w:t xml:space="preserve">Fish environments are shaped by substrate composition, watershed size/ attributes, seasonal flow patterns, and hydrological stability. Prior studies emphasize the importance of flow variability and drainage area in determining species richness and diversity. </w:t>
+      </w:r>
+      <w:r>
+        <w:rPr>
+          <w:rFonts w:ascii="Times New Roman" w:hAnsi="Times New Roman"/>
+          <w:sz w:val="24"/>
+          <w:szCs w:val="24"/>
+        </w:rPr>
+        <w:t xml:space="preserve">Seasonal hydrological patterns, such as amplitude and residual variance, could further influence habitat suitability by affecting ecological factors of sites, such as riffle persistence, pool depth, and refuge availability for possible future efforts. </w:t>
+      </w:r>
+    </w:p>
+    <w:p>
+      <w:pPr>
+        <w:pStyle w:val="StyleJustified"/>
+        <w:spacing w:afterLines="120" w:after="288"/>
+        <w:rPr>
+          <w:rFonts w:ascii="Times New Roman" w:hAnsi="Times New Roman"/>
+          <w:sz w:val="24"/>
+          <w:szCs w:val="24"/>
+        </w:rPr>
+      </w:pPr>
+      <w:r>
+        <w:rPr>
+          <w:rFonts w:ascii="Times New Roman" w:hAnsi="Times New Roman"/>
+          <w:sz w:val="24"/>
+          <w:szCs w:val="24"/>
+        </w:rPr>
+        <w:t>This project builds on these ideas by incorporating both field</w:t>
+      </w:r>
+      <w:r>
+        <w:rPr>
+          <w:rFonts w:ascii="Times New Roman" w:hAnsi="Times New Roman"/>
+          <w:sz w:val="24"/>
+          <w:szCs w:val="24"/>
+        </w:rPr>
+        <w:noBreakHyphen/>
+        <w:t>collected environmental data and long</w:t>
+      </w:r>
+      <w:r>
+        <w:rPr>
+          <w:rFonts w:ascii="Times New Roman" w:hAnsi="Times New Roman"/>
+          <w:sz w:val="24"/>
+          <w:szCs w:val="24"/>
+        </w:rPr>
+        <w:noBreakHyphen/>
+        <w:t xml:space="preserve">term hydrological records. </w:t>
+      </w:r>
+      <w:r>
+        <w:rPr>
+          <w:rFonts w:ascii="Times New Roman" w:hAnsi="Times New Roman"/>
+          <w:sz w:val="24"/>
+          <w:szCs w:val="24"/>
+        </w:rPr>
+        <w:t>Seasonal decomposition metrics (SDL) provide a unique opportunity to quantify long-term flow patterns, including seasonal amplitude and residual variability. These metrics may reveal hidden environmental gradients that influence fish communities across Texas and Oklahoma sites.</w:t>
+      </w:r>
+    </w:p>
+    <w:p>
+      <w:pPr>
+        <w:pStyle w:val="StyleJustified"/>
+        <w:spacing w:afterLines="120" w:after="288"/>
+        <w:rPr>
+          <w:rFonts w:ascii="Times New Roman" w:hAnsi="Times New Roman"/>
+          <w:sz w:val="24"/>
+          <w:szCs w:val="24"/>
+        </w:rPr>
+      </w:pPr>
+      <w:r>
+        <w:rPr>
+          <w:rFonts w:ascii="Times New Roman" w:hAnsi="Times New Roman"/>
+          <w:sz w:val="24"/>
+          <w:szCs w:val="24"/>
+        </w:rPr>
+        <w:t xml:space="preserve">While the simple question is which attributes keep fish communities alive in specific areas, we will use machine learning methods, such as decision trees, clustering, and dimensionality reduction, to reveal nonlinear ecological patterns that traditional statistics may miss. </w:t>
+      </w:r>
+      <w:r>
+        <w:rPr>
+          <w:rFonts w:ascii="Times New Roman" w:hAnsi="Times New Roman"/>
+          <w:sz w:val="24"/>
+          <w:szCs w:val="24"/>
+        </w:rPr>
+        <w:t xml:space="preserve">Machine learning methods such as PCA, </w:t>
+      </w:r>
+      <w:r>
+        <w:rPr>
+          <w:rFonts w:ascii="Times New Roman" w:hAnsi="Times New Roman"/>
+          <w:sz w:val="24"/>
+          <w:szCs w:val="24"/>
+        </w:rPr>
+        <w:t>UMAP, NMDS, and supervised classification provide complementary views of environmental gradients and biological structure. Seasonal decomposition methods may further reveal long</w:t>
+      </w:r>
+      <w:r>
+        <w:rPr>
+          <w:rFonts w:ascii="Times New Roman" w:hAnsi="Times New Roman"/>
+          <w:sz w:val="24"/>
+          <w:szCs w:val="24"/>
+        </w:rPr>
+        <w:noBreakHyphen/>
+        <w:t>term hydrological trends relevant to fish populations.</w:t>
+      </w:r>
+    </w:p>
+    <w:p>
+      <w:pPr>
+        <w:pStyle w:val="Heading1"/>
+        <w:rPr>
+          <w:rFonts w:ascii="Times New Roman" w:hAnsi="Times New Roman" w:cs="Times New Roman"/>
+        </w:rPr>
+      </w:pPr>
+      <w:bookmarkStart w:id="9" w:name="_Toc240627984"/>
+      <w:r>
+        <w:rPr>
+          <w:rFonts w:ascii="Times New Roman" w:hAnsi="Times New Roman" w:cs="Times New Roman"/>
+        </w:rPr>
+        <w:t>Methodology</w:t>
+      </w:r>
+      <w:bookmarkEnd w:id="9"/>
+    </w:p>
+    <w:p>
+      <w:pPr>
+        <w:pStyle w:val="StyleJustified"/>
+        <w:spacing w:afterLines="120" w:after="288"/>
+        <w:rPr>
+          <w:rFonts w:ascii="Times New Roman" w:hAnsi="Times New Roman"/>
+          <w:sz w:val="24"/>
+          <w:szCs w:val="24"/>
+        </w:rPr>
+      </w:pPr>
+      <w:r>
+        <w:rPr>
+          <w:rFonts w:ascii="Times New Roman" w:hAnsi="Times New Roman"/>
+          <w:sz w:val="24"/>
+          <w:szCs w:val="24"/>
+        </w:rPr>
+        <w:t xml:space="preserve">The methodology includes gathering all data and appropriately splitting the data attributes based on the script/notebook goal and the algorithm being used. </w:t>
+      </w:r>
+      <w:r>
+        <w:rPr>
+          <w:rFonts w:ascii="Times New Roman" w:hAnsi="Times New Roman"/>
+          <w:sz w:val="24"/>
+          <w:szCs w:val="24"/>
+        </w:rPr>
+        <w:t>Fixing all scripts currently in the repo.</w:t>
+      </w:r>
+    </w:p>
+    <w:p>
+      <w:pPr>
+        <w:pStyle w:val="StyleJustified"/>
+        <w:spacing w:afterLines="120" w:after="288"/>
+        <w:rPr>
+          <w:rFonts w:ascii="Times New Roman" w:hAnsi="Times New Roman"/>
+          <w:sz w:val="24"/>
+          <w:szCs w:val="24"/>
+        </w:rPr>
+      </w:pPr>
+      <w:r>
+        <w:rPr>
+          <w:rFonts w:ascii="Times New Roman" w:hAnsi="Times New Roman"/>
+          <w:sz w:val="24"/>
+          <w:szCs w:val="24"/>
+        </w:rPr>
+        <w:t>NMDS get a significant score from this using SDL or normal time metrics for environmental data.</w:t>
+      </w:r>
+    </w:p>
+    <w:p>
+      <w:pPr>
+        <w:pStyle w:val="StyleJustified"/>
+        <w:spacing w:afterLines="120" w:after="288"/>
+        <w:rPr>
+          <w:rFonts w:ascii="Times New Roman" w:hAnsi="Times New Roman"/>
+          <w:sz w:val="24"/>
+          <w:szCs w:val="24"/>
+        </w:rPr>
+      </w:pPr>
+      <w:r>
+        <w:rPr>
+          <w:rFonts w:ascii="Times New Roman" w:hAnsi="Times New Roman"/>
+          <w:sz w:val="24"/>
+          <w:szCs w:val="24"/>
+        </w:rPr>
+        <w:t>Implement past scripts with SDL time metrics in case the seasonal amplitude has significant results with genus populations (UMAP, PCA, t-SNE).</w:t>
+      </w:r>
+    </w:p>
+    <w:p>
+      <w:pPr>
+        <w:pStyle w:val="StyleJustified"/>
+        <w:spacing w:afterLines="120" w:after="288"/>
+        <w:rPr>
+          <w:rFonts w:ascii="Times New Roman" w:hAnsi="Times New Roman"/>
+          <w:sz w:val="24"/>
+          <w:szCs w:val="24"/>
+        </w:rPr>
+      </w:pPr>
+      <w:r>
+        <w:rPr>
+          <w:rFonts w:ascii="Times New Roman" w:hAnsi="Times New Roman"/>
+          <w:sz w:val="24"/>
+          <w:szCs w:val="24"/>
+        </w:rPr>
+        <w:t>Clustering between TX and OK using results from previous scripts’ attributes with significant values (such as the ones from NMDS)</w:t>
+      </w:r>
+      <w:r>
+        <w:rPr>
+          <w:rFonts w:ascii="Times New Roman" w:hAnsi="Times New Roman"/>
+          <w:sz w:val="24"/>
+          <w:szCs w:val="24"/>
+        </w:rPr>
+        <w:t>. WILL GO OVER SCRIPTS I’VE DONE, NOT COMPLETED.</w:t>
+      </w:r>
+    </w:p>
+    <w:p>
+      <w:pPr>
+        <w:pStyle w:val="StyleJustified"/>
+        <w:rPr>
+          <w:rFonts w:ascii="Times New Roman" w:hAnsi="Times New Roman"/>
+          <w:sz w:val="24"/>
+          <w:szCs w:val="24"/>
+        </w:rPr>
+      </w:pPr>
+    </w:p>
+    <w:p>
+      <w:pPr>
+        <w:pStyle w:val="Heading1"/>
+        <w:rPr>
+          <w:rFonts w:ascii="Times New Roman" w:hAnsi="Times New Roman" w:cs="Times New Roman"/>
+        </w:rPr>
+      </w:pPr>
+      <w:bookmarkStart w:id="10" w:name="_Toc240627985"/>
+      <w:r>
+        <w:rPr>
+          <w:rFonts w:ascii="Times New Roman" w:hAnsi="Times New Roman" w:cs="Times New Roman"/>
+        </w:rPr>
+        <w:t>Results</w:t>
+      </w:r>
+      <w:bookmarkEnd w:id="10"/>
+    </w:p>
+    <w:p>
+      <w:pPr>
+        <w:pStyle w:val="StyleJustified"/>
+        <w:spacing w:afterLines="120" w:after="288"/>
+        <w:rPr>
+          <w:rFonts w:ascii="Times New Roman" w:hAnsi="Times New Roman"/>
+          <w:sz w:val="24"/>
+          <w:szCs w:val="24"/>
+        </w:rPr>
+      </w:pPr>
+      <w:r>
+        <w:rPr>
+          <w:rFonts w:ascii="Times New Roman" w:hAnsi="Times New Roman"/>
+          <w:sz w:val="24"/>
+          <w:szCs w:val="24"/>
+        </w:rPr>
+        <w:t xml:space="preserve">Go into depth with the scripts I’ve run and </w:t>
+      </w:r>
+      <w:r>
+        <w:rPr>
+          <w:rFonts w:ascii="Times New Roman" w:hAnsi="Times New Roman"/>
+          <w:sz w:val="24"/>
+          <w:szCs w:val="24"/>
+        </w:rPr>
+        <w:t>created:</w:t>
+      </w:r>
+      <w:r>
+        <w:rPr>
+          <w:rFonts w:ascii="Times New Roman" w:hAnsi="Times New Roman"/>
+          <w:sz w:val="24"/>
+          <w:szCs w:val="24"/>
+        </w:rPr>
+        <w:t xml:space="preserve"> classification/regression and visualizations along with various score values.  </w:t>
+      </w:r>
+      <w:r>
+        <w:rPr>
+          <w:rFonts w:ascii="Times New Roman" w:hAnsi="Times New Roman"/>
+          <w:sz w:val="24"/>
+          <w:szCs w:val="24"/>
+        </w:rPr>
+        <w:t>WILL GO OVER SCRIPTS I’VE DONE, NOT COMPLETED.</w:t>
+      </w:r>
+    </w:p>
+    <w:p>
+      <w:pPr>
+        <w:pStyle w:val="Heading1"/>
+        <w:rPr>
+          <w:rFonts w:ascii="Times New Roman" w:hAnsi="Times New Roman" w:cs="Times New Roman"/>
+        </w:rPr>
+      </w:pPr>
+      <w:bookmarkStart w:id="11" w:name="_Toc240627986"/>
+      <w:r>
+        <w:rPr>
+          <w:rFonts w:ascii="Times New Roman" w:hAnsi="Times New Roman" w:cs="Times New Roman"/>
+        </w:rPr>
+        <w:t>Discussion</w:t>
+      </w:r>
+      <w:r>
+        <w:rPr>
+          <w:rFonts w:ascii="Times New Roman" w:hAnsi="Times New Roman" w:cs="Times New Roman"/>
+        </w:rPr>
+        <w:t xml:space="preserve"> of Future Applications and Methodological Scalability</w:t>
+      </w:r>
+      <w:bookmarkEnd w:id="11"/>
+    </w:p>
+    <w:p>
+      <w:pPr>
+        <w:pStyle w:val="Heading2"/>
+        <w:rPr>
+          <w:rFonts w:ascii="Times New Roman" w:hAnsi="Times New Roman"/>
+        </w:rPr>
+      </w:pPr>
+      <w:bookmarkStart w:id="12" w:name="_Toc240627987"/>
+      <w:r>
+        <w:rPr>
+          <w:rFonts w:ascii="Times New Roman" w:hAnsi="Times New Roman"/>
+        </w:rPr>
+        <w:t>SDL Integration and Seasonal Amplitude Analysis</w:t>
+      </w:r>
+      <w:bookmarkEnd w:id="12"/>
+    </w:p>
+    <w:p>
+      <w:pPr>
+        <w:spacing w:afterLines="120" w:after="288"/>
+        <w:rPr>
+          <w:rFonts w:ascii="Times New Roman" w:hAnsi="Times New Roman"/>
+          <w:sz w:val="24"/>
+          <w:szCs w:val="24"/>
+        </w:rPr>
+      </w:pPr>
+      <w:r>
+        <w:rPr>
+          <w:rFonts w:ascii="Times New Roman" w:hAnsi="Times New Roman"/>
+          <w:sz w:val="24"/>
+          <w:szCs w:val="24"/>
+        </w:rPr>
+        <w:t>As the project continues, one of the main goals is to refine how seasonal decomposition metrics fit into the broader ecological and machine-learning workflow. A first step is reorganizing the SDL outputs into a cleaner, site-level format that mirrors the structure of the existing environmental time-series metrics. Once the seasonal amplitude and residual variability values are aligned with the rest of the dataset, they can be incorporated into the dimensionality-reduction scripts already developed. This will allow us to test whether seasonal amplitude behaves like a meaningful environmental gradient or simply adds noise to the already extremely noisy dataset system.</w:t>
+      </w:r>
+    </w:p>
+    <w:p>
+      <w:pPr>
+        <w:pStyle w:val="Heading2"/>
+        <w:rPr>
+          <w:rFonts w:ascii="Times New Roman" w:hAnsi="Times New Roman"/>
+        </w:rPr>
+      </w:pPr>
+      <w:bookmarkStart w:id="13" w:name="_Toc240627988"/>
+      <w:r>
+        <w:rPr>
+          <w:rFonts w:ascii="Times New Roman" w:hAnsi="Times New Roman"/>
+        </w:rPr>
+        <w:t>Dimensionality Reduction with Seasonal Metrics</w:t>
+      </w:r>
+      <w:bookmarkEnd w:id="13"/>
+    </w:p>
+    <w:p>
+      <w:pPr>
+        <w:spacing w:afterLines="120" w:after="288"/>
+        <w:rPr>
+          <w:rFonts w:ascii="Times New Roman" w:hAnsi="Times New Roman"/>
+          <w:sz w:val="24"/>
+          <w:szCs w:val="24"/>
+        </w:rPr>
+      </w:pPr>
+      <w:r>
+        <w:rPr>
+          <w:rFonts w:ascii="Times New Roman" w:hAnsi="Times New Roman"/>
+          <w:sz w:val="24"/>
+          <w:szCs w:val="24"/>
+        </w:rPr>
+        <w:t>Alongside this, we can pull seasonal amplitude data points from the more significant time metric variables into PCA, UMAP, and clustering workflows to see whether these long-term hydrological patterns influence site separation or genus-level differences. Rather than using all seasonal metrics at once, one idea is to run PCA specifically on the amplitude values and identify the handful of seasonal components that explain the most variance. Those top seasonal amplitude drivers can then be compared against genus richness, total population, and state-level differences to see whether any clear ecological relationships emerge; or if the opposite occurs and the noise is even noisier.</w:t>
+      </w:r>
+    </w:p>
+    <w:p>
+      <w:pPr>
+        <w:pStyle w:val="Heading2"/>
+        <w:rPr>
+          <w:rFonts w:ascii="Times New Roman" w:hAnsi="Times New Roman"/>
+        </w:rPr>
+      </w:pPr>
+      <w:bookmarkStart w:id="14" w:name="_Toc240627989"/>
+      <w:r>
+        <w:rPr>
+          <w:rFonts w:ascii="Times New Roman" w:hAnsi="Times New Roman"/>
+        </w:rPr>
+        <w:t xml:space="preserve">UMAP + </w:t>
+      </w:r>
+      <w:proofErr w:type="spellStart"/>
+      <w:r>
+        <w:rPr>
+          <w:rFonts w:ascii="Times New Roman" w:hAnsi="Times New Roman"/>
+        </w:rPr>
+        <w:t>KMeans</w:t>
+      </w:r>
+      <w:proofErr w:type="spellEnd"/>
+      <w:r>
+        <w:rPr>
+          <w:rFonts w:ascii="Times New Roman" w:hAnsi="Times New Roman"/>
+        </w:rPr>
+        <w:t xml:space="preserve"> Seasonal Clustering</w:t>
+      </w:r>
+      <w:bookmarkEnd w:id="14"/>
+    </w:p>
+    <w:p>
+      <w:pPr>
+        <w:spacing w:afterLines="120" w:after="288"/>
+        <w:rPr>
+          <w:rFonts w:ascii="Times New Roman" w:hAnsi="Times New Roman"/>
+          <w:sz w:val="24"/>
+          <w:szCs w:val="24"/>
+        </w:rPr>
+      </w:pPr>
+      <w:r>
+        <w:rPr>
+          <w:rFonts w:ascii="Times New Roman" w:hAnsi="Times New Roman"/>
+          <w:sz w:val="24"/>
+          <w:szCs w:val="24"/>
+        </w:rPr>
+        <w:t xml:space="preserve">Going more in-depth into UMAP and different configurations/ dimensions of the data will also be used to visualize how changes in input, as well as seasonal amplitude, interact with biological structure. By embedding sites using the seasonal amplitude alongside genus richness and environmental attributes, for example, can help us test whether seasonal patterns create distinct clusters or reinforce the environmental gradients already observed. </w:t>
+      </w:r>
+      <w:proofErr w:type="spellStart"/>
+      <w:r>
+        <w:rPr>
+          <w:rFonts w:ascii="Times New Roman" w:hAnsi="Times New Roman"/>
+          <w:sz w:val="24"/>
+          <w:szCs w:val="24"/>
+        </w:rPr>
+        <w:t>Kmeans</w:t>
+      </w:r>
+      <w:proofErr w:type="spellEnd"/>
+      <w:r>
+        <w:rPr>
+          <w:rFonts w:ascii="Times New Roman" w:hAnsi="Times New Roman"/>
+          <w:sz w:val="24"/>
+          <w:szCs w:val="24"/>
+        </w:rPr>
+        <w:t xml:space="preserve"> clustering on these UMAP embeddings may reveal whether seasonal amplitude contributes to meaningful ecological grouping or simply overlaps with existing environmental structure.</w:t>
+      </w:r>
+    </w:p>
+    <w:p>
+      <w:pPr>
+        <w:pStyle w:val="Heading2"/>
+        <w:rPr>
+          <w:rFonts w:ascii="Times New Roman" w:hAnsi="Times New Roman"/>
+        </w:rPr>
+      </w:pPr>
+      <w:bookmarkStart w:id="15" w:name="_Toc240627990"/>
+      <w:r>
+        <w:rPr>
+          <w:rFonts w:ascii="Times New Roman" w:hAnsi="Times New Roman"/>
+        </w:rPr>
+        <w:t>Refinement of NMDS Arrows and Environmental Drivers</w:t>
+      </w:r>
+      <w:bookmarkEnd w:id="15"/>
+    </w:p>
+    <w:p>
+      <w:pPr>
+        <w:spacing w:afterLines="120" w:after="288"/>
+        <w:rPr>
+          <w:rFonts w:ascii="Times New Roman" w:hAnsi="Times New Roman"/>
+          <w:sz w:val="24"/>
+          <w:szCs w:val="24"/>
+        </w:rPr>
+      </w:pPr>
+      <w:r>
+        <w:rPr>
+          <w:rFonts w:ascii="Times New Roman" w:hAnsi="Times New Roman"/>
+          <w:sz w:val="24"/>
+          <w:szCs w:val="24"/>
+        </w:rPr>
+        <w:t xml:space="preserve">Another direction involves revisiting the NMDS workflow and refining the correlation arrows to highlight on the strongest environmental and seasonal drivers. This includes trimming down the number of arrows and checking whether seasonal amplitude appears as a significant correlation vector under different data inputs. If these vectors constantly align with NMDS axes, it may indicate that long-term hydrological patterns play a larger role in shaping fish communities than previously assumed. </w:t>
+      </w:r>
+    </w:p>
+    <w:p>
+      <w:pPr>
+        <w:pStyle w:val="Heading2"/>
+        <w:rPr>
+          <w:rFonts w:ascii="Times New Roman" w:hAnsi="Times New Roman"/>
+        </w:rPr>
+      </w:pPr>
+      <w:bookmarkStart w:id="16" w:name="_Toc240627991"/>
+      <w:r>
+        <w:rPr>
+          <w:rFonts w:ascii="Times New Roman" w:hAnsi="Times New Roman"/>
+        </w:rPr>
+        <w:t>Regression and Predictive Modeling</w:t>
+      </w:r>
+      <w:bookmarkEnd w:id="16"/>
+    </w:p>
+    <w:p>
+      <w:pPr>
+        <w:spacing w:afterLines="120" w:after="288"/>
+        <w:rPr>
+          <w:rFonts w:ascii="Times New Roman" w:hAnsi="Times New Roman"/>
+          <w:sz w:val="24"/>
+          <w:szCs w:val="24"/>
+        </w:rPr>
+      </w:pPr>
+      <w:r>
+        <w:rPr>
+          <w:rFonts w:ascii="Times New Roman" w:hAnsi="Times New Roman"/>
+          <w:sz w:val="24"/>
+          <w:szCs w:val="24"/>
+        </w:rPr>
+        <w:t>Regression models can test whether seasonal amplitude or specific outlier or overlapping sites can predict genus richness</w:t>
+      </w:r>
+      <w:r>
+        <w:rPr>
+          <w:rFonts w:ascii="Times New Roman" w:hAnsi="Times New Roman"/>
+          <w:sz w:val="24"/>
+          <w:szCs w:val="24"/>
+        </w:rPr>
+        <w:t xml:space="preserve">, overall fish abundance, or other intricate patterns that we may have yet to recognize given some tuning or variations in regression model tuning and input. Various machine learning models as well as SHAP value or SHAP-style figures can help determine whether there is any predictive accuracy or </w:t>
+      </w:r>
+      <w:r>
+        <w:rPr>
+          <w:rFonts w:ascii="Times New Roman" w:hAnsi="Times New Roman"/>
+          <w:sz w:val="24"/>
+          <w:szCs w:val="24"/>
+        </w:rPr>
+        <w:lastRenderedPageBreak/>
+        <w:t>ecological interpretability with the hypothesis. These models will clarify whether seasonal hydrological patterns are simply background noise or whether they represent a real ecological signal worth integrating into future versions of the pipeline.</w:t>
+      </w:r>
+    </w:p>
+    <w:p>
+      <w:pPr>
+        <w:pStyle w:val="Heading1"/>
+        <w:rPr>
+          <w:rFonts w:ascii="Times New Roman" w:hAnsi="Times New Roman" w:cs="Times New Roman"/>
+        </w:rPr>
+      </w:pPr>
+      <w:bookmarkStart w:id="17" w:name="_Toc240627992"/>
+      <w:r>
+        <w:rPr>
+          <w:rFonts w:ascii="Times New Roman" w:hAnsi="Times New Roman" w:cs="Times New Roman"/>
+        </w:rPr>
+        <w:t>Conclusions</w:t>
+      </w:r>
+      <w:bookmarkEnd w:id="17"/>
+    </w:p>
+    <w:p>
+      <w:pPr>
+        <w:rPr>
+          <w:rFonts w:ascii="Times New Roman" w:hAnsi="Times New Roman"/>
+          <w:sz w:val="24"/>
+          <w:szCs w:val="24"/>
+        </w:rPr>
+      </w:pPr>
+      <w:r>
+        <w:rPr>
+          <w:rFonts w:ascii="Times New Roman" w:hAnsi="Times New Roman"/>
+          <w:sz w:val="24"/>
+          <w:szCs w:val="24"/>
+        </w:rPr>
+        <w:t xml:space="preserve">Well, conclusion here kind of. Will get to it, put accomplishments and </w:t>
+      </w:r>
+      <w:r>
+        <w:rPr>
+          <w:rFonts w:ascii="Times New Roman" w:hAnsi="Times New Roman"/>
+          <w:sz w:val="24"/>
+          <w:szCs w:val="24"/>
+        </w:rPr>
+        <w:t>overall thesis plans moving forward, outside of machine learning, but potential applications in the real world talking with Seth and Dr. Fudge.</w:t>
+      </w:r>
+    </w:p>
+    <w:p>
+      <w:pPr>
+        <w:rPr>
+          <w:rFonts w:ascii="Times New Roman" w:hAnsi="Times New Roman"/>
+          <w:sz w:val="24"/>
+          <w:szCs w:val="24"/>
+        </w:rPr>
+      </w:pPr>
+    </w:p>
+    <w:p>
+      <w:pPr>
+        <w:pStyle w:val="Heading1"/>
+        <w:rPr>
+          <w:rFonts w:ascii="Times New Roman" w:hAnsi="Times New Roman" w:cs="Times New Roman"/>
+        </w:rPr>
+      </w:pPr>
+      <w:bookmarkStart w:id="18" w:name="_Toc240627993"/>
+      <w:r>
+        <w:rPr>
+          <w:rFonts w:ascii="Times New Roman" w:hAnsi="Times New Roman" w:cs="Times New Roman"/>
+        </w:rPr>
         <w:t>Works Cited</w:t>
       </w:r>
+      <w:bookmarkEnd w:id="18"/>
+    </w:p>
+    <w:p>
+      <w:pPr>
+        <w:spacing w:after="240"/>
+        <w:ind w:left="1080" w:hanging="720"/>
+        <w:rPr>
+          <w:rFonts w:ascii="Times New Roman" w:hAnsi="Times New Roman"/>
+          <w:sz w:val="24"/>
+          <w:szCs w:val="24"/>
+        </w:rPr>
+      </w:pPr>
+      <w:r>
+        <w:rPr>
+          <w:rFonts w:ascii="Times New Roman" w:hAnsi="Times New Roman"/>
+          <w:sz w:val="24"/>
+          <w:szCs w:val="24"/>
+        </w:rPr>
+        <w:t xml:space="preserve">[1] Comte, L., Olden, J. D., Tedesco, P. A., Ruhi, A., &amp; Giam, X. (2021). Climate and land-use changes interact to drive long-term reorganization of riverine fish communities globally. </w:t>
+      </w:r>
+      <w:r>
+        <w:rPr>
+          <w:rFonts w:ascii="Times New Roman" w:hAnsi="Times New Roman"/>
+          <w:i/>
+          <w:iCs/>
+          <w:sz w:val="24"/>
+          <w:szCs w:val="24"/>
+        </w:rPr>
+        <w:t>Proceedings of the National Academy of Sciences (PNAS)</w:t>
+      </w:r>
+      <w:r>
+        <w:rPr>
+          <w:rFonts w:ascii="Times New Roman" w:hAnsi="Times New Roman"/>
+          <w:sz w:val="24"/>
+          <w:szCs w:val="24"/>
+        </w:rPr>
+        <w:t>, 118(26), e2011639118</w:t>
+      </w:r>
+    </w:p>
+    <w:p>
+      <w:pPr>
+        <w:spacing w:after="240"/>
+        <w:ind w:left="1080" w:hanging="720"/>
+        <w:rPr>
+          <w:rFonts w:ascii="Times New Roman" w:hAnsi="Times New Roman"/>
+          <w:sz w:val="24"/>
+          <w:szCs w:val="24"/>
+        </w:rPr>
+      </w:pPr>
+      <w:r>
+        <w:rPr>
+          <w:rFonts w:ascii="Times New Roman" w:hAnsi="Times New Roman"/>
+          <w:sz w:val="24"/>
+          <w:szCs w:val="24"/>
+        </w:rPr>
+        <w:t xml:space="preserve">[2] Mollenhauer, R., Mouser, J. B., Roland, V. L., &amp; Brewer, S. K. (2022). Increased landscape disturbance and streamflow variability threaten fish biodiversity in the Red River catchment, USA. </w:t>
+      </w:r>
+      <w:r>
+        <w:rPr>
+          <w:rFonts w:ascii="Times New Roman" w:hAnsi="Times New Roman"/>
+          <w:i/>
+          <w:iCs/>
+          <w:sz w:val="24"/>
+          <w:szCs w:val="24"/>
+        </w:rPr>
+        <w:t>Diversity and Distributions</w:t>
+      </w:r>
+      <w:r>
+        <w:rPr>
+          <w:rFonts w:ascii="Times New Roman" w:hAnsi="Times New Roman"/>
+          <w:sz w:val="24"/>
+          <w:szCs w:val="24"/>
+        </w:rPr>
+        <w:t>, 28(9), 1934–1950</w:t>
+      </w:r>
+    </w:p>
+    <w:p>
+      <w:pPr>
+        <w:spacing w:after="240"/>
+        <w:ind w:left="1080" w:hanging="720"/>
+        <w:rPr>
+          <w:rFonts w:ascii="Times New Roman" w:hAnsi="Times New Roman"/>
+          <w:sz w:val="24"/>
+          <w:szCs w:val="24"/>
+        </w:rPr>
+      </w:pPr>
+      <w:r>
+        <w:rPr>
+          <w:rFonts w:ascii="Times New Roman" w:hAnsi="Times New Roman"/>
+          <w:sz w:val="24"/>
+          <w:szCs w:val="24"/>
+        </w:rPr>
+        <w:t xml:space="preserve">[3] Rendon, C., Callahan, S., &amp; Schmidt, B. (2025). Short-term Drought Impacts are Influenced by Annual Flow Patterns and Fish Life History Strategies in North Texas. </w:t>
+      </w:r>
+      <w:r>
+        <w:rPr>
+          <w:rFonts w:ascii="Times New Roman" w:hAnsi="Times New Roman"/>
+          <w:i/>
+          <w:iCs/>
+          <w:sz w:val="24"/>
+          <w:szCs w:val="24"/>
+        </w:rPr>
+        <w:t>Draft Manuscript</w:t>
+      </w:r>
+    </w:p>
+    <w:p>
+      <w:pPr>
+        <w:spacing w:after="240"/>
+        <w:ind w:left="1080" w:hanging="720"/>
+        <w:rPr>
+          <w:rFonts w:ascii="Times New Roman" w:hAnsi="Times New Roman"/>
+          <w:sz w:val="24"/>
+          <w:szCs w:val="24"/>
+        </w:rPr>
+      </w:pPr>
+      <w:r>
+        <w:rPr>
+          <w:rFonts w:ascii="Times New Roman" w:hAnsi="Times New Roman"/>
+          <w:sz w:val="24"/>
+          <w:szCs w:val="24"/>
+        </w:rPr>
+        <w:t xml:space="preserve">[4] Ngor, P. B., Uy, S., Sor, R., Chan, B., Holway, J., Null, S. E., So, N., </w:t>
+      </w:r>
+      <w:proofErr w:type="spellStart"/>
+      <w:r>
+        <w:rPr>
+          <w:rFonts w:ascii="Times New Roman" w:hAnsi="Times New Roman"/>
+          <w:sz w:val="24"/>
+          <w:szCs w:val="24"/>
+        </w:rPr>
+        <w:t>Grenouillet</w:t>
+      </w:r>
+      <w:proofErr w:type="spellEnd"/>
+      <w:r>
+        <w:rPr>
+          <w:rFonts w:ascii="Times New Roman" w:hAnsi="Times New Roman"/>
+          <w:sz w:val="24"/>
+          <w:szCs w:val="24"/>
+        </w:rPr>
+        <w:t xml:space="preserve">, G., Chandra, S., Hogan, Z. S., &amp; Lek, S. (2023). Predicting fish species richness and abundance in the Lower Mekong Basin. </w:t>
+      </w:r>
+      <w:r>
+        <w:rPr>
+          <w:rFonts w:ascii="Times New Roman" w:hAnsi="Times New Roman"/>
+          <w:i/>
+          <w:iCs/>
+          <w:sz w:val="24"/>
+          <w:szCs w:val="24"/>
+        </w:rPr>
+        <w:t>Frontiers in Ecology and Evolution</w:t>
+      </w:r>
+      <w:r>
+        <w:rPr>
+          <w:rFonts w:ascii="Times New Roman" w:hAnsi="Times New Roman"/>
+          <w:sz w:val="24"/>
+          <w:szCs w:val="24"/>
+        </w:rPr>
+        <w:t>, 11, 1131142.</w:t>
+      </w:r>
+    </w:p>
+    <w:p>
+      <w:pPr>
+        <w:rPr>
+          <w:rFonts w:ascii="Times New Roman" w:hAnsi="Times New Roman"/>
+        </w:rPr>
+      </w:pPr>
     </w:p>
     <w:sectPr>
       <w:pgSz w:w="12240" w:h="15840"/>
@@ -1825,7 +3475,34 @@
         <w:bCs/>
         <w:sz w:val="20"/>
       </w:rPr>
-      <w:t>EE 491</w:t>
+      <w:t>EE</w:t>
+    </w:r>
+    <w:r>
+      <w:rPr>
+        <w:rFonts w:ascii="Times New Roman" w:hAnsi="Times New Roman"/>
+        <w:b w:val="0"/>
+        <w:bCs/>
+        <w:sz w:val="20"/>
+      </w:rPr>
+      <w:t>-</w:t>
+    </w:r>
+    <w:r>
+      <w:rPr>
+        <w:rFonts w:ascii="Times New Roman" w:hAnsi="Times New Roman"/>
+        <w:b w:val="0"/>
+        <w:bCs/>
+        <w:sz w:val="20"/>
+      </w:rPr>
+      <w:t>491</w:t>
+    </w:r>
+    <w:r>
+      <w:rPr>
+        <w:rFonts w:ascii="Times New Roman" w:hAnsi="Times New Roman"/>
+        <w:b w:val="0"/>
+        <w:bCs/>
+        <w:sz w:val="20"/>
+      </w:rPr>
+      <w:t>-01H</w:t>
     </w:r>
     <w:r>
       <w:rPr>

</xml_diff>